<commit_message>
<Updated resume and some details>
</commit_message>
<xml_diff>
--- a/public/McKay_Gavin_Resume.docx
+++ b/public/McKay_Gavin_Resume.docx
@@ -336,7 +336,7 @@
           <w:szCs w:val="20"/>
           <w:rtl w:val="0"/>
         </w:rPr>
-        <w:t xml:space="preserve">Software Fundamentals and Lab, Discrete Math, C and Software Tools, Data Structures &amp; Algorithms, Automata &amp; Languages</w:t>
+        <w:t xml:space="preserve">Software Fundamentals and Lab, Discrete Math, Linear Algebra C and Software Tools, Data Structures &amp; Algorithms, Automata &amp; Languages</w:t>
       </w:r>
       <w:r>
         <w:rPr>
@@ -1653,7 +1653,7 @@
           <w:szCs w:val="20"/>
           <w:rtl w:val="0"/>
         </w:rPr>
-        <w:t xml:space="preserve">: Git/GitHub, Docker, Azure, Oracle DB, MATLAB, MySQL, TensorFlow, PyTorch, Tkinter, pygame, Flask, Tailwind CSS, Selenium, BeautifulSoup, Linux (Ubuntu, Arch, Kali, Debian, CentOS &amp; Fedora+Red Hat)</w:t>
+        <w:t xml:space="preserve">: Git/GitHub, Docker, Azure, Oracle DB, MATLAB, MySQL, TensorFlow, PyTorch, OpenCV, Tkinter, pygame, Flask, Tailwind CSS, Selenium, BeautifulSoup, Linux (Debian, Arch, Fedora/Red Hat, etc.)</w:t>
       </w:r>
       <w:r>
         <mc:AlternateContent>
@@ -1773,7 +1773,7 @@
           <w:szCs w:val="20"/>
           <w:rtl w:val="0"/>
         </w:rPr>
-        <w:t xml:space="preserve">: Python, Java, Javascript, Typescript, C, C#, Bash, SQL, HTML5, CSS3</w:t>
+        <w:t xml:space="preserve">: Python, Java, Javascript, Typescript, C, C#, Bash, Assembly, SQL, HTML5, CSS3</w:t>
       </w:r>
     </w:p>
     <w:p>
@@ -1909,7 +1909,7 @@
         <w:szCs w:val="20"/>
         <w:rtl w:val="0"/>
       </w:rPr>
-      <w:t xml:space="preserve"> | (704) 258-1983 | tonkagavin.github.io</w:t>
+      <w:t xml:space="preserve"> | (704) 258-1983 | gavinmckay.dev</w:t>
     </w:r>
   </w:p>
 </w:hdr>

</xml_diff>

<commit_message>
<Updated educationSection & resumes>
</commit_message>
<xml_diff>
--- a/public/McKay_Gavin_Resume.docx
+++ b/public/McKay_Gavin_Resume.docx
@@ -141,34 +141,46 @@
         <w:spacing w:line="240" w:lineRule="auto"/>
         <w:rPr>
           <w:rFonts w:ascii="Times New Roman" w:cs="Times New Roman" w:eastAsia="Times New Roman" w:hAnsi="Times New Roman"/>
+          <w:b w:val="1"/>
+          <w:bCs w:val="1"/>
+          <w:sz w:val="20"/>
+          <w:szCs w:val="20"/>
+        </w:rPr>
+      </w:pPr>
+      <w:r>
+        <w:rPr>
+          <w:rFonts w:ascii="Times New Roman" w:cs="Times New Roman" w:eastAsia="Times New Roman" w:hAnsi="Times New Roman"/>
+          <w:b w:val="1"/>
+          <w:bCs w:val="1"/>
+          <w:sz w:val="20"/>
+          <w:szCs w:val="20"/>
+          <w:rtl w:val="0"/>
+        </w:rPr>
+        <w:t xml:space="preserve">North Carolina State University </w:t>
+      </w:r>
+      <w:r>
+        <w:rPr>
+          <w:rFonts w:ascii="Times New Roman" w:cs="Times New Roman" w:eastAsia="Times New Roman" w:hAnsi="Times New Roman"/>
+          <w:sz w:val="20"/>
+          <w:szCs w:val="20"/>
+          <w:rtl w:val="0"/>
+        </w:rPr>
+        <w:tab/>
+        <w:tab/>
+        <w:tab/>
+        <w:tab/>
+      </w:r>
+      <w:r>
+        <w:rPr>
+          <w:rFonts w:ascii="Times New Roman" w:cs="Times New Roman" w:eastAsia="Times New Roman" w:hAnsi="Times New Roman"/>
           <w:i w:val="1"/>
           <w:iCs w:val="1"/>
           <w:sz w:val="20"/>
           <w:szCs w:val="20"/>
-        </w:rPr>
-      </w:pPr>
-      <w:r>
-        <w:rPr>
-          <w:rFonts w:ascii="Times New Roman" w:cs="Times New Roman" w:eastAsia="Times New Roman" w:hAnsi="Times New Roman"/>
-          <w:b w:val="1"/>
-          <w:bCs w:val="1"/>
-          <w:sz w:val="20"/>
-          <w:szCs w:val="20"/>
-          <w:rtl w:val="0"/>
-        </w:rPr>
-        <w:t xml:space="preserve">North Carolina State University </w:t>
-      </w:r>
-      <w:r>
-        <w:rPr>
-          <w:rFonts w:ascii="Times New Roman" w:cs="Times New Roman" w:eastAsia="Times New Roman" w:hAnsi="Times New Roman"/>
-          <w:sz w:val="20"/>
-          <w:szCs w:val="20"/>
-          <w:rtl w:val="0"/>
-        </w:rPr>
-        <w:tab/>
-        <w:tab/>
-        <w:tab/>
-        <w:tab/>
+          <w:rtl w:val="0"/>
+        </w:rPr>
+        <w:tab/>
+        <w:t xml:space="preserve">       Raleigh, NC</w:t>
       </w:r>
       <w:r>
         <w:rPr>
@@ -183,93 +195,65 @@
           <w:rFonts w:ascii="Times New Roman" w:cs="Times New Roman" w:eastAsia="Times New Roman" w:hAnsi="Times New Roman"/>
           <w:b w:val="1"/>
           <w:bCs w:val="1"/>
-          <w:sz w:val="20"/>
-          <w:szCs w:val="20"/>
-        </w:rPr>
-      </w:pPr>
-      <w:r>
-        <w:rPr>
-          <w:rFonts w:ascii="Times New Roman" w:cs="Times New Roman" w:eastAsia="Times New Roman" w:hAnsi="Times New Roman"/>
           <w:i w:val="1"/>
           <w:iCs w:val="1"/>
-          <w:sz w:val="20"/>
-          <w:szCs w:val="20"/>
-          <w:rtl w:val="0"/>
-        </w:rPr>
-        <w:t xml:space="preserve">Raleigh, NC</w:t>
-      </w:r>
-      <w:r>
-        <w:rPr>
-          <w:rtl w:val="0"/>
-        </w:rPr>
-      </w:r>
-    </w:p>
-    <w:p>
-      <w:pPr>
-        <w:spacing w:line="240" w:lineRule="auto"/>
+        </w:rPr>
+      </w:pPr>
+      <w:r>
         <w:rPr>
           <w:rFonts w:ascii="Times New Roman" w:cs="Times New Roman" w:eastAsia="Times New Roman" w:hAnsi="Times New Roman"/>
           <w:b w:val="1"/>
           <w:bCs w:val="1"/>
           <w:i w:val="1"/>
           <w:iCs w:val="1"/>
-        </w:rPr>
-      </w:pPr>
-      <w:r>
-        <w:rPr>
-          <w:rFonts w:ascii="Times New Roman" w:cs="Times New Roman" w:eastAsia="Times New Roman" w:hAnsi="Times New Roman"/>
-          <w:b w:val="1"/>
-          <w:bCs w:val="1"/>
+          <w:sz w:val="20"/>
+          <w:szCs w:val="20"/>
+          <w:rtl w:val="0"/>
+        </w:rPr>
+        <w:t xml:space="preserve">B.S. </w:t>
+      </w:r>
+      <w:r>
+        <w:rPr>
+          <w:rFonts w:ascii="Times New Roman" w:cs="Times New Roman" w:eastAsia="Times New Roman" w:hAnsi="Times New Roman"/>
           <w:i w:val="1"/>
           <w:iCs w:val="1"/>
           <w:sz w:val="20"/>
           <w:szCs w:val="20"/>
           <w:rtl w:val="0"/>
         </w:rPr>
-        <w:t xml:space="preserve">B.S. </w:t>
-      </w:r>
-      <w:r>
-        <w:rPr>
-          <w:rFonts w:ascii="Times New Roman" w:cs="Times New Roman" w:eastAsia="Times New Roman" w:hAnsi="Times New Roman"/>
+        <w:t xml:space="preserve">in Computer Science</w:t>
+      </w:r>
+      <w:r>
+        <w:rPr>
+          <w:rFonts w:ascii="Times New Roman" w:cs="Times New Roman" w:eastAsia="Times New Roman" w:hAnsi="Times New Roman"/>
+          <w:b w:val="1"/>
+          <w:bCs w:val="1"/>
           <w:i w:val="1"/>
           <w:iCs w:val="1"/>
           <w:sz w:val="20"/>
           <w:szCs w:val="20"/>
           <w:rtl w:val="0"/>
         </w:rPr>
-        <w:t xml:space="preserve">in Computer Science</w:t>
-      </w:r>
-      <w:r>
-        <w:rPr>
-          <w:rFonts w:ascii="Times New Roman" w:cs="Times New Roman" w:eastAsia="Times New Roman" w:hAnsi="Times New Roman"/>
-          <w:b w:val="1"/>
-          <w:bCs w:val="1"/>
+        <w:t xml:space="preserve"> </w:t>
+      </w:r>
+      <w:r>
+        <w:rPr>
+          <w:rFonts w:ascii="Times New Roman" w:cs="Times New Roman" w:eastAsia="Times New Roman" w:hAnsi="Times New Roman"/>
           <w:i w:val="1"/>
           <w:iCs w:val="1"/>
           <w:sz w:val="20"/>
           <w:szCs w:val="20"/>
           <w:rtl w:val="0"/>
         </w:rPr>
-        <w:t xml:space="preserve"> </w:t>
-      </w:r>
-      <w:r>
-        <w:rPr>
-          <w:rFonts w:ascii="Times New Roman" w:cs="Times New Roman" w:eastAsia="Times New Roman" w:hAnsi="Times New Roman"/>
+        <w:t xml:space="preserve">| Philosophy Minor</w:t>
+      </w:r>
+      <w:r>
+        <w:rPr>
+          <w:rFonts w:ascii="Times New Roman" w:cs="Times New Roman" w:eastAsia="Times New Roman" w:hAnsi="Times New Roman"/>
+          <w:b w:val="1"/>
+          <w:bCs w:val="1"/>
           <w:i w:val="1"/>
           <w:iCs w:val="1"/>
-          <w:sz w:val="20"/>
-          <w:szCs w:val="20"/>
-          <w:rtl w:val="0"/>
-        </w:rPr>
-        <w:t xml:space="preserve">| Philosophy Minor</w:t>
-      </w:r>
-      <w:r>
-        <w:rPr>
-          <w:rFonts w:ascii="Times New Roman" w:cs="Times New Roman" w:eastAsia="Times New Roman" w:hAnsi="Times New Roman"/>
-          <w:b w:val="1"/>
-          <w:bCs w:val="1"/>
-          <w:i w:val="1"/>
-          <w:iCs w:val="1"/>
           <w:rtl w:val="0"/>
         </w:rPr>
         <w:tab/>
@@ -336,7 +320,7 @@
           <w:szCs w:val="20"/>
           <w:rtl w:val="0"/>
         </w:rPr>
-        <w:t xml:space="preserve">Software Fundamentals and Lab, Discrete Math, Linear Algebra C and Software Tools, Data Structures &amp; Algorithms, Automata &amp; Languages</w:t>
+        <w:t xml:space="preserve">Software Fundamentals and Lab, Discrete Math, C and Software Tools, Data Structures &amp; Algorithms, Automata &amp; Languages, Software Engineering, Operating Systems, Intro to AI, Automated Learning and Data Analysis, Applied Web-based Client-Server Computing</w:t>
       </w:r>
       <w:r>
         <w:rPr>
@@ -675,7 +659,7 @@
           <w:szCs w:val="20"/>
           <w:rtl w:val="0"/>
         </w:rPr>
-        <w:t xml:space="preserve">, I’m developing a grid-based, switch-accessible AAC application for non-verbal children with severe motor impairments</w:t>
+        <w:t xml:space="preserve">, I’m developing a grid-based, switch-accessible AAC application for non-verbal children with severe motor impairments.</w:t>
       </w:r>
     </w:p>
     <w:p>
@@ -701,7 +685,25 @@
           <w:szCs w:val="20"/>
           <w:rtl w:val="0"/>
         </w:rPr>
-        <w:t xml:space="preserve">Implementing an eye tracker for using grid-based app and for playing semi-complex turn-based games</w:t>
+        <w:t xml:space="preserve">Implementing an eye tracker for a grid-based </w:t>
+      </w:r>
+      <w:r>
+        <w:rPr>
+          <w:rFonts w:ascii="Times New Roman" w:cs="Times New Roman" w:eastAsia="Times New Roman" w:hAnsi="Times New Roman"/>
+          <w:sz w:val="20"/>
+          <w:szCs w:val="20"/>
+          <w:rtl w:val="0"/>
+        </w:rPr>
+        <w:t xml:space="preserve">app</w:t>
+      </w:r>
+      <w:r>
+        <w:rPr>
+          <w:rFonts w:ascii="Times New Roman" w:cs="Times New Roman" w:eastAsia="Times New Roman" w:hAnsi="Times New Roman"/>
+          <w:sz w:val="20"/>
+          <w:szCs w:val="20"/>
+          <w:rtl w:val="0"/>
+        </w:rPr>
+        <w:t xml:space="preserve"> and for playing semi-complex turn-based games.</w:t>
       </w:r>
     </w:p>
     <w:p>
@@ -1292,7 +1294,7 @@
           <w:szCs w:val="20"/>
           <w:rtl w:val="0"/>
         </w:rPr>
-        <w:t xml:space="preserve">Containerizing the full-stack application using Docker to ensure consistent, isolated environments and enable streamlined CI/CD pipeline deployment.</w:t>
+        <w:t xml:space="preserve">Containerizing the full-stack application to ensure consistent, isolated environments and enable CI/CD.</w:t>
       </w:r>
     </w:p>
     <w:p>
@@ -1378,7 +1380,7 @@
           <w:szCs w:val="20"/>
           <w:rtl w:val="0"/>
         </w:rPr>
-        <w:t xml:space="preserve">Created a Python-based password database application using SQL for storage and Python for the full tech stack.</w:t>
+        <w:t xml:space="preserve">Created a Python-based password database application using MySQL and Python for the full tech stack.</w:t>
       </w:r>
     </w:p>
     <w:p>
@@ -1495,6 +1497,7 @@
         <w:tab/>
         <w:tab/>
         <w:tab/>
+        <w:tab/>
       </w:r>
       <w:r>
         <w:rPr>
@@ -1568,7 +1571,7 @@
           <w:szCs w:val="20"/>
           <w:rtl w:val="0"/>
         </w:rPr>
-        <w:t xml:space="preserve">Implemented core game mechanics including different levels, a point system, and an object-oriented death system.</w:t>
+        <w:t xml:space="preserve">Implemented core game mechanics including levels/increasing difficulty, a point system, and an object-oriented death system.</w:t>
       </w:r>
     </w:p>
     <w:p>
@@ -1653,7 +1656,7 @@
           <w:szCs w:val="20"/>
           <w:rtl w:val="0"/>
         </w:rPr>
-        <w:t xml:space="preserve">: Git/GitHub, Docker, Azure, Oracle DB, MATLAB, MySQL, TensorFlow, PyTorch, OpenCV, Tkinter, pygame, Flask, Tailwind CSS, Selenium, BeautifulSoup, Linux (Debian, Arch, Fedora/Red Hat, etc.)</w:t>
+        <w:t xml:space="preserve">: Git/GitHub, Docker, Ollama, Azure, Oracle DB, Kubernetes, MATLAB, MySQL, TensorFlow, PyTorch, OpenCV, Tkinter, pygame, Flask, Tailwind CSS, Selenium, BeautifulSoup, Linux (Debian, Arch, Fedora/Red Hat)</w:t>
       </w:r>
       <w:r>
         <mc:AlternateContent>
@@ -1773,7 +1776,7 @@
           <w:szCs w:val="20"/>
           <w:rtl w:val="0"/>
         </w:rPr>
-        <w:t xml:space="preserve">: Python, Java, Javascript, Typescript, C, C#, Bash, Assembly, SQL, HTML5, CSS3</w:t>
+        <w:t xml:space="preserve">: Python, Java, Javascript, Typescript, HTML5, CSS3,  C, C#, C++, Bash, Assembly, SQL</w:t>
       </w:r>
     </w:p>
     <w:p>
@@ -1806,6 +1809,38 @@
           <w:rtl w:val="0"/>
         </w:rPr>
         <w:t xml:space="preserve">: React Native, Node.js ,Yarn, Django, FastAPI, .NET</w:t>
+      </w:r>
+    </w:p>
+    <w:p>
+      <w:pPr>
+        <w:widowControl w:val="0"/>
+        <w:spacing w:before="42.3260498046875" w:line="242.2939682006836" w:lineRule="auto"/>
+        <w:ind w:right="137.95166015625"/>
+        <w:rPr>
+          <w:rFonts w:ascii="Times New Roman" w:cs="Times New Roman" w:eastAsia="Times New Roman" w:hAnsi="Times New Roman"/>
+          <w:sz w:val="20"/>
+          <w:szCs w:val="20"/>
+        </w:rPr>
+      </w:pPr>
+      <w:r>
+        <w:rPr>
+          <w:rFonts w:ascii="Times New Roman" w:cs="Times New Roman" w:eastAsia="Times New Roman" w:hAnsi="Times New Roman"/>
+          <w:b w:val="1"/>
+          <w:bCs w:val="1"/>
+          <w:sz w:val="20"/>
+          <w:szCs w:val="20"/>
+          <w:rtl w:val="0"/>
+        </w:rPr>
+        <w:t xml:space="preserve">Technical Skills</w:t>
+      </w:r>
+      <w:r>
+        <w:rPr>
+          <w:rFonts w:ascii="Times New Roman" w:cs="Times New Roman" w:eastAsia="Times New Roman" w:hAnsi="Times New Roman"/>
+          <w:sz w:val="20"/>
+          <w:szCs w:val="20"/>
+          <w:rtl w:val="0"/>
+        </w:rPr>
+        <w:t xml:space="preserve">: Software Development Lifecycle, OOP, Machine Learning Algorithms, Data Modeling/Visualization, Software Architecture, Testing &amp; QA, Database Design, DevOps, Problem-Solving, Communication,, CI/CD, Server Operations, Linux System Administration, Command Line Operations</w:t>
       </w:r>
       <w:r>
         <w:rPr>
@@ -1881,7 +1916,7 @@
         <w:szCs w:val="40"/>
         <w:rtl w:val="0"/>
       </w:rPr>
-      <w:t xml:space="preserve">Gavin McKay</w:t>
+      <w:t xml:space="preserve">Gavin McKay – Software Engineer (AI/ML Focus)</w:t>
     </w:r>
   </w:p>
   <w:p>

</xml_diff>

<commit_message>
<Updated resume and refactored project descriptions. Also added new skills section.>
</commit_message>
<xml_diff>
--- a/public/McKay_Gavin_Resume.docx
+++ b/public/McKay_Gavin_Resume.docx
@@ -4,7 +4,7 @@
   <w:body>
     <w:p>
       <w:pPr>
-        <w:spacing w:line="240" w:lineRule="auto"/>
+        <w:spacing w:after="0" w:before="0" w:line="227.99999999999997" w:lineRule="auto"/>
         <w:rPr>
           <w:rFonts w:ascii="Times New Roman" w:cs="Times New Roman" w:eastAsia="Times New Roman" w:hAnsi="Times New Roman"/>
           <w:b w:val="1"/>
@@ -25,15 +25,12 @@
         <w:t xml:space="preserve">EDUCATION</w:t>
         <w:tab/>
         <w:tab/>
-        <w:tab/>
-        <w:tab/>
-        <w:tab/>
         <w:t xml:space="preserve">                                                               </w:t>
       </w:r>
     </w:p>
     <w:p>
       <w:pPr>
-        <w:spacing w:line="240" w:lineRule="auto"/>
+        <w:spacing w:after="0" w:before="0" w:line="227.99999999999997" w:lineRule="auto"/>
         <w:rPr>
           <w:rFonts w:ascii="Times New Roman" w:cs="Times New Roman" w:eastAsia="Times New Roman" w:hAnsi="Times New Roman"/>
           <w:b w:val="1"/>
@@ -54,12 +51,12 @@
               <wp:anchor allowOverlap="1" behindDoc="0" distB="0" distT="0" distL="114300" distR="114300" hidden="0" layoutInCell="1" locked="0" relativeHeight="0" simplePos="0">
                 <wp:simplePos x="0" y="0"/>
                 <wp:positionH relativeFrom="column">
-                  <wp:posOffset>-447674</wp:posOffset>
+                  <wp:posOffset>1</wp:posOffset>
                 </wp:positionH>
                 <wp:positionV relativeFrom="paragraph">
                   <wp:posOffset>9525</wp:posOffset>
                 </wp:positionV>
-                <wp:extent cx="6850380" cy="15875"/>
+                <wp:extent cx="6400800" cy="15875"/>
                 <wp:effectExtent b="0" l="0" r="0" t="0"/>
                 <wp:wrapNone/>
                 <wp:docPr id="4" name="image7.png"/>
@@ -80,7 +77,7 @@
                       <pic:spPr>
                         <a:xfrm>
                           <a:off x="0" y="0"/>
-                          <a:ext cx="6850380" cy="15875"/>
+                          <a:ext cx="6400800" cy="15875"/>
                         </a:xfrm>
                         <a:prstGeom prst="rect"/>
                         <a:ln/>
@@ -96,12 +93,12 @@
               <wp:anchor allowOverlap="1" behindDoc="0" distB="0" distT="0" distL="114300" distR="114300" hidden="0" layoutInCell="1" locked="0" relativeHeight="0" simplePos="0">
                 <wp:simplePos x="0" y="0"/>
                 <wp:positionH relativeFrom="column">
-                  <wp:posOffset>-447674</wp:posOffset>
+                  <wp:posOffset>1</wp:posOffset>
                 </wp:positionH>
                 <wp:positionV relativeFrom="paragraph">
                   <wp:posOffset>9525</wp:posOffset>
                 </wp:positionV>
-                <wp:extent cx="6850380" cy="15875"/>
+                <wp:extent cx="6400800" cy="15875"/>
                 <wp:effectExtent b="0" l="0" r="0" t="0"/>
                 <wp:wrapNone/>
                 <wp:docPr id="4" name="image8.png"/>
@@ -122,7 +119,7 @@
                       <pic:spPr>
                         <a:xfrm>
                           <a:off x="0" y="0"/>
-                          <a:ext cx="6850380" cy="15875"/>
+                          <a:ext cx="6400800" cy="15875"/>
                         </a:xfrm>
                         <a:prstGeom prst="rect"/>
                         <a:ln/>
@@ -138,7 +135,7 @@
     </w:p>
     <w:p>
       <w:pPr>
-        <w:spacing w:line="240" w:lineRule="auto"/>
+        <w:spacing w:after="0" w:before="0" w:line="227.99999999999997" w:lineRule="auto"/>
         <w:rPr>
           <w:rFonts w:ascii="Times New Roman" w:cs="Times New Roman" w:eastAsia="Times New Roman" w:hAnsi="Times New Roman"/>
           <w:b w:val="1"/>
@@ -180,80 +177,93 @@
           <w:rtl w:val="0"/>
         </w:rPr>
         <w:tab/>
-        <w:t xml:space="preserve">       Raleigh, NC</w:t>
-      </w:r>
-      <w:r>
-        <w:rPr>
-          <w:rtl w:val="0"/>
-        </w:rPr>
-      </w:r>
-    </w:p>
-    <w:p>
-      <w:pPr>
-        <w:spacing w:line="240" w:lineRule="auto"/>
+        <w:t xml:space="preserve">        </w:t>
+      </w:r>
+      <w:r>
         <w:rPr>
           <w:rFonts w:ascii="Times New Roman" w:cs="Times New Roman" w:eastAsia="Times New Roman" w:hAnsi="Times New Roman"/>
           <w:b w:val="1"/>
           <w:bCs w:val="1"/>
           <w:i w:val="1"/>
           <w:iCs w:val="1"/>
-        </w:rPr>
-      </w:pPr>
-      <w:r>
+          <w:sz w:val="20"/>
+          <w:szCs w:val="20"/>
+          <w:rtl w:val="0"/>
+        </w:rPr>
+        <w:t xml:space="preserve">Raleigh, NC</w:t>
+      </w:r>
+      <w:r>
+        <w:rPr>
+          <w:rtl w:val="0"/>
+        </w:rPr>
+      </w:r>
+    </w:p>
+    <w:p>
+      <w:pPr>
+        <w:spacing w:after="0" w:before="0" w:line="227.99999999999997" w:lineRule="auto"/>
         <w:rPr>
           <w:rFonts w:ascii="Times New Roman" w:cs="Times New Roman" w:eastAsia="Times New Roman" w:hAnsi="Times New Roman"/>
           <w:b w:val="1"/>
           <w:bCs w:val="1"/>
           <w:i w:val="1"/>
           <w:iCs w:val="1"/>
-          <w:sz w:val="20"/>
-          <w:szCs w:val="20"/>
-          <w:rtl w:val="0"/>
-        </w:rPr>
-        <w:t xml:space="preserve">B.S. </w:t>
-      </w:r>
-      <w:r>
-        <w:rPr>
-          <w:rFonts w:ascii="Times New Roman" w:cs="Times New Roman" w:eastAsia="Times New Roman" w:hAnsi="Times New Roman"/>
+        </w:rPr>
+      </w:pPr>
+      <w:r>
+        <w:rPr>
+          <w:rFonts w:ascii="Times New Roman" w:cs="Times New Roman" w:eastAsia="Times New Roman" w:hAnsi="Times New Roman"/>
+          <w:b w:val="1"/>
+          <w:bCs w:val="1"/>
           <w:i w:val="1"/>
           <w:iCs w:val="1"/>
           <w:sz w:val="20"/>
           <w:szCs w:val="20"/>
           <w:rtl w:val="0"/>
         </w:rPr>
-        <w:t xml:space="preserve">in Computer Science</w:t>
-      </w:r>
-      <w:r>
-        <w:rPr>
-          <w:rFonts w:ascii="Times New Roman" w:cs="Times New Roman" w:eastAsia="Times New Roman" w:hAnsi="Times New Roman"/>
-          <w:b w:val="1"/>
-          <w:bCs w:val="1"/>
+        <w:t xml:space="preserve">B.S. </w:t>
+      </w:r>
+      <w:r>
+        <w:rPr>
+          <w:rFonts w:ascii="Times New Roman" w:cs="Times New Roman" w:eastAsia="Times New Roman" w:hAnsi="Times New Roman"/>
           <w:i w:val="1"/>
           <w:iCs w:val="1"/>
           <w:sz w:val="20"/>
           <w:szCs w:val="20"/>
           <w:rtl w:val="0"/>
         </w:rPr>
-        <w:t xml:space="preserve"> </w:t>
-      </w:r>
-      <w:r>
-        <w:rPr>
-          <w:rFonts w:ascii="Times New Roman" w:cs="Times New Roman" w:eastAsia="Times New Roman" w:hAnsi="Times New Roman"/>
+        <w:t xml:space="preserve">in Computer Science</w:t>
+      </w:r>
+      <w:r>
+        <w:rPr>
+          <w:rFonts w:ascii="Times New Roman" w:cs="Times New Roman" w:eastAsia="Times New Roman" w:hAnsi="Times New Roman"/>
+          <w:b w:val="1"/>
+          <w:bCs w:val="1"/>
           <w:i w:val="1"/>
           <w:iCs w:val="1"/>
           <w:sz w:val="20"/>
           <w:szCs w:val="20"/>
           <w:rtl w:val="0"/>
         </w:rPr>
-        <w:t xml:space="preserve">| Philosophy Minor</w:t>
-      </w:r>
-      <w:r>
-        <w:rPr>
-          <w:rFonts w:ascii="Times New Roman" w:cs="Times New Roman" w:eastAsia="Times New Roman" w:hAnsi="Times New Roman"/>
-          <w:b w:val="1"/>
-          <w:bCs w:val="1"/>
+        <w:t xml:space="preserve"> </w:t>
+      </w:r>
+      <w:r>
+        <w:rPr>
+          <w:rFonts w:ascii="Times New Roman" w:cs="Times New Roman" w:eastAsia="Times New Roman" w:hAnsi="Times New Roman"/>
           <w:i w:val="1"/>
           <w:iCs w:val="1"/>
+          <w:sz w:val="20"/>
+          <w:szCs w:val="20"/>
+          <w:rtl w:val="0"/>
+        </w:rPr>
+        <w:t xml:space="preserve">| Philosophy Minor</w:t>
+      </w:r>
+      <w:r>
+        <w:rPr>
+          <w:rFonts w:ascii="Times New Roman" w:cs="Times New Roman" w:eastAsia="Times New Roman" w:hAnsi="Times New Roman"/>
+          <w:b w:val="1"/>
+          <w:bCs w:val="1"/>
+          <w:i w:val="1"/>
+          <w:iCs w:val="1"/>
           <w:rtl w:val="0"/>
         </w:rPr>
         <w:tab/>
@@ -267,6 +277,8 @@
           <w:rFonts w:ascii="Times New Roman" w:cs="Times New Roman" w:eastAsia="Times New Roman" w:hAnsi="Times New Roman"/>
           <w:b w:val="1"/>
           <w:bCs w:val="1"/>
+          <w:i w:val="1"/>
+          <w:iCs w:val="1"/>
           <w:sz w:val="20"/>
           <w:szCs w:val="20"/>
           <w:rtl w:val="0"/>
@@ -281,7 +293,7 @@
     </w:p>
     <w:p>
       <w:pPr>
-        <w:spacing w:line="240" w:lineRule="auto"/>
+        <w:spacing w:after="0" w:before="0" w:line="227.99999999999997" w:lineRule="auto"/>
         <w:rPr>
           <w:rFonts w:ascii="Times New Roman" w:cs="Times New Roman" w:eastAsia="Times New Roman" w:hAnsi="Times New Roman"/>
         </w:rPr>
@@ -330,7 +342,7 @@
     </w:p>
     <w:p>
       <w:pPr>
-        <w:spacing w:line="240" w:lineRule="auto"/>
+        <w:spacing w:after="0" w:before="0" w:line="227.99999999999997" w:lineRule="auto"/>
         <w:rPr>
           <w:rFonts w:ascii="Times New Roman" w:cs="Times New Roman" w:eastAsia="Times New Roman" w:hAnsi="Times New Roman"/>
           <w:b w:val="1"/>
@@ -348,21 +360,14 @@
           <w:szCs w:val="24"/>
           <w:rtl w:val="0"/>
         </w:rPr>
-        <w:t xml:space="preserve">ACADEMIC EXPERIENCE </w:t>
-      </w:r>
-    </w:p>
-    <w:p>
-      <w:pPr>
-        <w:widowControl w:val="0"/>
-        <w:spacing w:before="120" w:line="240" w:lineRule="auto"/>
-        <w:ind w:right="300"/>
-        <w:rPr>
-          <w:rFonts w:ascii="Times New Roman" w:cs="Times New Roman" w:eastAsia="Times New Roman" w:hAnsi="Times New Roman"/>
-          <w:sz w:val="20"/>
-          <w:szCs w:val="20"/>
-        </w:rPr>
-      </w:pPr>
-      <w:r>
+        <w:t xml:space="preserve">EXPERIENCE &amp; LEADERSHIP</w:t>
+      </w:r>
+    </w:p>
+    <w:p>
+      <w:pPr>
+        <w:keepLines w:val="1"/>
+        <w:widowControl w:val="1"/>
+        <w:spacing w:after="0" w:before="0" w:line="227.99999999999997" w:lineRule="auto"/>
         <w:rPr>
           <w:rFonts w:ascii="Times New Roman" w:cs="Times New Roman" w:eastAsia="Times New Roman" w:hAnsi="Times New Roman"/>
           <w:b w:val="1"/>
@@ -371,53 +376,36 @@
           <w:iCs w:val="1"/>
           <w:sz w:val="20"/>
           <w:szCs w:val="20"/>
-          <w:rtl w:val="0"/>
-        </w:rPr>
-        <w:t xml:space="preserve">Compressed File Archiver (Snark) –</w:t>
-      </w:r>
-      <w:r>
-        <w:rPr>
-          <w:rFonts w:ascii="Times New Roman" w:cs="Times New Roman" w:eastAsia="Times New Roman" w:hAnsi="Times New Roman"/>
-          <w:i w:val="1"/>
-          <w:iCs w:val="1"/>
-          <w:sz w:val="20"/>
-          <w:szCs w:val="20"/>
-          <w:rtl w:val="0"/>
-        </w:rPr>
-        <w:t xml:space="preserve"> C and Software Tools</w:t>
-        <w:tab/>
-        <w:tab/>
-        <w:tab/>
-        <w:tab/>
-        <w:tab/>
-        <w:tab/>
-      </w:r>
-      <w:r>
-        <w:rPr>
-          <w:rtl w:val="0"/>
-        </w:rPr>
-      </w:r>
-      <w:r>
+        </w:rPr>
+      </w:pPr>
+      <w:r>
+        <w:rPr>
+          <w:rFonts w:ascii="Times New Roman" w:cs="Times New Roman" w:eastAsia="Times New Roman" w:hAnsi="Times New Roman"/>
+          <w:b w:val="1"/>
+          <w:bCs w:val="1"/>
+          <w:sz w:val="20"/>
+          <w:szCs w:val="20"/>
+        </w:rPr>
         <mc:AlternateContent>
           <mc:Choice Requires="wpg">
             <w:drawing>
               <wp:anchor allowOverlap="1" behindDoc="0" distB="0" distT="0" distL="114300" distR="114300" hidden="0" layoutInCell="1" locked="0" relativeHeight="0" simplePos="0">
                 <wp:simplePos x="0" y="0"/>
-                <wp:positionH relativeFrom="column">
-                  <wp:posOffset>-447674</wp:posOffset>
+                <wp:positionH relativeFrom="page">
+                  <wp:posOffset>914400</wp:posOffset>
                 </wp:positionH>
-                <wp:positionV relativeFrom="paragraph">
-                  <wp:posOffset>9525</wp:posOffset>
+                <wp:positionV relativeFrom="page">
+                  <wp:posOffset>2056162</wp:posOffset>
                 </wp:positionV>
-                <wp:extent cx="6850743" cy="15875"/>
+                <wp:extent cx="6400800" cy="15875"/>
                 <wp:effectExtent b="0" l="0" r="0" t="0"/>
-                <wp:wrapNone/>
-                <wp:docPr id="2" name="image3.png"/>
+                <wp:wrapTopAndBottom distB="0" distT="0"/>
+                <wp:docPr id="1" name="image1.png"/>
                 <a:graphic>
                   <a:graphicData uri="http://schemas.openxmlformats.org/drawingml/2006/picture">
                     <pic:pic>
                       <pic:nvPicPr>
-                        <pic:cNvPr id="0" name="image3.png"/>
+                        <pic:cNvPr id="0" name="image1.png"/>
                         <pic:cNvPicPr preferRelativeResize="0"/>
                       </pic:nvPicPr>
                       <pic:blipFill>
@@ -430,7 +418,7 @@
                       <pic:spPr>
                         <a:xfrm>
                           <a:off x="0" y="0"/>
-                          <a:ext cx="6850743" cy="15875"/>
+                          <a:ext cx="6400800" cy="15875"/>
                         </a:xfrm>
                         <a:prstGeom prst="rect"/>
                         <a:ln/>
@@ -445,21 +433,21 @@
             <w:drawing>
               <wp:anchor allowOverlap="1" behindDoc="0" distB="0" distT="0" distL="114300" distR="114300" hidden="0" layoutInCell="1" locked="0" relativeHeight="0" simplePos="0">
                 <wp:simplePos x="0" y="0"/>
-                <wp:positionH relativeFrom="column">
-                  <wp:posOffset>-447674</wp:posOffset>
+                <wp:positionH relativeFrom="page">
+                  <wp:posOffset>914400</wp:posOffset>
                 </wp:positionH>
-                <wp:positionV relativeFrom="paragraph">
-                  <wp:posOffset>9525</wp:posOffset>
+                <wp:positionV relativeFrom="page">
+                  <wp:posOffset>2056162</wp:posOffset>
                 </wp:positionV>
-                <wp:extent cx="6850743" cy="15875"/>
+                <wp:extent cx="6400800" cy="15875"/>
                 <wp:effectExtent b="0" l="0" r="0" t="0"/>
-                <wp:wrapNone/>
-                <wp:docPr id="2" name="image4.png"/>
+                <wp:wrapTopAndBottom distB="0" distT="0"/>
+                <wp:docPr id="1" name="image2.png"/>
                 <a:graphic>
                   <a:graphicData uri="http://schemas.openxmlformats.org/drawingml/2006/picture">
                     <pic:pic>
                       <pic:nvPicPr>
-                        <pic:cNvPr id="0" name="image4.png"/>
+                        <pic:cNvPr id="0" name="image2.png"/>
                         <pic:cNvPicPr preferRelativeResize="0"/>
                       </pic:nvPicPr>
                       <pic:blipFill>
@@ -472,7 +460,7 @@
                       <pic:spPr>
                         <a:xfrm>
                           <a:off x="0" y="0"/>
-                          <a:ext cx="6850743" cy="15875"/>
+                          <a:ext cx="6400800" cy="15875"/>
                         </a:xfrm>
                         <a:prstGeom prst="rect"/>
                         <a:ln/>
@@ -485,109 +473,221 @@
           </mc:Fallback>
         </mc:AlternateContent>
       </w:r>
-    </w:p>
-    <w:p>
-      <w:pPr>
-        <w:widowControl w:val="0"/>
+      <w:r>
+        <w:rPr>
+          <w:rFonts w:ascii="Times New Roman" w:cs="Times New Roman" w:eastAsia="Times New Roman" w:hAnsi="Times New Roman"/>
+          <w:b w:val="1"/>
+          <w:bCs w:val="1"/>
+          <w:sz w:val="20"/>
+          <w:szCs w:val="20"/>
+          <w:rtl w:val="0"/>
+        </w:rPr>
+        <w:t xml:space="preserve">Neurotech at NCSU</w:t>
+      </w:r>
+      <w:r>
+        <w:rPr>
+          <w:rFonts w:ascii="Times New Roman" w:cs="Times New Roman" w:eastAsia="Times New Roman" w:hAnsi="Times New Roman"/>
+          <w:sz w:val="20"/>
+          <w:szCs w:val="20"/>
+          <w:rtl w:val="0"/>
+        </w:rPr>
+        <w:t xml:space="preserve"> | </w:t>
+      </w:r>
+      <w:r>
+        <w:rPr>
+          <w:rFonts w:ascii="Times New Roman" w:cs="Times New Roman" w:eastAsia="Times New Roman" w:hAnsi="Times New Roman"/>
+          <w:b w:val="1"/>
+          <w:bCs w:val="1"/>
+          <w:sz w:val="20"/>
+          <w:szCs w:val="20"/>
+          <w:rtl w:val="0"/>
+        </w:rPr>
+        <w:t xml:space="preserve">Lead Software Engineer</w:t>
+      </w:r>
+      <w:r>
+        <w:rPr>
+          <w:rFonts w:ascii="Times New Roman" w:cs="Times New Roman" w:eastAsia="Times New Roman" w:hAnsi="Times New Roman"/>
+          <w:sz w:val="20"/>
+          <w:szCs w:val="20"/>
+          <w:rtl w:val="0"/>
+        </w:rPr>
+        <w:t xml:space="preserve">  </w:t>
+        <w:tab/>
+        <w:tab/>
+        <w:tab/>
+        <w:tab/>
+        <w:tab/>
+        <w:tab/>
+        <w:t xml:space="preserve">           </w:t>
+      </w:r>
+      <w:r>
+        <w:rPr>
+          <w:rFonts w:ascii="Times New Roman" w:cs="Times New Roman" w:eastAsia="Times New Roman" w:hAnsi="Times New Roman"/>
+          <w:b w:val="1"/>
+          <w:bCs w:val="1"/>
+          <w:i w:val="1"/>
+          <w:iCs w:val="1"/>
+          <w:sz w:val="20"/>
+          <w:szCs w:val="20"/>
+          <w:rtl w:val="0"/>
+        </w:rPr>
+        <w:t xml:space="preserve">Sep 2025-Present</w:t>
+      </w:r>
+    </w:p>
+    <w:p>
+      <w:pPr>
+        <w:keepLines w:val="1"/>
+        <w:widowControl w:val="1"/>
         <w:numPr>
           <w:ilvl w:val="0"/>
-          <w:numId w:val="2"/>
+          <w:numId w:val="3"/>
         </w:numPr>
-        <w:spacing w:after="0" w:afterAutospacing="0" w:before="42.3260498046875" w:line="240" w:lineRule="auto"/>
-        <w:ind w:left="720" w:right="137.95166015625" w:hanging="360"/>
-        <w:rPr>
-          <w:rFonts w:ascii="Times New Roman" w:cs="Times New Roman" w:eastAsia="Times New Roman" w:hAnsi="Times New Roman"/>
-          <w:sz w:val="20"/>
-          <w:szCs w:val="20"/>
-        </w:rPr>
-      </w:pPr>
-      <w:r>
-        <w:rPr>
-          <w:rFonts w:ascii="Times New Roman" w:cs="Times New Roman" w:eastAsia="Times New Roman" w:hAnsi="Times New Roman"/>
-          <w:sz w:val="20"/>
-          <w:szCs w:val="20"/>
-          <w:rtl w:val="0"/>
-        </w:rPr>
-        <w:t xml:space="preserve">Developed a C-based command-line program to create and extract files from a custom-format compressed archive, similar to </w:t>
-      </w:r>
-      <w:r>
-        <w:rPr>
-          <w:rFonts w:ascii="Times New Roman" w:cs="Times New Roman" w:eastAsia="Times New Roman" w:hAnsi="Times New Roman"/>
-          <w:b w:val="1"/>
-          <w:bCs w:val="1"/>
-          <w:sz w:val="20"/>
-          <w:szCs w:val="20"/>
-          <w:rtl w:val="0"/>
-        </w:rPr>
-        <w:t xml:space="preserve">tar</w:t>
-      </w:r>
-      <w:r>
-        <w:rPr>
-          <w:rFonts w:ascii="Times New Roman" w:cs="Times New Roman" w:eastAsia="Times New Roman" w:hAnsi="Times New Roman"/>
-          <w:sz w:val="20"/>
-          <w:szCs w:val="20"/>
-          <w:rtl w:val="0"/>
-        </w:rPr>
-        <w:t xml:space="preserve"> or </w:t>
-      </w:r>
-      <w:r>
-        <w:rPr>
-          <w:rFonts w:ascii="Times New Roman" w:cs="Times New Roman" w:eastAsia="Times New Roman" w:hAnsi="Times New Roman"/>
-          <w:b w:val="1"/>
-          <w:bCs w:val="1"/>
-          <w:sz w:val="20"/>
-          <w:szCs w:val="20"/>
-          <w:rtl w:val="0"/>
-        </w:rPr>
-        <w:t xml:space="preserve">zip</w:t>
-      </w:r>
-      <w:r>
-        <w:rPr>
-          <w:rFonts w:ascii="Times New Roman" w:cs="Times New Roman" w:eastAsia="Times New Roman" w:hAnsi="Times New Roman"/>
-          <w:sz w:val="20"/>
-          <w:szCs w:val="20"/>
-          <w:rtl w:val="0"/>
-        </w:rPr>
-        <w:t xml:space="preserve">.</w:t>
-      </w:r>
-    </w:p>
-    <w:p>
-      <w:pPr>
-        <w:widowControl w:val="0"/>
+        <w:spacing w:after="0" w:before="0" w:line="227.99999999999997" w:lineRule="auto"/>
+        <w:ind w:left="720" w:hanging="360"/>
+        <w:rPr>
+          <w:rFonts w:ascii="Times New Roman" w:cs="Times New Roman" w:eastAsia="Times New Roman" w:hAnsi="Times New Roman"/>
+          <w:sz w:val="20"/>
+          <w:szCs w:val="20"/>
+          <w:u w:val="none"/>
+        </w:rPr>
+      </w:pPr>
+      <w:r>
+        <w:rPr>
+          <w:rFonts w:ascii="Times New Roman" w:cs="Times New Roman" w:eastAsia="Times New Roman" w:hAnsi="Times New Roman"/>
+          <w:b w:val="1"/>
+          <w:bCs w:val="1"/>
+          <w:sz w:val="20"/>
+          <w:szCs w:val="20"/>
+          <w:rtl w:val="0"/>
+        </w:rPr>
+        <w:t xml:space="preserve">Engineering Leadership:</w:t>
+      </w:r>
+      <w:r>
+        <w:rPr>
+          <w:rFonts w:ascii="Times New Roman" w:cs="Times New Roman" w:eastAsia="Times New Roman" w:hAnsi="Times New Roman"/>
+          <w:sz w:val="20"/>
+          <w:szCs w:val="20"/>
+          <w:rtl w:val="0"/>
+        </w:rPr>
+        <w:t xml:space="preserve"> Spearheading the software development roadmap for brain-computer interface (BCI) projects, managing a team of developers to integrate electroencephalogram (EEG) data with real-time applications.</w:t>
+      </w:r>
+    </w:p>
+    <w:p>
+      <w:pPr>
+        <w:keepLines w:val="1"/>
+        <w:widowControl w:val="1"/>
         <w:numPr>
           <w:ilvl w:val="0"/>
-          <w:numId w:val="2"/>
+          <w:numId w:val="3"/>
         </w:numPr>
-        <w:spacing w:before="0" w:beforeAutospacing="0" w:line="240" w:lineRule="auto"/>
-        <w:ind w:left="720" w:right="137.95166015625" w:hanging="360"/>
-        <w:rPr>
-          <w:rFonts w:ascii="Times New Roman" w:cs="Times New Roman" w:eastAsia="Times New Roman" w:hAnsi="Times New Roman"/>
-          <w:sz w:val="20"/>
-          <w:szCs w:val="20"/>
-        </w:rPr>
-      </w:pPr>
-      <w:r>
-        <w:rPr>
-          <w:rFonts w:ascii="Times New Roman" w:cs="Times New Roman" w:eastAsia="Times New Roman" w:hAnsi="Times New Roman"/>
-          <w:sz w:val="20"/>
-          <w:szCs w:val="20"/>
-          <w:rtl w:val="0"/>
-        </w:rPr>
-        <w:t xml:space="preserve">Implemented file compression logic to reduce archive size and managed all file I/O operations.</w:t>
+        <w:spacing w:after="0" w:before="0" w:line="227.99999999999997" w:lineRule="auto"/>
+        <w:ind w:left="720" w:hanging="360"/>
+        <w:rPr>
+          <w:rFonts w:ascii="Times New Roman" w:cs="Times New Roman" w:eastAsia="Times New Roman" w:hAnsi="Times New Roman"/>
+          <w:sz w:val="20"/>
+          <w:szCs w:val="20"/>
+        </w:rPr>
+      </w:pPr>
+      <w:r>
+        <w:rPr>
+          <w:rFonts w:ascii="Times New Roman" w:cs="Times New Roman" w:eastAsia="Times New Roman" w:hAnsi="Times New Roman"/>
+          <w:b w:val="1"/>
+          <w:bCs w:val="1"/>
+          <w:sz w:val="20"/>
+          <w:szCs w:val="20"/>
+          <w:rtl w:val="0"/>
+        </w:rPr>
+        <w:t xml:space="preserve">Machine Learning &amp; Signal Processing:</w:t>
+      </w:r>
+      <w:r>
+        <w:rPr>
+          <w:rFonts w:ascii="Times New Roman" w:cs="Times New Roman" w:eastAsia="Times New Roman" w:hAnsi="Times New Roman"/>
+          <w:sz w:val="20"/>
+          <w:szCs w:val="20"/>
+          <w:rtl w:val="0"/>
+        </w:rPr>
+        <w:t xml:space="preserve"> Designing and implementing machine learning algorithms to filter raw EEG signal noise and classify specific brain-wave patterns to trigger digital and physical actions.</w:t>
+      </w:r>
+    </w:p>
+    <w:p>
+      <w:pPr>
+        <w:keepLines w:val="1"/>
+        <w:widowControl w:val="1"/>
+        <w:numPr>
+          <w:ilvl w:val="0"/>
+          <w:numId w:val="3"/>
+        </w:numPr>
+        <w:spacing w:after="0" w:before="0" w:line="227.99999999999997" w:lineRule="auto"/>
+        <w:ind w:left="720" w:hanging="360"/>
+        <w:rPr>
+          <w:rFonts w:ascii="Times New Roman" w:cs="Times New Roman" w:eastAsia="Times New Roman" w:hAnsi="Times New Roman"/>
+          <w:sz w:val="20"/>
+          <w:szCs w:val="20"/>
+        </w:rPr>
+      </w:pPr>
+      <w:r>
+        <w:rPr>
+          <w:rFonts w:ascii="Times New Roman" w:cs="Times New Roman" w:eastAsia="Times New Roman" w:hAnsi="Times New Roman"/>
+          <w:b w:val="1"/>
+          <w:bCs w:val="1"/>
+          <w:sz w:val="20"/>
+          <w:szCs w:val="20"/>
+          <w:rtl w:val="0"/>
+        </w:rPr>
+        <w:t xml:space="preserve">Assistive Technology Development:</w:t>
+      </w:r>
+      <w:r>
+        <w:rPr>
+          <w:rFonts w:ascii="Times New Roman" w:cs="Times New Roman" w:eastAsia="Times New Roman" w:hAnsi="Times New Roman"/>
+          <w:sz w:val="20"/>
+          <w:szCs w:val="20"/>
+          <w:rtl w:val="0"/>
+        </w:rPr>
+        <w:t xml:space="preserve"> Leading the creation of a grid-based, switch-accessible Augmentative and Alternative Communication (AAC) application utilizing eye-tracking technology for children with severe motor impairments.</w:t>
+      </w:r>
+    </w:p>
+    <w:p>
+      <w:pPr>
+        <w:keepLines w:val="1"/>
+        <w:widowControl w:val="1"/>
+        <w:numPr>
+          <w:ilvl w:val="0"/>
+          <w:numId w:val="3"/>
+        </w:numPr>
+        <w:spacing w:after="0" w:before="0" w:line="227.99999999999997" w:lineRule="auto"/>
+        <w:ind w:left="720" w:hanging="360"/>
+        <w:rPr>
+          <w:rFonts w:ascii="Times New Roman" w:cs="Times New Roman" w:eastAsia="Times New Roman" w:hAnsi="Times New Roman"/>
+          <w:sz w:val="20"/>
+          <w:szCs w:val="20"/>
+        </w:rPr>
+      </w:pPr>
+      <w:r>
+        <w:rPr>
+          <w:rFonts w:ascii="Times New Roman" w:cs="Times New Roman" w:eastAsia="Times New Roman" w:hAnsi="Times New Roman"/>
+          <w:b w:val="1"/>
+          <w:bCs w:val="1"/>
+          <w:sz w:val="20"/>
+          <w:szCs w:val="20"/>
+          <w:rtl w:val="0"/>
+        </w:rPr>
+        <w:t xml:space="preserve">Hardware Integration:</w:t>
+      </w:r>
+      <w:r>
+        <w:rPr>
+          <w:rFonts w:ascii="Times New Roman" w:cs="Times New Roman" w:eastAsia="Times New Roman" w:hAnsi="Times New Roman"/>
+          <w:sz w:val="20"/>
+          <w:szCs w:val="20"/>
+          <w:rtl w:val="0"/>
+        </w:rPr>
+        <w:t xml:space="preserve"> Coordinating with neurotech industry partners to integrate high-fidelity EEG headsets for future-phase projects, including brain-controlled robotics (RC cars) and neuro-feedback gaming environments.</w:t>
       </w:r>
     </w:p>
     <w:p>
       <w:pPr>
         <w:widowControl w:val="0"/>
-        <w:spacing w:before="42.3260498046875" w:line="240" w:lineRule="auto"/>
-        <w:ind w:right="137.95166015625"/>
-        <w:rPr>
-          <w:rFonts w:ascii="Times New Roman" w:cs="Times New Roman" w:eastAsia="Times New Roman" w:hAnsi="Times New Roman"/>
-          <w:sz w:val="20"/>
-          <w:szCs w:val="20"/>
-        </w:rPr>
-      </w:pPr>
-      <w:r>
+        <w:spacing w:after="0" w:before="0" w:line="227.99999999999997" w:lineRule="auto"/>
+        <w:ind w:left="0" w:firstLine="0"/>
         <w:rPr>
           <w:rFonts w:ascii="Times New Roman" w:cs="Times New Roman" w:eastAsia="Times New Roman" w:hAnsi="Times New Roman"/>
           <w:b w:val="1"/>
@@ -596,25 +696,46 @@
           <w:iCs w:val="1"/>
           <w:sz w:val="20"/>
           <w:szCs w:val="20"/>
-          <w:rtl w:val="0"/>
-        </w:rPr>
-        <w:t xml:space="preserve">Assistive Gaze Communication – </w:t>
-      </w:r>
-      <w:r>
-        <w:rPr>
-          <w:rFonts w:ascii="Times New Roman" w:cs="Times New Roman" w:eastAsia="Times New Roman" w:hAnsi="Times New Roman"/>
+        </w:rPr>
+      </w:pPr>
+      <w:r>
+        <w:rPr>
+          <w:rFonts w:ascii="Times New Roman" w:cs="Times New Roman" w:eastAsia="Times New Roman" w:hAnsi="Times New Roman"/>
+          <w:b w:val="1"/>
+          <w:bCs w:val="1"/>
+          <w:sz w:val="20"/>
+          <w:szCs w:val="20"/>
+          <w:rtl w:val="0"/>
+        </w:rPr>
+        <w:t xml:space="preserve">Code Black |  (Event &amp; Company Outreach Coordinator)</w:t>
+      </w:r>
+      <w:r>
+        <w:rPr>
+          <w:rFonts w:ascii="Times New Roman" w:cs="Times New Roman" w:eastAsia="Times New Roman" w:hAnsi="Times New Roman"/>
+          <w:sz w:val="20"/>
+          <w:szCs w:val="20"/>
+          <w:rtl w:val="0"/>
+        </w:rPr>
+        <w:tab/>
+        <w:tab/>
+        <w:tab/>
+        <w:tab/>
+        <w:t xml:space="preserve">           </w:t>
+        <w:tab/>
+        <w:t xml:space="preserve">           </w:t>
+      </w:r>
+      <w:r>
+        <w:rPr>
+          <w:rFonts w:ascii="Times New Roman" w:cs="Times New Roman" w:eastAsia="Times New Roman" w:hAnsi="Times New Roman"/>
+          <w:b w:val="1"/>
+          <w:bCs w:val="1"/>
           <w:i w:val="1"/>
           <w:iCs w:val="1"/>
           <w:sz w:val="20"/>
           <w:szCs w:val="20"/>
           <w:rtl w:val="0"/>
         </w:rPr>
-        <w:t xml:space="preserve">Neurotech at NCSU</w:t>
-      </w:r>
-      <w:r>
-        <w:rPr>
-          <w:rtl w:val="0"/>
-        </w:rPr>
+        <w:t xml:space="preserve">Apr 2024-Dec 2024</w:t>
       </w:r>
     </w:p>
     <w:p>
@@ -624,42 +745,35 @@
           <w:ilvl w:val="0"/>
           <w:numId w:val="1"/>
         </w:numPr>
-        <w:spacing w:after="0" w:afterAutospacing="0" w:before="42.3260498046875" w:line="240" w:lineRule="auto"/>
-        <w:ind w:left="720" w:right="137.95166015625" w:hanging="360"/>
-        <w:rPr>
-          <w:rFonts w:ascii="Times New Roman" w:cs="Times New Roman" w:eastAsia="Times New Roman" w:hAnsi="Times New Roman"/>
-          <w:sz w:val="20"/>
-          <w:szCs w:val="20"/>
-        </w:rPr>
-      </w:pPr>
-      <w:r>
-        <w:rPr>
-          <w:rFonts w:ascii="Times New Roman" w:cs="Times New Roman" w:eastAsia="Times New Roman" w:hAnsi="Times New Roman"/>
-          <w:sz w:val="20"/>
-          <w:szCs w:val="20"/>
-          <w:rtl w:val="0"/>
-        </w:rPr>
-        <w:t xml:space="preserve">As lead SWE of </w:t>
-      </w:r>
-      <w:r>
-        <w:rPr>
-          <w:rFonts w:ascii="Times New Roman" w:cs="Times New Roman" w:eastAsia="Times New Roman" w:hAnsi="Times New Roman"/>
-          <w:i w:val="1"/>
-          <w:iCs w:val="1"/>
-          <w:sz w:val="20"/>
-          <w:szCs w:val="20"/>
-          <w:rtl w:val="0"/>
-        </w:rPr>
-        <w:t xml:space="preserve">Neurotech at NCSU</w:t>
-      </w:r>
-      <w:r>
-        <w:rPr>
-          <w:rFonts w:ascii="Times New Roman" w:cs="Times New Roman" w:eastAsia="Times New Roman" w:hAnsi="Times New Roman"/>
-          <w:sz w:val="20"/>
-          <w:szCs w:val="20"/>
-          <w:rtl w:val="0"/>
-        </w:rPr>
-        <w:t xml:space="preserve">, I’m developing a grid-based, switch-accessible AAC application for non-verbal children with severe motor impairments.</w:t>
+        <w:spacing w:after="0" w:before="0" w:line="227.99999999999997" w:lineRule="auto"/>
+        <w:ind w:left="720" w:hanging="360"/>
+        <w:rPr>
+          <w:rFonts w:ascii="Times New Roman" w:cs="Times New Roman" w:eastAsia="Times New Roman" w:hAnsi="Times New Roman"/>
+          <w:b w:val="1"/>
+          <w:bCs w:val="1"/>
+          <w:sz w:val="20"/>
+          <w:szCs w:val="20"/>
+        </w:rPr>
+      </w:pPr>
+      <w:r>
+        <w:rPr>
+          <w:rFonts w:ascii="Times New Roman" w:cs="Times New Roman" w:eastAsia="Times New Roman" w:hAnsi="Times New Roman"/>
+          <w:b w:val="1"/>
+          <w:bCs w:val="1"/>
+          <w:sz w:val="20"/>
+          <w:szCs w:val="20"/>
+          <w:rtl w:val="0"/>
+        </w:rPr>
+        <w:t xml:space="preserve">Corporate Partnerships</w:t>
+      </w:r>
+      <w:r>
+        <w:rPr>
+          <w:rFonts w:ascii="Times New Roman" w:cs="Times New Roman" w:eastAsia="Times New Roman" w:hAnsi="Times New Roman"/>
+          <w:sz w:val="20"/>
+          <w:szCs w:val="20"/>
+          <w:rtl w:val="0"/>
+        </w:rPr>
+        <w:t xml:space="preserve">: Directed outreach initiatives to industry representatives to secure financial sponsorships and recruitment presence for club events.</w:t>
       </w:r>
     </w:p>
     <w:p>
@@ -669,82 +783,35 @@
           <w:ilvl w:val="0"/>
           <w:numId w:val="1"/>
         </w:numPr>
-        <w:spacing w:before="0" w:beforeAutospacing="0" w:line="240" w:lineRule="auto"/>
-        <w:ind w:left="720" w:right="137.95166015625" w:hanging="360"/>
-        <w:rPr>
-          <w:rFonts w:ascii="Times New Roman" w:cs="Times New Roman" w:eastAsia="Times New Roman" w:hAnsi="Times New Roman"/>
-          <w:sz w:val="20"/>
-          <w:szCs w:val="20"/>
-          <w:u w:val="none"/>
-        </w:rPr>
-      </w:pPr>
-      <w:r>
-        <w:rPr>
-          <w:rFonts w:ascii="Times New Roman" w:cs="Times New Roman" w:eastAsia="Times New Roman" w:hAnsi="Times New Roman"/>
-          <w:sz w:val="20"/>
-          <w:szCs w:val="20"/>
-          <w:rtl w:val="0"/>
-        </w:rPr>
-        <w:t xml:space="preserve">Implementing an eye tracker for a grid-based </w:t>
-      </w:r>
-      <w:r>
-        <w:rPr>
-          <w:rFonts w:ascii="Times New Roman" w:cs="Times New Roman" w:eastAsia="Times New Roman" w:hAnsi="Times New Roman"/>
-          <w:sz w:val="20"/>
-          <w:szCs w:val="20"/>
-          <w:rtl w:val="0"/>
-        </w:rPr>
-        <w:t xml:space="preserve">app</w:t>
-      </w:r>
-      <w:r>
-        <w:rPr>
-          <w:rFonts w:ascii="Times New Roman" w:cs="Times New Roman" w:eastAsia="Times New Roman" w:hAnsi="Times New Roman"/>
-          <w:sz w:val="20"/>
-          <w:szCs w:val="20"/>
-          <w:rtl w:val="0"/>
-        </w:rPr>
-        <w:t xml:space="preserve"> and for playing semi-complex turn-based games.</w:t>
-      </w:r>
-    </w:p>
-    <w:p>
-      <w:pPr>
-        <w:widowControl w:val="0"/>
-        <w:spacing w:before="42.3260498046875" w:line="240" w:lineRule="auto"/>
-        <w:ind w:right="137.95166015625"/>
-        <w:rPr>
-          <w:rFonts w:ascii="Times New Roman" w:cs="Times New Roman" w:eastAsia="Times New Roman" w:hAnsi="Times New Roman"/>
-          <w:sz w:val="20"/>
-          <w:szCs w:val="20"/>
-        </w:rPr>
-      </w:pPr>
-      <w:r>
-        <w:rPr>
-          <w:rFonts w:ascii="Times New Roman" w:cs="Times New Roman" w:eastAsia="Times New Roman" w:hAnsi="Times New Roman"/>
-          <w:b w:val="1"/>
-          <w:bCs w:val="1"/>
-          <w:i w:val="1"/>
-          <w:iCs w:val="1"/>
-          <w:sz w:val="20"/>
-          <w:szCs w:val="20"/>
-          <w:rtl w:val="0"/>
-        </w:rPr>
-        <w:t xml:space="preserve">User Activity Log – </w:t>
-      </w:r>
-      <w:r>
-        <w:rPr>
-          <w:rFonts w:ascii="Times New Roman" w:cs="Times New Roman" w:eastAsia="Times New Roman" w:hAnsi="Times New Roman"/>
-          <w:i w:val="1"/>
-          <w:iCs w:val="1"/>
-          <w:sz w:val="20"/>
-          <w:szCs w:val="20"/>
-          <w:rtl w:val="0"/>
-        </w:rPr>
-        <w:t xml:space="preserve">Data Structures &amp; Algorithms</w:t>
-      </w:r>
-      <w:r>
-        <w:rPr>
-          <w:rtl w:val="0"/>
-        </w:rPr>
+        <w:spacing w:after="0" w:before="0" w:line="227.99999999999997" w:lineRule="auto"/>
+        <w:ind w:left="720" w:hanging="360"/>
+        <w:rPr>
+          <w:rFonts w:ascii="Times New Roman" w:cs="Times New Roman" w:eastAsia="Times New Roman" w:hAnsi="Times New Roman"/>
+          <w:b w:val="1"/>
+          <w:bCs w:val="1"/>
+          <w:sz w:val="20"/>
+          <w:szCs w:val="20"/>
+        </w:rPr>
+      </w:pPr>
+      <w:r>
+        <w:rPr>
+          <w:rFonts w:ascii="Times New Roman" w:cs="Times New Roman" w:eastAsia="Times New Roman" w:hAnsi="Times New Roman"/>
+          <w:b w:val="1"/>
+          <w:bCs w:val="1"/>
+          <w:sz w:val="20"/>
+          <w:szCs w:val="20"/>
+          <w:rtl w:val="0"/>
+        </w:rPr>
+        <w:t xml:space="preserve">Event Orchestration</w:t>
+      </w:r>
+      <w:r>
+        <w:rPr>
+          <w:rFonts w:ascii="Times New Roman" w:cs="Times New Roman" w:eastAsia="Times New Roman" w:hAnsi="Times New Roman"/>
+          <w:sz w:val="20"/>
+          <w:szCs w:val="20"/>
+          <w:rtl w:val="0"/>
+        </w:rPr>
+        <w:t xml:space="preserve">: Led the planning and execution of the annual Code Black Hackathon and career fair, managing logistics, vendor relations, and participant experience.</w:t>
       </w:r>
     </w:p>
     <w:p>
@@ -754,22 +821,55 @@
           <w:ilvl w:val="0"/>
           <w:numId w:val="1"/>
         </w:numPr>
-        <w:spacing w:after="0" w:afterAutospacing="0" w:before="42.3260498046875" w:line="240" w:lineRule="auto"/>
-        <w:ind w:left="720" w:right="137.95166015625" w:hanging="360"/>
-        <w:rPr>
-          <w:rFonts w:ascii="Times New Roman" w:cs="Times New Roman" w:eastAsia="Times New Roman" w:hAnsi="Times New Roman"/>
-          <w:sz w:val="20"/>
-          <w:szCs w:val="20"/>
-        </w:rPr>
-      </w:pPr>
-      <w:r>
-        <w:rPr>
-          <w:rFonts w:ascii="Times New Roman" w:cs="Times New Roman" w:eastAsia="Times New Roman" w:hAnsi="Times New Roman"/>
-          <w:sz w:val="20"/>
-          <w:szCs w:val="20"/>
-          <w:rtl w:val="0"/>
-        </w:rPr>
-        <w:t xml:space="preserve">Developed a Java-based log management system with a partner, implementing a Map ADT and array-based list for efficient log storage.</w:t>
+        <w:spacing w:after="0" w:before="0" w:line="227.99999999999997" w:lineRule="auto"/>
+        <w:ind w:left="720" w:hanging="360"/>
+        <w:rPr>
+          <w:rFonts w:ascii="Times New Roman" w:cs="Times New Roman" w:eastAsia="Times New Roman" w:hAnsi="Times New Roman"/>
+          <w:b w:val="1"/>
+          <w:bCs w:val="1"/>
+          <w:sz w:val="20"/>
+          <w:szCs w:val="20"/>
+        </w:rPr>
+      </w:pPr>
+      <w:r>
+        <w:rPr>
+          <w:rFonts w:ascii="Times New Roman" w:cs="Times New Roman" w:eastAsia="Times New Roman" w:hAnsi="Times New Roman"/>
+          <w:b w:val="1"/>
+          <w:bCs w:val="1"/>
+          <w:sz w:val="20"/>
+          <w:szCs w:val="20"/>
+          <w:rtl w:val="0"/>
+        </w:rPr>
+        <w:t xml:space="preserve">Strategic Collaboration</w:t>
+      </w:r>
+      <w:r>
+        <w:rPr>
+          <w:rFonts w:ascii="Times New Roman" w:cs="Times New Roman" w:eastAsia="Times New Roman" w:hAnsi="Times New Roman"/>
+          <w:sz w:val="20"/>
+          <w:szCs w:val="20"/>
+          <w:rtl w:val="0"/>
+        </w:rPr>
+        <w:t xml:space="preserve">: Partnered with the Raleigh chapter of </w:t>
+      </w:r>
+      <w:r>
+        <w:rPr>
+          <w:rFonts w:ascii="Times New Roman" w:cs="Times New Roman" w:eastAsia="Times New Roman" w:hAnsi="Times New Roman"/>
+          <w:b w:val="1"/>
+          <w:bCs w:val="1"/>
+          <w:sz w:val="20"/>
+          <w:szCs w:val="20"/>
+          <w:rtl w:val="0"/>
+        </w:rPr>
+        <w:t xml:space="preserve">Blacks in Technology (BIT)</w:t>
+      </w:r>
+      <w:r>
+        <w:rPr>
+          <w:rFonts w:ascii="Times New Roman" w:cs="Times New Roman" w:eastAsia="Times New Roman" w:hAnsi="Times New Roman"/>
+          <w:sz w:val="20"/>
+          <w:szCs w:val="20"/>
+          <w:rtl w:val="0"/>
+        </w:rPr>
+        <w:t xml:space="preserve"> to co-coordinate a collaborative professional event in observance of Black History Month.</w:t>
       </w:r>
     </w:p>
     <w:p>
@@ -779,240 +879,40 @@
           <w:ilvl w:val="0"/>
           <w:numId w:val="1"/>
         </w:numPr>
-        <w:spacing w:after="0" w:afterAutospacing="0" w:before="0" w:beforeAutospacing="0" w:line="240" w:lineRule="auto"/>
-        <w:ind w:left="720" w:right="137.95166015625" w:hanging="360"/>
-        <w:rPr>
-          <w:rFonts w:ascii="Times New Roman" w:cs="Times New Roman" w:eastAsia="Times New Roman" w:hAnsi="Times New Roman"/>
-          <w:sz w:val="20"/>
-          <w:szCs w:val="20"/>
-          <w:u w:val="none"/>
-        </w:rPr>
-      </w:pPr>
-      <w:r>
-        <w:rPr>
-          <w:rFonts w:ascii="Times New Roman" w:cs="Times New Roman" w:eastAsia="Times New Roman" w:hAnsi="Times New Roman"/>
-          <w:sz w:val="20"/>
-          <w:szCs w:val="20"/>
-          <w:rtl w:val="0"/>
-        </w:rPr>
-        <w:t xml:space="preserve">Applied quicksort and bubble sort to generate sorted reports.</w:t>
-      </w:r>
-    </w:p>
-    <w:p>
-      <w:pPr>
-        <w:widowControl w:val="0"/>
-        <w:numPr>
-          <w:ilvl w:val="0"/>
-          <w:numId w:val="1"/>
-        </w:numPr>
-        <w:spacing w:before="0" w:beforeAutospacing="0" w:line="240" w:lineRule="auto"/>
-        <w:ind w:left="720" w:right="137.95166015625" w:hanging="360"/>
-        <w:rPr>
-          <w:rFonts w:ascii="Times New Roman" w:cs="Times New Roman" w:eastAsia="Times New Roman" w:hAnsi="Times New Roman"/>
-          <w:sz w:val="20"/>
-          <w:szCs w:val="20"/>
-          <w:u w:val="none"/>
-        </w:rPr>
-      </w:pPr>
-      <w:r>
-        <w:rPr>
-          <w:rFonts w:ascii="Times New Roman" w:cs="Times New Roman" w:eastAsia="Times New Roman" w:hAnsi="Times New Roman"/>
-          <w:sz w:val="20"/>
-          <w:szCs w:val="20"/>
-          <w:rtl w:val="0"/>
-        </w:rPr>
-        <w:t xml:space="preserve">Utilized Singleton and Strategy design patterns for centralized management and flexible sorting logic.</w:t>
-      </w:r>
-    </w:p>
-    <w:p>
-      <w:pPr>
-        <w:widowControl w:val="0"/>
-        <w:spacing w:before="42.3260498046875" w:line="240" w:lineRule="auto"/>
-        <w:ind w:left="0" w:right="137.95166015625" w:firstLine="0"/>
-        <w:rPr>
-          <w:rFonts w:ascii="Times New Roman" w:cs="Times New Roman" w:eastAsia="Times New Roman" w:hAnsi="Times New Roman"/>
-          <w:sz w:val="20"/>
-          <w:szCs w:val="20"/>
-        </w:rPr>
-      </w:pPr>
-      <w:r>
-        <w:rPr>
-          <w:rFonts w:ascii="Times New Roman" w:cs="Times New Roman" w:eastAsia="Times New Roman" w:hAnsi="Times New Roman"/>
-          <w:b w:val="1"/>
-          <w:bCs w:val="1"/>
-          <w:i w:val="1"/>
-          <w:iCs w:val="1"/>
-          <w:sz w:val="20"/>
-          <w:szCs w:val="20"/>
-          <w:rtl w:val="0"/>
-        </w:rPr>
-        <w:t xml:space="preserve">Backlog Manager –</w:t>
-      </w:r>
-      <w:r>
-        <w:rPr>
-          <w:rFonts w:ascii="Times New Roman" w:cs="Times New Roman" w:eastAsia="Times New Roman" w:hAnsi="Times New Roman"/>
-          <w:i w:val="1"/>
-          <w:iCs w:val="1"/>
-          <w:sz w:val="20"/>
-          <w:szCs w:val="20"/>
-          <w:rtl w:val="0"/>
-        </w:rPr>
-        <w:t xml:space="preserve"> Software Fundamentals</w:t>
-      </w:r>
-      <w:r>
-        <w:rPr>
-          <w:rtl w:val="0"/>
-        </w:rPr>
-      </w:r>
-    </w:p>
-    <w:p>
-      <w:pPr>
-        <w:widowControl w:val="0"/>
-        <w:numPr>
-          <w:ilvl w:val="0"/>
-          <w:numId w:val="3"/>
-        </w:numPr>
-        <w:spacing w:after="0" w:afterAutospacing="0" w:before="42.3260498046875" w:line="240" w:lineRule="auto"/>
-        <w:ind w:left="720" w:right="137.95166015625" w:hanging="360"/>
-        <w:rPr>
-          <w:rFonts w:ascii="Times New Roman" w:cs="Times New Roman" w:eastAsia="Times New Roman" w:hAnsi="Times New Roman"/>
-          <w:sz w:val="20"/>
-          <w:szCs w:val="20"/>
-          <w:u w:val="none"/>
-        </w:rPr>
-      </w:pPr>
-      <w:r>
-        <w:rPr>
-          <w:rFonts w:ascii="Times New Roman" w:cs="Times New Roman" w:eastAsia="Times New Roman" w:hAnsi="Times New Roman"/>
-          <w:sz w:val="20"/>
-          <w:szCs w:val="20"/>
-          <w:rtl w:val="0"/>
-        </w:rPr>
-        <w:t xml:space="preserve">Created a Java-based backlog management system to track products with assigned tasks and owners.</w:t>
-      </w:r>
-    </w:p>
-    <w:p>
-      <w:pPr>
-        <w:widowControl w:val="0"/>
-        <w:numPr>
-          <w:ilvl w:val="0"/>
-          <w:numId w:val="3"/>
-        </w:numPr>
-        <w:spacing w:before="0" w:beforeAutospacing="0" w:line="240" w:lineRule="auto"/>
-        <w:ind w:left="720" w:right="137.95166015625" w:hanging="360"/>
-        <w:rPr>
-          <w:rFonts w:ascii="Times New Roman" w:cs="Times New Roman" w:eastAsia="Times New Roman" w:hAnsi="Times New Roman"/>
-          <w:sz w:val="20"/>
-          <w:szCs w:val="20"/>
-          <w:u w:val="none"/>
-        </w:rPr>
-      </w:pPr>
-      <w:r>
-        <w:rPr>
-          <w:rFonts w:ascii="Times New Roman" w:cs="Times New Roman" w:eastAsia="Times New Roman" w:hAnsi="Times New Roman"/>
-          <w:sz w:val="20"/>
-          <w:szCs w:val="20"/>
-          <w:rtl w:val="0"/>
-        </w:rPr>
-        <w:t xml:space="preserve">Implemented exception handling.</w:t>
-      </w:r>
-    </w:p>
-    <w:p>
-      <w:pPr>
-        <w:widowControl w:val="0"/>
-        <w:spacing w:before="42.3260498046875" w:line="240" w:lineRule="auto"/>
-        <w:ind w:right="137.95166015625"/>
-        <w:rPr>
-          <w:rFonts w:ascii="Times New Roman" w:cs="Times New Roman" w:eastAsia="Times New Roman" w:hAnsi="Times New Roman"/>
-          <w:sz w:val="20"/>
-          <w:szCs w:val="20"/>
-        </w:rPr>
-      </w:pPr>
-      <w:r>
-        <w:rPr>
-          <w:rFonts w:ascii="Times New Roman" w:cs="Times New Roman" w:eastAsia="Times New Roman" w:hAnsi="Times New Roman"/>
-          <w:b w:val="1"/>
-          <w:bCs w:val="1"/>
-          <w:i w:val="1"/>
-          <w:iCs w:val="1"/>
-          <w:sz w:val="20"/>
-          <w:szCs w:val="20"/>
-          <w:rtl w:val="0"/>
-        </w:rPr>
-        <w:t xml:space="preserve">Pack Scheduler –</w:t>
-      </w:r>
-      <w:r>
-        <w:rPr>
-          <w:rFonts w:ascii="Times New Roman" w:cs="Times New Roman" w:eastAsia="Times New Roman" w:hAnsi="Times New Roman"/>
-          <w:i w:val="1"/>
-          <w:iCs w:val="1"/>
-          <w:sz w:val="20"/>
-          <w:szCs w:val="20"/>
-          <w:rtl w:val="0"/>
-        </w:rPr>
-        <w:t xml:space="preserve"> Software Fundamentals Lab</w:t>
-      </w:r>
-      <w:r>
-        <w:rPr>
-          <w:rtl w:val="0"/>
-        </w:rPr>
-      </w:r>
-    </w:p>
-    <w:p>
-      <w:pPr>
-        <w:widowControl w:val="0"/>
-        <w:numPr>
-          <w:ilvl w:val="0"/>
-          <w:numId w:val="4"/>
-        </w:numPr>
-        <w:spacing w:after="0" w:afterAutospacing="0" w:before="42.3260498046875" w:line="240" w:lineRule="auto"/>
-        <w:ind w:left="720" w:right="137.95166015625" w:hanging="360"/>
-        <w:rPr>
-          <w:rFonts w:ascii="Times New Roman" w:cs="Times New Roman" w:eastAsia="Times New Roman" w:hAnsi="Times New Roman"/>
-          <w:sz w:val="20"/>
-          <w:szCs w:val="20"/>
-          <w:u w:val="none"/>
-        </w:rPr>
-      </w:pPr>
-      <w:r>
-        <w:rPr>
-          <w:rFonts w:ascii="Times New Roman" w:cs="Times New Roman" w:eastAsia="Times New Roman" w:hAnsi="Times New Roman"/>
-          <w:sz w:val="20"/>
-          <w:szCs w:val="20"/>
-          <w:rtl w:val="0"/>
-        </w:rPr>
-        <w:t xml:space="preserve">Collaborated with a team of programmers to build a Java-based course registration system for students.</w:t>
-      </w:r>
-    </w:p>
-    <w:p>
-      <w:pPr>
-        <w:widowControl w:val="0"/>
-        <w:numPr>
-          <w:ilvl w:val="0"/>
-          <w:numId w:val="4"/>
-        </w:numPr>
-        <w:spacing w:before="0" w:beforeAutospacing="0" w:line="240" w:lineRule="auto"/>
-        <w:ind w:left="720" w:right="137.95166015625" w:hanging="360"/>
-        <w:rPr>
-          <w:rFonts w:ascii="Times New Roman" w:cs="Times New Roman" w:eastAsia="Times New Roman" w:hAnsi="Times New Roman"/>
-          <w:sz w:val="20"/>
-          <w:szCs w:val="20"/>
-          <w:u w:val="none"/>
-        </w:rPr>
-      </w:pPr>
-      <w:r>
-        <w:rPr>
-          <w:rFonts w:ascii="Times New Roman" w:cs="Times New Roman" w:eastAsia="Times New Roman" w:hAnsi="Times New Roman"/>
-          <w:sz w:val="20"/>
-          <w:szCs w:val="20"/>
-          <w:rtl w:val="0"/>
-        </w:rPr>
-        <w:t xml:space="preserve">Developed JUnit tests with the team for integration testing and passed all staff regression testing.</w:t>
-      </w:r>
-    </w:p>
-    <w:p>
-      <w:pPr>
-        <w:spacing w:line="240" w:lineRule="auto"/>
+        <w:spacing w:after="0" w:before="0" w:line="227.99999999999997" w:lineRule="auto"/>
+        <w:ind w:left="720" w:hanging="360"/>
+        <w:rPr>
+          <w:rFonts w:ascii="Times New Roman" w:cs="Times New Roman" w:eastAsia="Times New Roman" w:hAnsi="Times New Roman"/>
+          <w:b w:val="1"/>
+          <w:bCs w:val="1"/>
+          <w:sz w:val="20"/>
+          <w:szCs w:val="20"/>
+        </w:rPr>
+      </w:pPr>
+      <w:r>
+        <w:rPr>
+          <w:rFonts w:ascii="Times New Roman" w:cs="Times New Roman" w:eastAsia="Times New Roman" w:hAnsi="Times New Roman"/>
+          <w:b w:val="1"/>
+          <w:bCs w:val="1"/>
+          <w:sz w:val="20"/>
+          <w:szCs w:val="20"/>
+          <w:rtl w:val="0"/>
+        </w:rPr>
+        <w:t xml:space="preserve">Career Development</w:t>
+      </w:r>
+      <w:r>
+        <w:rPr>
+          <w:rFonts w:ascii="Times New Roman" w:cs="Times New Roman" w:eastAsia="Times New Roman" w:hAnsi="Times New Roman"/>
+          <w:sz w:val="20"/>
+          <w:szCs w:val="20"/>
+          <w:rtl w:val="0"/>
+        </w:rPr>
+        <w:t xml:space="preserve">: Managed organization and tabling logistics for corporate partners during our career fairs to facilitate networking opportunities for members.</w:t>
+      </w:r>
+    </w:p>
+    <w:p>
+      <w:pPr>
+        <w:spacing w:after="0" w:before="0" w:line="227.99999999999997" w:lineRule="auto"/>
         <w:rPr>
           <w:rFonts w:ascii="Times New Roman" w:cs="Times New Roman" w:eastAsia="Times New Roman" w:hAnsi="Times New Roman"/>
           <w:b w:val="1"/>
@@ -1030,23 +930,12 @@
           <w:szCs w:val="24"/>
           <w:rtl w:val="0"/>
         </w:rPr>
-        <w:t xml:space="preserve">PERSONAL </w:t>
-      </w:r>
-      <w:r>
-        <w:rPr>
-          <w:rFonts w:ascii="Times New Roman" w:cs="Times New Roman" w:eastAsia="Times New Roman" w:hAnsi="Times New Roman"/>
-          <w:b w:val="1"/>
-          <w:bCs w:val="1"/>
-          <w:sz w:val="24"/>
-          <w:szCs w:val="24"/>
-          <w:rtl w:val="0"/>
-        </w:rPr>
         <w:t xml:space="preserve">PROJECTS</w:t>
       </w:r>
     </w:p>
     <w:p>
       <w:pPr>
-        <w:spacing w:line="240" w:lineRule="auto"/>
+        <w:spacing w:after="0" w:before="0" w:line="227.99999999999997" w:lineRule="auto"/>
         <w:rPr>
           <w:rFonts w:ascii="Times New Roman" w:cs="Times New Roman" w:eastAsia="Times New Roman" w:hAnsi="Times New Roman"/>
           <w:b w:val="1"/>
@@ -1076,12 +965,12 @@
               <wp:anchor allowOverlap="1" behindDoc="0" distB="0" distT="0" distL="114300" distR="114300" hidden="0" layoutInCell="1" locked="0" relativeHeight="0" simplePos="0">
                 <wp:simplePos x="0" y="0"/>
                 <wp:positionH relativeFrom="column">
-                  <wp:posOffset>-457199</wp:posOffset>
+                  <wp:posOffset>1</wp:posOffset>
                 </wp:positionH>
                 <wp:positionV relativeFrom="paragraph">
                   <wp:posOffset>19050</wp:posOffset>
                 </wp:positionV>
-                <wp:extent cx="6848856" cy="15875"/>
+                <wp:extent cx="6400800" cy="15875"/>
                 <wp:effectExtent b="0" l="0" r="0" t="0"/>
                 <wp:wrapNone/>
                 <wp:docPr id="3" name="image5.png"/>
@@ -1102,7 +991,7 @@
                       <pic:spPr>
                         <a:xfrm>
                           <a:off x="0" y="0"/>
-                          <a:ext cx="6848856" cy="15875"/>
+                          <a:ext cx="6400800" cy="15875"/>
                         </a:xfrm>
                         <a:prstGeom prst="rect"/>
                         <a:ln/>
@@ -1118,12 +1007,12 @@
               <wp:anchor allowOverlap="1" behindDoc="0" distB="0" distT="0" distL="114300" distR="114300" hidden="0" layoutInCell="1" locked="0" relativeHeight="0" simplePos="0">
                 <wp:simplePos x="0" y="0"/>
                 <wp:positionH relativeFrom="column">
-                  <wp:posOffset>-457199</wp:posOffset>
+                  <wp:posOffset>1</wp:posOffset>
                 </wp:positionH>
                 <wp:positionV relativeFrom="paragraph">
                   <wp:posOffset>19050</wp:posOffset>
                 </wp:positionV>
-                <wp:extent cx="6848856" cy="15875"/>
+                <wp:extent cx="6400800" cy="15875"/>
                 <wp:effectExtent b="0" l="0" r="0" t="0"/>
                 <wp:wrapNone/>
                 <wp:docPr id="3" name="image6.png"/>
@@ -1144,7 +1033,7 @@
                       <pic:spPr>
                         <a:xfrm>
                           <a:off x="0" y="0"/>
-                          <a:ext cx="6848856" cy="15875"/>
+                          <a:ext cx="6400800" cy="15875"/>
                         </a:xfrm>
                         <a:prstGeom prst="rect"/>
                         <a:ln/>
@@ -1161,17 +1050,8 @@
     <w:p>
       <w:pPr>
         <w:widowControl w:val="0"/>
-        <w:spacing w:before="120" w:line="240" w:lineRule="auto"/>
+        <w:spacing w:after="0" w:before="0" w:line="227.99999999999997" w:lineRule="auto"/>
         <w:ind w:right="300"/>
-        <w:rPr>
-          <w:rFonts w:ascii="Times New Roman" w:cs="Times New Roman" w:eastAsia="Times New Roman" w:hAnsi="Times New Roman"/>
-          <w:b w:val="1"/>
-          <w:bCs w:val="1"/>
-          <w:sz w:val="20"/>
-          <w:szCs w:val="20"/>
-        </w:rPr>
-      </w:pPr>
-      <w:r>
         <w:rPr>
           <w:rFonts w:ascii="Times New Roman" w:cs="Times New Roman" w:eastAsia="Times New Roman" w:hAnsi="Times New Roman"/>
           <w:b w:val="1"/>
@@ -1180,40 +1060,194 @@
           <w:iCs w:val="1"/>
           <w:sz w:val="20"/>
           <w:szCs w:val="20"/>
-          <w:rtl w:val="0"/>
-        </w:rPr>
-        <w:t xml:space="preserve">CageIntel – </w:t>
-      </w:r>
-      <w:r>
-        <w:rPr>
-          <w:rFonts w:ascii="Times New Roman" w:cs="Times New Roman" w:eastAsia="Times New Roman" w:hAnsi="Times New Roman"/>
-          <w:sz w:val="20"/>
-          <w:szCs w:val="20"/>
-          <w:rtl w:val="0"/>
-        </w:rPr>
-        <w:t xml:space="preserve">AI-powered UFC analytics application</w:t>
-        <w:tab/>
-      </w:r>
-      <w:r>
-        <w:rPr>
-          <w:rFonts w:ascii="Times New Roman" w:cs="Times New Roman" w:eastAsia="Times New Roman" w:hAnsi="Times New Roman"/>
+        </w:rPr>
+      </w:pPr>
+      <w:r>
+        <w:rPr>
+          <w:rFonts w:ascii="Times New Roman" w:cs="Times New Roman" w:eastAsia="Times New Roman" w:hAnsi="Times New Roman"/>
+          <w:b w:val="1"/>
+          <w:bCs w:val="1"/>
           <w:i w:val="1"/>
           <w:iCs w:val="1"/>
           <w:sz w:val="20"/>
           <w:szCs w:val="20"/>
           <w:rtl w:val="0"/>
         </w:rPr>
-        <w:tab/>
-        <w:tab/>
-        <w:tab/>
-        <w:tab/>
-        <w:tab/>
-      </w:r>
-      <w:r>
-        <w:rPr>
-          <w:rFonts w:ascii="Times New Roman" w:cs="Times New Roman" w:eastAsia="Times New Roman" w:hAnsi="Times New Roman"/>
-          <w:b w:val="1"/>
-          <w:bCs w:val="1"/>
+        <w:t xml:space="preserve">Neural-Logic AAC</w:t>
+      </w:r>
+      <w:r>
+        <w:rPr>
+          <w:rFonts w:ascii="Times New Roman" w:cs="Times New Roman" w:eastAsia="Times New Roman" w:hAnsi="Times New Roman"/>
+          <w:b w:val="1"/>
+          <w:bCs w:val="1"/>
+          <w:sz w:val="20"/>
+          <w:szCs w:val="20"/>
+          <w:rtl w:val="0"/>
+        </w:rPr>
+        <w:t xml:space="preserve"> – </w:t>
+      </w:r>
+      <w:r>
+        <w:rPr>
+          <w:rFonts w:ascii="Times New Roman" w:cs="Times New Roman" w:eastAsia="Times New Roman" w:hAnsi="Times New Roman"/>
+          <w:sz w:val="20"/>
+          <w:szCs w:val="20"/>
+          <w:rtl w:val="0"/>
+        </w:rPr>
+        <w:t xml:space="preserve">Real-time EEG signal processing &amp; AI-powered assistive technology</w:t>
+        <w:tab/>
+        <w:t xml:space="preserve">           </w:t>
+      </w:r>
+      <w:r>
+        <w:rPr>
+          <w:rFonts w:ascii="Times New Roman" w:cs="Times New Roman" w:eastAsia="Times New Roman" w:hAnsi="Times New Roman"/>
+          <w:b w:val="1"/>
+          <w:bCs w:val="1"/>
+          <w:i w:val="1"/>
+          <w:iCs w:val="1"/>
+          <w:sz w:val="20"/>
+          <w:szCs w:val="20"/>
+          <w:rtl w:val="0"/>
+        </w:rPr>
+        <w:t xml:space="preserve">2025-Present</w:t>
+      </w:r>
+    </w:p>
+    <w:p>
+      <w:pPr>
+        <w:widowControl w:val="0"/>
+        <w:numPr>
+          <w:ilvl w:val="0"/>
+          <w:numId w:val="5"/>
+        </w:numPr>
+        <w:spacing w:after="0" w:before="0" w:line="227.99999999999997" w:lineRule="auto"/>
+        <w:ind w:left="720" w:right="300" w:hanging="360"/>
+        <w:rPr>
+          <w:rFonts w:ascii="Times New Roman" w:cs="Times New Roman" w:eastAsia="Times New Roman" w:hAnsi="Times New Roman"/>
+          <w:sz w:val="20"/>
+          <w:szCs w:val="20"/>
+          <w:u w:val="none"/>
+        </w:rPr>
+      </w:pPr>
+      <w:r>
+        <w:rPr>
+          <w:rFonts w:ascii="Times New Roman" w:cs="Times New Roman" w:eastAsia="Times New Roman" w:hAnsi="Times New Roman"/>
+          <w:sz w:val="20"/>
+          <w:szCs w:val="20"/>
+          <w:rtl w:val="0"/>
+        </w:rPr>
+        <w:t xml:space="preserve">Architected an end-to-end signal processing pipeline to filter raw EEG data and map neural patterns to physical and digital actions, such as mind-controlled gaming and assistive communication.</w:t>
+      </w:r>
+    </w:p>
+    <w:p>
+      <w:pPr>
+        <w:widowControl w:val="0"/>
+        <w:numPr>
+          <w:ilvl w:val="0"/>
+          <w:numId w:val="5"/>
+        </w:numPr>
+        <w:spacing w:after="0" w:before="0" w:line="227.99999999999997" w:lineRule="auto"/>
+        <w:ind w:left="720" w:right="300" w:hanging="360"/>
+        <w:rPr>
+          <w:rFonts w:ascii="Times New Roman" w:cs="Times New Roman" w:eastAsia="Times New Roman" w:hAnsi="Times New Roman"/>
+          <w:sz w:val="20"/>
+          <w:szCs w:val="20"/>
+          <w:u w:val="none"/>
+        </w:rPr>
+      </w:pPr>
+      <w:r>
+        <w:rPr>
+          <w:rFonts w:ascii="Times New Roman" w:cs="Times New Roman" w:eastAsia="Times New Roman" w:hAnsi="Times New Roman"/>
+          <w:sz w:val="20"/>
+          <w:szCs w:val="20"/>
+          <w:rtl w:val="0"/>
+        </w:rPr>
+        <w:t xml:space="preserve">Engineering a communication interface designed for children with motor impairments, prioritizing low-latency signal-to-text translation.</w:t>
+      </w:r>
+    </w:p>
+    <w:p>
+      <w:pPr>
+        <w:widowControl w:val="0"/>
+        <w:spacing w:after="0" w:before="0" w:line="227.99999999999997" w:lineRule="auto"/>
+        <w:ind w:right="300"/>
+        <w:rPr>
+          <w:rFonts w:ascii="Times New Roman" w:cs="Times New Roman" w:eastAsia="Times New Roman" w:hAnsi="Times New Roman"/>
+          <w:b w:val="1"/>
+          <w:bCs w:val="1"/>
+          <w:i w:val="1"/>
+          <w:iCs w:val="1"/>
+          <w:sz w:val="20"/>
+          <w:szCs w:val="20"/>
+        </w:rPr>
+      </w:pPr>
+      <w:r>
+        <w:rPr>
+          <w:rFonts w:ascii="Times New Roman" w:cs="Times New Roman" w:eastAsia="Times New Roman" w:hAnsi="Times New Roman"/>
+          <w:b w:val="1"/>
+          <w:bCs w:val="1"/>
+          <w:i w:val="1"/>
+          <w:iCs w:val="1"/>
+          <w:sz w:val="20"/>
+          <w:szCs w:val="20"/>
+          <w:rtl w:val="0"/>
+        </w:rPr>
+        <w:t xml:space="preserve">CageIntel </w:t>
+      </w:r>
+      <w:r>
+        <w:rPr>
+          <w:rFonts w:ascii="Times New Roman" w:cs="Times New Roman" w:eastAsia="Times New Roman" w:hAnsi="Times New Roman"/>
+          <w:b w:val="1"/>
+          <w:bCs w:val="1"/>
+          <w:sz w:val="20"/>
+          <w:szCs w:val="20"/>
+          <w:rtl w:val="0"/>
+        </w:rPr>
+        <w:t xml:space="preserve">–</w:t>
+      </w:r>
+      <w:r>
+        <w:rPr>
+          <w:rFonts w:ascii="Times New Roman" w:cs="Times New Roman" w:eastAsia="Times New Roman" w:hAnsi="Times New Roman"/>
+          <w:b w:val="1"/>
+          <w:bCs w:val="1"/>
+          <w:i w:val="1"/>
+          <w:iCs w:val="1"/>
+          <w:sz w:val="20"/>
+          <w:szCs w:val="20"/>
+          <w:rtl w:val="0"/>
+        </w:rPr>
+        <w:t xml:space="preserve"> </w:t>
+      </w:r>
+      <w:r>
+        <w:rPr>
+          <w:rFonts w:ascii="Times New Roman" w:cs="Times New Roman" w:eastAsia="Times New Roman" w:hAnsi="Times New Roman"/>
+          <w:sz w:val="20"/>
+          <w:szCs w:val="20"/>
+          <w:rtl w:val="0"/>
+        </w:rPr>
+        <w:t xml:space="preserve">AI-powered UFC analytics application</w:t>
+        <w:tab/>
+      </w:r>
+      <w:r>
+        <w:rPr>
+          <w:rFonts w:ascii="Times New Roman" w:cs="Times New Roman" w:eastAsia="Times New Roman" w:hAnsi="Times New Roman"/>
+          <w:i w:val="1"/>
+          <w:iCs w:val="1"/>
+          <w:sz w:val="20"/>
+          <w:szCs w:val="20"/>
+          <w:rtl w:val="0"/>
+        </w:rPr>
+        <w:tab/>
+        <w:tab/>
+        <w:tab/>
+        <w:tab/>
+        <w:tab/>
+        <w:t xml:space="preserve">           </w:t>
+      </w:r>
+      <w:r>
+        <w:rPr>
+          <w:rFonts w:ascii="Times New Roman" w:cs="Times New Roman" w:eastAsia="Times New Roman" w:hAnsi="Times New Roman"/>
+          <w:b w:val="1"/>
+          <w:bCs w:val="1"/>
+          <w:i w:val="1"/>
+          <w:iCs w:val="1"/>
           <w:sz w:val="20"/>
           <w:szCs w:val="20"/>
           <w:rtl w:val="0"/>
@@ -1228,7 +1262,7 @@
           <w:ilvl w:val="0"/>
           <w:numId w:val="2"/>
         </w:numPr>
-        <w:spacing w:after="0" w:afterAutospacing="0" w:before="42.3260498046875" w:line="240" w:lineRule="auto"/>
+        <w:spacing w:after="0" w:before="0" w:line="227.99999999999997" w:lineRule="auto"/>
         <w:ind w:left="720" w:right="137.95166015625" w:hanging="360"/>
         <w:rPr>
           <w:rFonts w:ascii="Times New Roman" w:cs="Times New Roman" w:eastAsia="Times New Roman" w:hAnsi="Times New Roman"/>
@@ -1253,7 +1287,7 @@
           <w:ilvl w:val="0"/>
           <w:numId w:val="2"/>
         </w:numPr>
-        <w:spacing w:after="0" w:afterAutospacing="0" w:before="0" w:beforeAutospacing="0" w:line="240" w:lineRule="auto"/>
+        <w:spacing w:after="0" w:before="0" w:line="227.99999999999997" w:lineRule="auto"/>
         <w:ind w:left="720" w:right="137.95166015625" w:hanging="360"/>
         <w:rPr>
           <w:rFonts w:ascii="Times New Roman" w:cs="Times New Roman" w:eastAsia="Times New Roman" w:hAnsi="Times New Roman"/>
@@ -1278,7 +1312,7 @@
           <w:ilvl w:val="0"/>
           <w:numId w:val="2"/>
         </w:numPr>
-        <w:spacing w:before="0" w:beforeAutospacing="0" w:line="240" w:lineRule="auto"/>
+        <w:spacing w:after="0" w:before="0" w:line="227.99999999999997" w:lineRule="auto"/>
         <w:ind w:left="720" w:right="137.95166015625" w:hanging="360"/>
         <w:rPr>
           <w:rFonts w:ascii="Times New Roman" w:cs="Times New Roman" w:eastAsia="Times New Roman" w:hAnsi="Times New Roman"/>
@@ -1300,17 +1334,8 @@
     <w:p>
       <w:pPr>
         <w:widowControl w:val="0"/>
-        <w:spacing w:before="120" w:line="240" w:lineRule="auto"/>
-        <w:ind w:right="300"/>
-        <w:rPr>
-          <w:rFonts w:ascii="Times New Roman" w:cs="Times New Roman" w:eastAsia="Times New Roman" w:hAnsi="Times New Roman"/>
-          <w:b w:val="1"/>
-          <w:bCs w:val="1"/>
-          <w:sz w:val="20"/>
-          <w:szCs w:val="20"/>
-        </w:rPr>
-      </w:pPr>
-      <w:r>
+        <w:spacing w:after="0" w:before="0" w:line="227.99999999999997" w:lineRule="auto"/>
+        <w:ind w:left="0" w:right="137.95166015625" w:firstLine="0"/>
         <w:rPr>
           <w:rFonts w:ascii="Times New Roman" w:cs="Times New Roman" w:eastAsia="Times New Roman" w:hAnsi="Times New Roman"/>
           <w:b w:val="1"/>
@@ -1319,38 +1344,203 @@
           <w:iCs w:val="1"/>
           <w:sz w:val="20"/>
           <w:szCs w:val="20"/>
-          <w:rtl w:val="0"/>
-        </w:rPr>
-        <w:t xml:space="preserve">Password Manager – </w:t>
-      </w:r>
-      <w:r>
-        <w:rPr>
-          <w:rFonts w:ascii="Times New Roman" w:cs="Times New Roman" w:eastAsia="Times New Roman" w:hAnsi="Times New Roman"/>
-          <w:sz w:val="20"/>
-          <w:szCs w:val="20"/>
-          <w:rtl w:val="0"/>
-        </w:rPr>
-        <w:t xml:space="preserve">Python-based password storage application</w:t>
-      </w:r>
-      <w:r>
-        <w:rPr>
-          <w:rFonts w:ascii="Times New Roman" w:cs="Times New Roman" w:eastAsia="Times New Roman" w:hAnsi="Times New Roman"/>
+        </w:rPr>
+      </w:pPr>
+      <w:r>
+        <w:rPr>
+          <w:rFonts w:ascii="Times New Roman" w:cs="Times New Roman" w:eastAsia="Times New Roman" w:hAnsi="Times New Roman"/>
+          <w:b w:val="1"/>
+          <w:bCs w:val="1"/>
           <w:i w:val="1"/>
           <w:iCs w:val="1"/>
           <w:sz w:val="20"/>
           <w:szCs w:val="20"/>
           <w:rtl w:val="0"/>
         </w:rPr>
-        <w:tab/>
-        <w:tab/>
-        <w:tab/>
-        <w:tab/>
-      </w:r>
-      <w:r>
-        <w:rPr>
-          <w:rFonts w:ascii="Times New Roman" w:cs="Times New Roman" w:eastAsia="Times New Roman" w:hAnsi="Times New Roman"/>
-          <w:b w:val="1"/>
-          <w:bCs w:val="1"/>
+        <w:t xml:space="preserve">Compressed File Archiver (Snark)</w:t>
+      </w:r>
+      <w:r>
+        <w:rPr>
+          <w:rFonts w:ascii="Times New Roman" w:cs="Times New Roman" w:eastAsia="Times New Roman" w:hAnsi="Times New Roman"/>
+          <w:sz w:val="20"/>
+          <w:szCs w:val="20"/>
+          <w:rtl w:val="0"/>
+        </w:rPr>
+        <w:t xml:space="preserve"> – C &amp; Software Tools Project</w:t>
+        <w:tab/>
+        <w:tab/>
+        <w:tab/>
+        <w:tab/>
+        <w:t xml:space="preserve">           </w:t>
+      </w:r>
+      <w:r>
+        <w:rPr>
+          <w:rFonts w:ascii="Times New Roman" w:cs="Times New Roman" w:eastAsia="Times New Roman" w:hAnsi="Times New Roman"/>
+          <w:b w:val="1"/>
+          <w:bCs w:val="1"/>
+          <w:i w:val="1"/>
+          <w:iCs w:val="1"/>
+          <w:sz w:val="20"/>
+          <w:szCs w:val="20"/>
+          <w:rtl w:val="0"/>
+        </w:rPr>
+        <w:t xml:space="preserve">2025-2025</w:t>
+      </w:r>
+    </w:p>
+    <w:p>
+      <w:pPr>
+        <w:widowControl w:val="0"/>
+        <w:numPr>
+          <w:ilvl w:val="0"/>
+          <w:numId w:val="4"/>
+        </w:numPr>
+        <w:spacing w:after="0" w:before="0" w:line="227.99999999999997" w:lineRule="auto"/>
+        <w:ind w:left="720" w:right="137.95166015625" w:hanging="360"/>
+        <w:rPr>
+          <w:rFonts w:ascii="Times New Roman" w:cs="Times New Roman" w:eastAsia="Times New Roman" w:hAnsi="Times New Roman"/>
+          <w:sz w:val="20"/>
+          <w:szCs w:val="20"/>
+        </w:rPr>
+      </w:pPr>
+      <w:r>
+        <w:rPr>
+          <w:rFonts w:ascii="Times New Roman" w:cs="Times New Roman" w:eastAsia="Times New Roman" w:hAnsi="Times New Roman"/>
+          <w:sz w:val="20"/>
+          <w:szCs w:val="20"/>
+          <w:rtl w:val="0"/>
+        </w:rPr>
+        <w:t xml:space="preserve">Developed a C-based command-line program to create and extract files from a custom-format compressed archive, similar to </w:t>
+      </w:r>
+      <w:r>
+        <w:rPr>
+          <w:rFonts w:ascii="Times New Roman" w:cs="Times New Roman" w:eastAsia="Times New Roman" w:hAnsi="Times New Roman"/>
+          <w:b w:val="1"/>
+          <w:bCs w:val="1"/>
+          <w:sz w:val="20"/>
+          <w:szCs w:val="20"/>
+          <w:rtl w:val="0"/>
+        </w:rPr>
+        <w:t xml:space="preserve">tar</w:t>
+      </w:r>
+      <w:r>
+        <w:rPr>
+          <w:rFonts w:ascii="Times New Roman" w:cs="Times New Roman" w:eastAsia="Times New Roman" w:hAnsi="Times New Roman"/>
+          <w:sz w:val="20"/>
+          <w:szCs w:val="20"/>
+          <w:rtl w:val="0"/>
+        </w:rPr>
+        <w:t xml:space="preserve"> or </w:t>
+      </w:r>
+      <w:r>
+        <w:rPr>
+          <w:rFonts w:ascii="Times New Roman" w:cs="Times New Roman" w:eastAsia="Times New Roman" w:hAnsi="Times New Roman"/>
+          <w:b w:val="1"/>
+          <w:bCs w:val="1"/>
+          <w:sz w:val="20"/>
+          <w:szCs w:val="20"/>
+          <w:rtl w:val="0"/>
+        </w:rPr>
+        <w:t xml:space="preserve">zip</w:t>
+      </w:r>
+      <w:r>
+        <w:rPr>
+          <w:rFonts w:ascii="Times New Roman" w:cs="Times New Roman" w:eastAsia="Times New Roman" w:hAnsi="Times New Roman"/>
+          <w:sz w:val="20"/>
+          <w:szCs w:val="20"/>
+          <w:rtl w:val="0"/>
+        </w:rPr>
+        <w:t xml:space="preserve">. </w:t>
+      </w:r>
+    </w:p>
+    <w:p>
+      <w:pPr>
+        <w:widowControl w:val="0"/>
+        <w:numPr>
+          <w:ilvl w:val="0"/>
+          <w:numId w:val="4"/>
+        </w:numPr>
+        <w:spacing w:after="0" w:before="0" w:line="227.99999999999997" w:lineRule="auto"/>
+        <w:ind w:left="720" w:right="137.95166015625" w:hanging="360"/>
+        <w:rPr>
+          <w:rFonts w:ascii="Times New Roman" w:cs="Times New Roman" w:eastAsia="Times New Roman" w:hAnsi="Times New Roman"/>
+          <w:sz w:val="20"/>
+          <w:szCs w:val="20"/>
+        </w:rPr>
+      </w:pPr>
+      <w:r>
+        <w:rPr>
+          <w:rFonts w:ascii="Times New Roman" w:cs="Times New Roman" w:eastAsia="Times New Roman" w:hAnsi="Times New Roman"/>
+          <w:sz w:val="20"/>
+          <w:szCs w:val="20"/>
+          <w:rtl w:val="0"/>
+        </w:rPr>
+        <w:t xml:space="preserve">Implemented file compression logic to reduce archive size and managed all file I/O operations.</w:t>
+      </w:r>
+      <w:r>
+        <w:rPr>
+          <w:rtl w:val="0"/>
+        </w:rPr>
+      </w:r>
+    </w:p>
+    <w:p>
+      <w:pPr>
+        <w:widowControl w:val="0"/>
+        <w:spacing w:after="0" w:before="0" w:line="227.99999999999997" w:lineRule="auto"/>
+        <w:ind w:right="300"/>
+        <w:rPr>
+          <w:rFonts w:ascii="Times New Roman" w:cs="Times New Roman" w:eastAsia="Times New Roman" w:hAnsi="Times New Roman"/>
+          <w:b w:val="1"/>
+          <w:bCs w:val="1"/>
+          <w:i w:val="1"/>
+          <w:iCs w:val="1"/>
+          <w:sz w:val="20"/>
+          <w:szCs w:val="20"/>
+        </w:rPr>
+      </w:pPr>
+      <w:r>
+        <w:rPr>
+          <w:rFonts w:ascii="Times New Roman" w:cs="Times New Roman" w:eastAsia="Times New Roman" w:hAnsi="Times New Roman"/>
+          <w:b w:val="1"/>
+          <w:bCs w:val="1"/>
+          <w:i w:val="1"/>
+          <w:iCs w:val="1"/>
+          <w:sz w:val="20"/>
+          <w:szCs w:val="20"/>
+          <w:rtl w:val="0"/>
+        </w:rPr>
+        <w:t xml:space="preserve">Password Manager – </w:t>
+      </w:r>
+      <w:r>
+        <w:rPr>
+          <w:rFonts w:ascii="Times New Roman" w:cs="Times New Roman" w:eastAsia="Times New Roman" w:hAnsi="Times New Roman"/>
+          <w:sz w:val="20"/>
+          <w:szCs w:val="20"/>
+          <w:rtl w:val="0"/>
+        </w:rPr>
+        <w:t xml:space="preserve">Python-based password storage application</w:t>
+      </w:r>
+      <w:r>
+        <w:rPr>
+          <w:rFonts w:ascii="Times New Roman" w:cs="Times New Roman" w:eastAsia="Times New Roman" w:hAnsi="Times New Roman"/>
+          <w:i w:val="1"/>
+          <w:iCs w:val="1"/>
+          <w:sz w:val="20"/>
+          <w:szCs w:val="20"/>
+          <w:rtl w:val="0"/>
+        </w:rPr>
+        <w:tab/>
+        <w:tab/>
+        <w:tab/>
+        <w:tab/>
+        <w:t xml:space="preserve">           </w:t>
+      </w:r>
+      <w:r>
+        <w:rPr>
+          <w:rFonts w:ascii="Times New Roman" w:cs="Times New Roman" w:eastAsia="Times New Roman" w:hAnsi="Times New Roman"/>
+          <w:b w:val="1"/>
+          <w:bCs w:val="1"/>
+          <w:i w:val="1"/>
+          <w:iCs w:val="1"/>
           <w:sz w:val="20"/>
           <w:szCs w:val="20"/>
           <w:rtl w:val="0"/>
@@ -1365,7 +1555,7 @@
           <w:ilvl w:val="0"/>
           <w:numId w:val="2"/>
         </w:numPr>
-        <w:spacing w:after="0" w:afterAutospacing="0" w:before="42.3260498046875" w:line="240" w:lineRule="auto"/>
+        <w:spacing w:after="0" w:before="0" w:line="227.99999999999997" w:lineRule="auto"/>
         <w:ind w:left="720" w:right="137.95166015625" w:hanging="360"/>
         <w:rPr>
           <w:rFonts w:ascii="Times New Roman" w:cs="Times New Roman" w:eastAsia="Times New Roman" w:hAnsi="Times New Roman"/>
@@ -1390,7 +1580,7 @@
           <w:ilvl w:val="0"/>
           <w:numId w:val="2"/>
         </w:numPr>
-        <w:spacing w:after="0" w:afterAutospacing="0" w:before="0" w:beforeAutospacing="0" w:line="240" w:lineRule="auto"/>
+        <w:spacing w:after="0" w:before="0" w:line="227.99999999999997" w:lineRule="auto"/>
         <w:ind w:left="720" w:right="137.95166015625" w:hanging="360"/>
         <w:rPr>
           <w:rFonts w:ascii="Times New Roman" w:cs="Times New Roman" w:eastAsia="Times New Roman" w:hAnsi="Times New Roman"/>
@@ -1415,7 +1605,7 @@
           <w:ilvl w:val="0"/>
           <w:numId w:val="2"/>
         </w:numPr>
-        <w:spacing w:before="0" w:beforeAutospacing="0" w:line="240" w:lineRule="auto"/>
+        <w:spacing w:after="0" w:before="0" w:line="227.99999999999997" w:lineRule="auto"/>
         <w:ind w:left="720" w:right="137.95166015625" w:hanging="360"/>
         <w:rPr>
           <w:rFonts w:ascii="Times New Roman" w:cs="Times New Roman" w:eastAsia="Times New Roman" w:hAnsi="Times New Roman"/>
@@ -1436,168 +1626,6 @@
         <w:rPr>
           <w:rtl w:val="0"/>
         </w:rPr>
-      </w:r>
-    </w:p>
-    <w:p>
-      <w:pPr>
-        <w:widowControl w:val="0"/>
-        <w:spacing w:before="120" w:line="240" w:lineRule="auto"/>
-        <w:ind w:right="300"/>
-        <w:rPr>
-          <w:rFonts w:ascii="Times New Roman" w:cs="Times New Roman" w:eastAsia="Times New Roman" w:hAnsi="Times New Roman"/>
-          <w:b w:val="1"/>
-          <w:bCs w:val="1"/>
-          <w:sz w:val="20"/>
-          <w:szCs w:val="20"/>
-        </w:rPr>
-      </w:pPr>
-      <w:r>
-        <w:rPr>
-          <w:rFonts w:ascii="Times New Roman" w:cs="Times New Roman" w:eastAsia="Times New Roman" w:hAnsi="Times New Roman"/>
-          <w:b w:val="1"/>
-          <w:bCs w:val="1"/>
-          <w:i w:val="1"/>
-          <w:iCs w:val="1"/>
-          <w:sz w:val="20"/>
-          <w:szCs w:val="20"/>
-          <w:rtl w:val="0"/>
-        </w:rPr>
-        <w:t xml:space="preserve">Space Invaders –</w:t>
-      </w:r>
-      <w:r>
-        <w:rPr>
-          <w:rFonts w:ascii="Times New Roman" w:cs="Times New Roman" w:eastAsia="Times New Roman" w:hAnsi="Times New Roman"/>
-          <w:b w:val="1"/>
-          <w:bCs w:val="1"/>
-          <w:sz w:val="20"/>
-          <w:szCs w:val="20"/>
-          <w:rtl w:val="0"/>
-        </w:rPr>
-        <w:t xml:space="preserve"> </w:t>
-      </w:r>
-      <w:r>
-        <w:rPr>
-          <w:rFonts w:ascii="Times New Roman" w:cs="Times New Roman" w:eastAsia="Times New Roman" w:hAnsi="Times New Roman"/>
-          <w:sz w:val="20"/>
-          <w:szCs w:val="20"/>
-          <w:rtl w:val="0"/>
-        </w:rPr>
-        <w:t xml:space="preserve">Pygame 64-bit top-down scroller game</w:t>
-      </w:r>
-      <w:r>
-        <w:rPr>
-          <w:rFonts w:ascii="Times New Roman" w:cs="Times New Roman" w:eastAsia="Times New Roman" w:hAnsi="Times New Roman"/>
-          <w:i w:val="1"/>
-          <w:iCs w:val="1"/>
-          <w:sz w:val="20"/>
-          <w:szCs w:val="20"/>
-          <w:rtl w:val="0"/>
-        </w:rPr>
-        <w:tab/>
-        <w:tab/>
-        <w:tab/>
-        <w:tab/>
-        <w:tab/>
-      </w:r>
-      <w:r>
-        <w:rPr>
-          <w:rFonts w:ascii="Times New Roman" w:cs="Times New Roman" w:eastAsia="Times New Roman" w:hAnsi="Times New Roman"/>
-          <w:b w:val="1"/>
-          <w:bCs w:val="1"/>
-          <w:sz w:val="20"/>
-          <w:szCs w:val="20"/>
-          <w:rtl w:val="0"/>
-        </w:rPr>
-        <w:t xml:space="preserve">2021-</w:t>
-      </w:r>
-      <w:r>
-        <w:rPr>
-          <w:rFonts w:ascii="Times New Roman" w:cs="Times New Roman" w:eastAsia="Times New Roman" w:hAnsi="Times New Roman"/>
-          <w:b w:val="1"/>
-          <w:bCs w:val="1"/>
-          <w:sz w:val="20"/>
-          <w:szCs w:val="20"/>
-          <w:rtl w:val="0"/>
-        </w:rPr>
-        <w:t xml:space="preserve">2022</w:t>
-      </w:r>
-    </w:p>
-    <w:p>
-      <w:pPr>
-        <w:widowControl w:val="0"/>
-        <w:numPr>
-          <w:ilvl w:val="0"/>
-          <w:numId w:val="2"/>
-        </w:numPr>
-        <w:spacing w:after="0" w:afterAutospacing="0" w:before="42.3260498046875" w:line="240" w:lineRule="auto"/>
-        <w:ind w:left="720" w:right="137.95166015625" w:hanging="360"/>
-        <w:rPr>
-          <w:rFonts w:ascii="Times New Roman" w:cs="Times New Roman" w:eastAsia="Times New Roman" w:hAnsi="Times New Roman"/>
-          <w:sz w:val="20"/>
-          <w:szCs w:val="20"/>
-          <w:u w:val="none"/>
-        </w:rPr>
-      </w:pPr>
-      <w:r>
-        <w:rPr>
-          <w:rFonts w:ascii="Times New Roman" w:cs="Times New Roman" w:eastAsia="Times New Roman" w:hAnsi="Times New Roman"/>
-          <w:sz w:val="20"/>
-          <w:szCs w:val="20"/>
-          <w:rtl w:val="0"/>
-        </w:rPr>
-        <w:t xml:space="preserve">Developed a 32-bit game in Python using the Pygame library, reminiscent of Space Invaders.</w:t>
-      </w:r>
-    </w:p>
-    <w:p>
-      <w:pPr>
-        <w:widowControl w:val="0"/>
-        <w:numPr>
-          <w:ilvl w:val="0"/>
-          <w:numId w:val="2"/>
-        </w:numPr>
-        <w:spacing w:after="0" w:afterAutospacing="0" w:before="0" w:beforeAutospacing="0" w:line="240" w:lineRule="auto"/>
-        <w:ind w:left="720" w:right="137.95166015625" w:hanging="360"/>
-        <w:rPr>
-          <w:rFonts w:ascii="Times New Roman" w:cs="Times New Roman" w:eastAsia="Times New Roman" w:hAnsi="Times New Roman"/>
-          <w:sz w:val="20"/>
-          <w:szCs w:val="20"/>
-          <w:u w:val="none"/>
-        </w:rPr>
-      </w:pPr>
-      <w:r>
-        <w:rPr>
-          <w:rFonts w:ascii="Times New Roman" w:cs="Times New Roman" w:eastAsia="Times New Roman" w:hAnsi="Times New Roman"/>
-          <w:sz w:val="20"/>
-          <w:szCs w:val="20"/>
-          <w:rtl w:val="0"/>
-        </w:rPr>
-        <w:t xml:space="preserve">Implemented core game mechanics including levels/increasing difficulty, a point system, and an object-oriented death system.</w:t>
-      </w:r>
-    </w:p>
-    <w:p>
-      <w:pPr>
-        <w:widowControl w:val="0"/>
-        <w:numPr>
-          <w:ilvl w:val="0"/>
-          <w:numId w:val="2"/>
-        </w:numPr>
-        <w:spacing w:before="0" w:beforeAutospacing="0" w:line="240" w:lineRule="auto"/>
-        <w:ind w:left="720" w:right="137.95166015625" w:hanging="360"/>
-        <w:rPr>
-          <w:rFonts w:ascii="Times New Roman" w:cs="Times New Roman" w:eastAsia="Times New Roman" w:hAnsi="Times New Roman"/>
-          <w:sz w:val="20"/>
-          <w:szCs w:val="20"/>
-          <w:u w:val="none"/>
-        </w:rPr>
-      </w:pPr>
-      <w:r>
-        <w:rPr>
-          <w:rFonts w:ascii="Times New Roman" w:cs="Times New Roman" w:eastAsia="Times New Roman" w:hAnsi="Times New Roman"/>
-          <w:sz w:val="20"/>
-          <w:szCs w:val="20"/>
-          <w:rtl w:val="0"/>
-        </w:rPr>
-        <w:t xml:space="preserve">Enabled game stats from previous sessions to be saved to a document and accessed at launch.</w:t>
       </w:r>
     </w:p>
     <w:p>
@@ -1606,7 +1634,7 @@
           <w:tab w:val="center" w:leader="none" w:pos="4680"/>
           <w:tab w:val="right" w:leader="none" w:pos="9360"/>
         </w:tabs>
-        <w:spacing w:line="240" w:lineRule="auto"/>
+        <w:spacing w:after="0" w:before="0" w:line="227.99999999999997" w:lineRule="auto"/>
         <w:rPr>
           <w:rFonts w:ascii="Times New Roman" w:cs="Times New Roman" w:eastAsia="Times New Roman" w:hAnsi="Times New Roman"/>
           <w:b w:val="1"/>
@@ -1630,7 +1658,7 @@
     <w:p>
       <w:pPr>
         <w:widowControl w:val="0"/>
-        <w:spacing w:before="42.3260498046875" w:line="242.2939682006836" w:lineRule="auto"/>
+        <w:spacing w:after="0" w:before="0" w:line="227.99999999999997" w:lineRule="auto"/>
         <w:ind w:right="137.95166015625"/>
         <w:rPr>
           <w:rFonts w:ascii="Times New Roman" w:cs="Times New Roman" w:eastAsia="Times New Roman" w:hAnsi="Times New Roman"/>
@@ -1665,20 +1693,20 @@
               <wp:anchor allowOverlap="1" behindDoc="0" distB="0" distT="0" distL="114300" distR="114300" hidden="0" layoutInCell="1" locked="0" relativeHeight="0" simplePos="0">
                 <wp:simplePos x="0" y="0"/>
                 <wp:positionH relativeFrom="column">
-                  <wp:posOffset>-447674</wp:posOffset>
+                  <wp:posOffset>1</wp:posOffset>
                 </wp:positionH>
                 <wp:positionV relativeFrom="paragraph">
-                  <wp:posOffset>19050</wp:posOffset>
+                  <wp:posOffset>18101</wp:posOffset>
                 </wp:positionV>
-                <wp:extent cx="6849836" cy="15875"/>
+                <wp:extent cx="6400800" cy="15875"/>
                 <wp:effectExtent b="0" l="0" r="0" t="0"/>
-                <wp:wrapNone/>
-                <wp:docPr id="1" name="image1.png"/>
+                <wp:wrapTopAndBottom distB="0" distT="0"/>
+                <wp:docPr id="2" name="image3.png"/>
                 <a:graphic>
                   <a:graphicData uri="http://schemas.openxmlformats.org/drawingml/2006/picture">
                     <pic:pic>
                       <pic:nvPicPr>
-                        <pic:cNvPr id="0" name="image1.png"/>
+                        <pic:cNvPr id="0" name="image3.png"/>
                         <pic:cNvPicPr preferRelativeResize="0"/>
                       </pic:nvPicPr>
                       <pic:blipFill>
@@ -1691,7 +1719,7 @@
                       <pic:spPr>
                         <a:xfrm>
                           <a:off x="0" y="0"/>
-                          <a:ext cx="6849836" cy="15875"/>
+                          <a:ext cx="6400800" cy="15875"/>
                         </a:xfrm>
                         <a:prstGeom prst="rect"/>
                         <a:ln/>
@@ -1707,20 +1735,20 @@
               <wp:anchor allowOverlap="1" behindDoc="0" distB="0" distT="0" distL="114300" distR="114300" hidden="0" layoutInCell="1" locked="0" relativeHeight="0" simplePos="0">
                 <wp:simplePos x="0" y="0"/>
                 <wp:positionH relativeFrom="column">
-                  <wp:posOffset>-447674</wp:posOffset>
+                  <wp:posOffset>1</wp:posOffset>
                 </wp:positionH>
                 <wp:positionV relativeFrom="paragraph">
-                  <wp:posOffset>19050</wp:posOffset>
+                  <wp:posOffset>18101</wp:posOffset>
                 </wp:positionV>
-                <wp:extent cx="6849836" cy="15875"/>
+                <wp:extent cx="6400800" cy="15875"/>
                 <wp:effectExtent b="0" l="0" r="0" t="0"/>
-                <wp:wrapNone/>
-                <wp:docPr id="1" name="image2.png"/>
+                <wp:wrapTopAndBottom distB="0" distT="0"/>
+                <wp:docPr id="2" name="image4.png"/>
                 <a:graphic>
                   <a:graphicData uri="http://schemas.openxmlformats.org/drawingml/2006/picture">
                     <pic:pic>
                       <pic:nvPicPr>
-                        <pic:cNvPr id="0" name="image2.png"/>
+                        <pic:cNvPr id="0" name="image4.png"/>
                         <pic:cNvPicPr preferRelativeResize="0"/>
                       </pic:nvPicPr>
                       <pic:blipFill>
@@ -1733,7 +1761,7 @@
                       <pic:spPr>
                         <a:xfrm>
                           <a:off x="0" y="0"/>
-                          <a:ext cx="6849836" cy="15875"/>
+                          <a:ext cx="6400800" cy="15875"/>
                         </a:xfrm>
                         <a:prstGeom prst="rect"/>
                         <a:ln/>
@@ -1750,7 +1778,7 @@
     <w:p>
       <w:pPr>
         <w:widowControl w:val="0"/>
-        <w:spacing w:before="42.3260498046875" w:line="242.2939682006836" w:lineRule="auto"/>
+        <w:spacing w:after="0" w:before="0" w:line="227.99999999999997" w:lineRule="auto"/>
         <w:ind w:right="137.95166015625"/>
         <w:rPr>
           <w:rFonts w:ascii="Times New Roman" w:cs="Times New Roman" w:eastAsia="Times New Roman" w:hAnsi="Times New Roman"/>
@@ -1782,7 +1810,7 @@
     <w:p>
       <w:pPr>
         <w:widowControl w:val="0"/>
-        <w:spacing w:before="42.3260498046875" w:line="242.2939682006836" w:lineRule="auto"/>
+        <w:spacing w:after="0" w:before="0" w:line="227.99999999999997" w:lineRule="auto"/>
         <w:ind w:right="137.95166015625"/>
         <w:rPr>
           <w:rFonts w:ascii="Times New Roman" w:cs="Times New Roman" w:eastAsia="Times New Roman" w:hAnsi="Times New Roman"/>
@@ -1808,13 +1836,13 @@
           <w:szCs w:val="20"/>
           <w:rtl w:val="0"/>
         </w:rPr>
-        <w:t xml:space="preserve">: React Native, Node.js ,Yarn, Django, FastAPI, .NET</w:t>
+        <w:t xml:space="preserve">: React Native, Node.js ,Yarn, Django, FastAPI, RestAPI, .NET, Angular</w:t>
       </w:r>
     </w:p>
     <w:p>
       <w:pPr>
         <w:widowControl w:val="0"/>
-        <w:spacing w:before="42.3260498046875" w:line="242.2939682006836" w:lineRule="auto"/>
+        <w:spacing w:after="0" w:before="0" w:line="227.99999999999997" w:lineRule="auto"/>
         <w:ind w:right="137.95166015625"/>
         <w:rPr>
           <w:rFonts w:ascii="Times New Roman" w:cs="Times New Roman" w:eastAsia="Times New Roman" w:hAnsi="Times New Roman"/>
@@ -1853,7 +1881,7 @@
       <w:headerReference r:id="rId8" w:type="first"/>
       <w:footerReference r:id="rId9" w:type="first"/>
       <w:pgSz w:h="15840" w:w="12240" w:orient="portrait"/>
-      <w:pgMar w:bottom="1440" w:top="1440" w:left="1440" w:right="1440" w:header="720" w:footer="720"/>
+      <w:pgMar w:bottom="1440" w:top="1440" w:left="1440" w:right="720" w:header="720" w:footer="720"/>
       <w:pgNumType w:start="1"/>
       <w:titlePg w:val="1"/>
     </w:sectPr>
@@ -2392,6 +2420,116 @@
       </w:rPr>
     </w:lvl>
   </w:abstractNum>
+  <w:abstractNum w:abstractNumId="5">
+    <w:lvl w:ilvl="0">
+      <w:start w:val="1"/>
+      <w:numFmt w:val="bullet"/>
+      <w:lvlText w:val="●"/>
+      <w:lvlJc w:val="left"/>
+      <w:pPr>
+        <w:ind w:left="720" w:hanging="360"/>
+      </w:pPr>
+      <w:rPr>
+        <w:u w:val="none"/>
+      </w:rPr>
+    </w:lvl>
+    <w:lvl w:ilvl="1">
+      <w:start w:val="1"/>
+      <w:numFmt w:val="bullet"/>
+      <w:lvlText w:val="○"/>
+      <w:lvlJc w:val="left"/>
+      <w:pPr>
+        <w:ind w:left="1440" w:hanging="360"/>
+      </w:pPr>
+      <w:rPr>
+        <w:u w:val="none"/>
+      </w:rPr>
+    </w:lvl>
+    <w:lvl w:ilvl="2">
+      <w:start w:val="1"/>
+      <w:numFmt w:val="bullet"/>
+      <w:lvlText w:val="■"/>
+      <w:lvlJc w:val="left"/>
+      <w:pPr>
+        <w:ind w:left="2160" w:hanging="360"/>
+      </w:pPr>
+      <w:rPr>
+        <w:u w:val="none"/>
+      </w:rPr>
+    </w:lvl>
+    <w:lvl w:ilvl="3">
+      <w:start w:val="1"/>
+      <w:numFmt w:val="bullet"/>
+      <w:lvlText w:val="●"/>
+      <w:lvlJc w:val="left"/>
+      <w:pPr>
+        <w:ind w:left="2880" w:hanging="360"/>
+      </w:pPr>
+      <w:rPr>
+        <w:u w:val="none"/>
+      </w:rPr>
+    </w:lvl>
+    <w:lvl w:ilvl="4">
+      <w:start w:val="1"/>
+      <w:numFmt w:val="bullet"/>
+      <w:lvlText w:val="○"/>
+      <w:lvlJc w:val="left"/>
+      <w:pPr>
+        <w:ind w:left="3600" w:hanging="360"/>
+      </w:pPr>
+      <w:rPr>
+        <w:u w:val="none"/>
+      </w:rPr>
+    </w:lvl>
+    <w:lvl w:ilvl="5">
+      <w:start w:val="1"/>
+      <w:numFmt w:val="bullet"/>
+      <w:lvlText w:val="■"/>
+      <w:lvlJc w:val="left"/>
+      <w:pPr>
+        <w:ind w:left="4320" w:hanging="360"/>
+      </w:pPr>
+      <w:rPr>
+        <w:u w:val="none"/>
+      </w:rPr>
+    </w:lvl>
+    <w:lvl w:ilvl="6">
+      <w:start w:val="1"/>
+      <w:numFmt w:val="bullet"/>
+      <w:lvlText w:val="●"/>
+      <w:lvlJc w:val="left"/>
+      <w:pPr>
+        <w:ind w:left="5040" w:hanging="360"/>
+      </w:pPr>
+      <w:rPr>
+        <w:u w:val="none"/>
+      </w:rPr>
+    </w:lvl>
+    <w:lvl w:ilvl="7">
+      <w:start w:val="1"/>
+      <w:numFmt w:val="bullet"/>
+      <w:lvlText w:val="○"/>
+      <w:lvlJc w:val="left"/>
+      <w:pPr>
+        <w:ind w:left="5760" w:hanging="360"/>
+      </w:pPr>
+      <w:rPr>
+        <w:u w:val="none"/>
+      </w:rPr>
+    </w:lvl>
+    <w:lvl w:ilvl="8">
+      <w:start w:val="1"/>
+      <w:numFmt w:val="bullet"/>
+      <w:lvlText w:val="■"/>
+      <w:lvlJc w:val="left"/>
+      <w:pPr>
+        <w:ind w:left="6480" w:hanging="360"/>
+      </w:pPr>
+      <w:rPr>
+        <w:u w:val="none"/>
+      </w:rPr>
+    </w:lvl>
+  </w:abstractNum>
   <w:num w:numId="1">
     <w:abstractNumId w:val="1"/>
   </w:num>
@@ -2403,6 +2541,9 @@
   </w:num>
   <w:num w:numId="4">
     <w:abstractNumId w:val="4"/>
+  </w:num>
+  <w:num w:numId="5">
+    <w:abstractNumId w:val="5"/>
   </w:num>
 </w:numbering>
 </file>

</xml_diff>

<commit_message>
Refactored website with interactivity and animations. Added comprehensive changelog.
</commit_message>
<xml_diff>
--- a/public/McKay_Gavin_Resume.docx
+++ b/public/McKay_Gavin_Resume.docx
@@ -283,7 +283,7 @@
           <w:szCs w:val="20"/>
           <w:rtl w:val="0"/>
         </w:rPr>
-        <w:t xml:space="preserve">Expected Graduation December 2026</w:t>
+        <w:t xml:space="preserve">Expected Graduation May 2027</w:t>
       </w:r>
       <w:r>
         <w:rPr>
@@ -332,7 +332,7 @@
           <w:szCs w:val="20"/>
           <w:rtl w:val="0"/>
         </w:rPr>
-        <w:t xml:space="preserve">Software Fundamentals and Lab, Discrete Math, C and Software Tools, Data Structures &amp; Algorithms, Automata &amp; Languages, Software Engineering, Operating Systems, Intro to AI, Automated Learning and Data Analysis, Applied Web-based Client-Server Computing</w:t>
+        <w:t xml:space="preserve">Software Fundamentals &amp; Lab, Discrete Math, C &amp; Software Tools, Data Structures &amp; Algorithms, Automata &amp; Languages, Software Engineering, Operating Systems, Intro to AI, Automated Learning &amp; Data Analysis</w:t>
       </w:r>
       <w:r>
         <w:rPr>
@@ -482,38 +482,77 @@
           <w:szCs w:val="20"/>
           <w:rtl w:val="0"/>
         </w:rPr>
-        <w:t xml:space="preserve">Neurotech at NCSU</w:t>
-      </w:r>
-      <w:r>
-        <w:rPr>
-          <w:rFonts w:ascii="Times New Roman" w:cs="Times New Roman" w:eastAsia="Times New Roman" w:hAnsi="Times New Roman"/>
-          <w:sz w:val="20"/>
-          <w:szCs w:val="20"/>
-          <w:rtl w:val="0"/>
-        </w:rPr>
-        <w:t xml:space="preserve"> | </w:t>
-      </w:r>
-      <w:r>
-        <w:rPr>
-          <w:rFonts w:ascii="Times New Roman" w:cs="Times New Roman" w:eastAsia="Times New Roman" w:hAnsi="Times New Roman"/>
-          <w:b w:val="1"/>
-          <w:bCs w:val="1"/>
-          <w:sz w:val="20"/>
-          <w:szCs w:val="20"/>
-          <w:rtl w:val="0"/>
-        </w:rPr>
-        <w:t xml:space="preserve">Lead Software Engineer</w:t>
-      </w:r>
-      <w:r>
-        <w:rPr>
-          <w:rFonts w:ascii="Times New Roman" w:cs="Times New Roman" w:eastAsia="Times New Roman" w:hAnsi="Times New Roman"/>
-          <w:sz w:val="20"/>
-          <w:szCs w:val="20"/>
-          <w:rtl w:val="0"/>
-        </w:rPr>
-        <w:t xml:space="preserve">  </w:t>
-        <w:tab/>
-        <w:tab/>
+        <w:t xml:space="preserve">Vantaca</w:t>
+      </w:r>
+      <w:r>
+        <w:rPr>
+          <w:rFonts w:ascii="Times New Roman" w:cs="Times New Roman" w:eastAsia="Times New Roman" w:hAnsi="Times New Roman"/>
+          <w:sz w:val="20"/>
+          <w:szCs w:val="20"/>
+          <w:rtl w:val="0"/>
+        </w:rPr>
+        <w:t xml:space="preserve"> </w:t>
+      </w:r>
+      <w:r>
+        <w:rPr>
+          <w:rFonts w:ascii="Times New Roman" w:cs="Times New Roman" w:eastAsia="Times New Roman" w:hAnsi="Times New Roman"/>
+          <w:b w:val="1"/>
+          <w:bCs w:val="1"/>
+          <w:sz w:val="20"/>
+          <w:szCs w:val="20"/>
+          <w:rtl w:val="0"/>
+        </w:rPr>
+        <w:t xml:space="preserve">|</w:t>
+      </w:r>
+      <w:r>
+        <w:rPr>
+          <w:rFonts w:ascii="Times New Roman" w:cs="Times New Roman" w:eastAsia="Times New Roman" w:hAnsi="Times New Roman"/>
+          <w:sz w:val="20"/>
+          <w:szCs w:val="20"/>
+          <w:rtl w:val="0"/>
+        </w:rPr>
+        <w:t xml:space="preserve"> </w:t>
+      </w:r>
+      <w:r>
+        <w:rPr>
+          <w:rFonts w:ascii="Times New Roman" w:cs="Times New Roman" w:eastAsia="Times New Roman" w:hAnsi="Times New Roman"/>
+          <w:b w:val="1"/>
+          <w:bCs w:val="1"/>
+          <w:sz w:val="20"/>
+          <w:szCs w:val="20"/>
+          <w:rtl w:val="0"/>
+        </w:rPr>
+        <w:t xml:space="preserve">AI Engineer Intern</w:t>
+      </w:r>
+      <w:r>
+        <w:rPr>
+          <w:rFonts w:ascii="Times New Roman" w:cs="Times New Roman" w:eastAsia="Times New Roman" w:hAnsi="Times New Roman"/>
+          <w:sz w:val="20"/>
+          <w:szCs w:val="20"/>
+          <w:rtl w:val="0"/>
+        </w:rPr>
+        <w:t xml:space="preserve"> </w:t>
+      </w:r>
+      <w:r>
+        <w:rPr>
+          <w:rFonts w:ascii="Times New Roman" w:cs="Times New Roman" w:eastAsia="Times New Roman" w:hAnsi="Times New Roman"/>
+          <w:b w:val="1"/>
+          <w:bCs w:val="1"/>
+          <w:sz w:val="20"/>
+          <w:szCs w:val="20"/>
+          <w:rtl w:val="0"/>
+        </w:rPr>
+        <w:t xml:space="preserve">| Wilmington, NC</w:t>
+      </w:r>
+      <w:r>
+        <w:rPr>
+          <w:rFonts w:ascii="Times New Roman" w:cs="Times New Roman" w:eastAsia="Times New Roman" w:hAnsi="Times New Roman"/>
+          <w:sz w:val="20"/>
+          <w:szCs w:val="20"/>
+          <w:rtl w:val="0"/>
+        </w:rPr>
+        <w:tab/>
+        <w:t xml:space="preserve">                     </w:t>
         <w:tab/>
         <w:tab/>
         <w:tab/>
@@ -531,7 +570,7 @@
           <w:szCs w:val="20"/>
           <w:rtl w:val="0"/>
         </w:rPr>
-        <w:t xml:space="preserve">Sep 2025-Present</w:t>
+        <w:t xml:space="preserve">May-July 2026</w:t>
       </w:r>
     </w:p>
     <w:p>
@@ -540,7 +579,7 @@
         <w:widowControl w:val="1"/>
         <w:numPr>
           <w:ilvl w:val="0"/>
-          <w:numId w:val="3"/>
+          <w:numId w:val="2"/>
         </w:numPr>
         <w:spacing w:after="0" w:before="0" w:line="227.99999999999997" w:lineRule="auto"/>
         <w:ind w:left="720" w:hanging="360"/>
@@ -548,28 +587,36 @@
           <w:rFonts w:ascii="Times New Roman" w:cs="Times New Roman" w:eastAsia="Times New Roman" w:hAnsi="Times New Roman"/>
           <w:sz w:val="20"/>
           <w:szCs w:val="20"/>
-          <w:u w:val="none"/>
-        </w:rPr>
-      </w:pPr>
-      <w:r>
-        <w:rPr>
-          <w:rFonts w:ascii="Times New Roman" w:cs="Times New Roman" w:eastAsia="Times New Roman" w:hAnsi="Times New Roman"/>
-          <w:b w:val="1"/>
-          <w:bCs w:val="1"/>
-          <w:sz w:val="20"/>
-          <w:szCs w:val="20"/>
-          <w:rtl w:val="0"/>
-        </w:rPr>
-        <w:t xml:space="preserve">Engineering Leadership:</w:t>
-      </w:r>
-      <w:r>
-        <w:rPr>
-          <w:rFonts w:ascii="Times New Roman" w:cs="Times New Roman" w:eastAsia="Times New Roman" w:hAnsi="Times New Roman"/>
-          <w:sz w:val="20"/>
-          <w:szCs w:val="20"/>
-          <w:rtl w:val="0"/>
-        </w:rPr>
-        <w:t xml:space="preserve"> Spearheading the software development roadmap for brain-computer interface (BCI) projects, managing a team of developers to integrate electroencephalogram (EEG) data with real-time applications.</w:t>
+        </w:rPr>
+      </w:pPr>
+      <w:r>
+        <w:rPr>
+          <w:rFonts w:ascii="Times New Roman" w:cs="Times New Roman" w:eastAsia="Times New Roman" w:hAnsi="Times New Roman"/>
+          <w:sz w:val="20"/>
+          <w:szCs w:val="20"/>
+          <w:rtl w:val="0"/>
+        </w:rPr>
+        <w:t xml:space="preserve">Contributing to </w:t>
+      </w:r>
+      <w:r>
+        <w:rPr>
+          <w:rFonts w:ascii="Times New Roman" w:cs="Times New Roman" w:eastAsia="Times New Roman" w:hAnsi="Times New Roman"/>
+          <w:b w:val="1"/>
+          <w:bCs w:val="1"/>
+          <w:sz w:val="20"/>
+          <w:szCs w:val="20"/>
+          <w:rtl w:val="0"/>
+        </w:rPr>
+        <w:t xml:space="preserve">VantacaCore</w:t>
+      </w:r>
+      <w:r>
+        <w:rPr>
+          <w:rFonts w:ascii="Times New Roman" w:cs="Times New Roman" w:eastAsia="Times New Roman" w:hAnsi="Times New Roman"/>
+          <w:sz w:val="20"/>
+          <w:szCs w:val="20"/>
+          <w:rtl w:val="0"/>
+        </w:rPr>
+        <w:t xml:space="preserve"> – a production SaaS platform powering HOA management for thousands of communities nationwide.</w:t>
       </w:r>
     </w:p>
     <w:p>
@@ -578,7 +625,7 @@
         <w:widowControl w:val="1"/>
         <w:numPr>
           <w:ilvl w:val="0"/>
-          <w:numId w:val="3"/>
+          <w:numId w:val="2"/>
         </w:numPr>
         <w:spacing w:after="0" w:before="0" w:line="227.99999999999997" w:lineRule="auto"/>
         <w:ind w:left="720" w:hanging="360"/>
@@ -586,27 +633,119 @@
           <w:rFonts w:ascii="Times New Roman" w:cs="Times New Roman" w:eastAsia="Times New Roman" w:hAnsi="Times New Roman"/>
           <w:sz w:val="20"/>
           <w:szCs w:val="20"/>
-        </w:rPr>
-      </w:pPr>
-      <w:r>
-        <w:rPr>
-          <w:rFonts w:ascii="Times New Roman" w:cs="Times New Roman" w:eastAsia="Times New Roman" w:hAnsi="Times New Roman"/>
-          <w:b w:val="1"/>
-          <w:bCs w:val="1"/>
-          <w:sz w:val="20"/>
-          <w:szCs w:val="20"/>
-          <w:rtl w:val="0"/>
-        </w:rPr>
-        <w:t xml:space="preserve">Machine Learning &amp; Signal Processing:</w:t>
-      </w:r>
-      <w:r>
-        <w:rPr>
-          <w:rFonts w:ascii="Times New Roman" w:cs="Times New Roman" w:eastAsia="Times New Roman" w:hAnsi="Times New Roman"/>
-          <w:sz w:val="20"/>
-          <w:szCs w:val="20"/>
-          <w:rtl w:val="0"/>
-        </w:rPr>
-        <w:t xml:space="preserve"> Designing and implementing machine learning algorithms to filter raw EEG signal noise and classify specific brain-wave patterns to trigger digital and physical actions.</w:t>
+          <w:u w:val="none"/>
+        </w:rPr>
+      </w:pPr>
+      <w:r>
+        <w:rPr>
+          <w:rFonts w:ascii="Times New Roman" w:cs="Times New Roman" w:eastAsia="Times New Roman" w:hAnsi="Times New Roman"/>
+          <w:b w:val="1"/>
+          <w:bCs w:val="1"/>
+          <w:sz w:val="20"/>
+          <w:szCs w:val="20"/>
+          <w:rtl w:val="0"/>
+        </w:rPr>
+        <w:t xml:space="preserve">Multi-Owner Migration:</w:t>
+      </w:r>
+      <w:r>
+        <w:rPr>
+          <w:rFonts w:ascii="Times New Roman" w:cs="Times New Roman" w:eastAsia="Times New Roman" w:hAnsi="Times New Roman"/>
+          <w:sz w:val="20"/>
+          <w:szCs w:val="20"/>
+          <w:rtl w:val="0"/>
+        </w:rPr>
+        <w:t xml:space="preserve"> Contributing to a full-stack migration platform (</w:t>
+      </w:r>
+      <w:r>
+        <w:rPr>
+          <w:rFonts w:ascii="Times New Roman" w:cs="Times New Roman" w:eastAsia="Times New Roman" w:hAnsi="Times New Roman"/>
+          <w:b w:val="1"/>
+          <w:bCs w:val="1"/>
+          <w:sz w:val="20"/>
+          <w:szCs w:val="20"/>
+          <w:rtl w:val="0"/>
+        </w:rPr>
+        <w:t xml:space="preserve">ASP.NET</w:t>
+      </w:r>
+      <w:r>
+        <w:rPr>
+          <w:rFonts w:ascii="Times New Roman" w:cs="Times New Roman" w:eastAsia="Times New Roman" w:hAnsi="Times New Roman"/>
+          <w:b w:val="1"/>
+          <w:bCs w:val="1"/>
+          <w:sz w:val="20"/>
+          <w:szCs w:val="20"/>
+          <w:rtl w:val="0"/>
+        </w:rPr>
+        <w:t xml:space="preserve"> Core</w:t>
+      </w:r>
+      <w:r>
+        <w:rPr>
+          <w:rFonts w:ascii="Times New Roman" w:cs="Times New Roman" w:eastAsia="Times New Roman" w:hAnsi="Times New Roman"/>
+          <w:sz w:val="20"/>
+          <w:szCs w:val="20"/>
+          <w:rtl w:val="0"/>
+        </w:rPr>
+        <w:t xml:space="preserve">, </w:t>
+      </w:r>
+      <w:r>
+        <w:rPr>
+          <w:rFonts w:ascii="Times New Roman" w:cs="Times New Roman" w:eastAsia="Times New Roman" w:hAnsi="Times New Roman"/>
+          <w:b w:val="1"/>
+          <w:bCs w:val="1"/>
+          <w:sz w:val="20"/>
+          <w:szCs w:val="20"/>
+          <w:rtl w:val="0"/>
+        </w:rPr>
+        <w:t xml:space="preserve">Azure Functions</w:t>
+      </w:r>
+      <w:r>
+        <w:rPr>
+          <w:rFonts w:ascii="Times New Roman" w:cs="Times New Roman" w:eastAsia="Times New Roman" w:hAnsi="Times New Roman"/>
+          <w:sz w:val="20"/>
+          <w:szCs w:val="20"/>
+          <w:rtl w:val="0"/>
+        </w:rPr>
+        <w:t xml:space="preserve">, </w:t>
+      </w:r>
+      <w:r>
+        <w:rPr>
+          <w:rFonts w:ascii="Times New Roman" w:cs="Times New Roman" w:eastAsia="Times New Roman" w:hAnsi="Times New Roman"/>
+          <w:b w:val="1"/>
+          <w:bCs w:val="1"/>
+          <w:sz w:val="20"/>
+          <w:szCs w:val="20"/>
+          <w:rtl w:val="0"/>
+        </w:rPr>
+        <w:t xml:space="preserve">React/Vite</w:t>
+      </w:r>
+      <w:r>
+        <w:rPr>
+          <w:rFonts w:ascii="Times New Roman" w:cs="Times New Roman" w:eastAsia="Times New Roman" w:hAnsi="Times New Roman"/>
+          <w:sz w:val="20"/>
+          <w:szCs w:val="20"/>
+          <w:rtl w:val="0"/>
+        </w:rPr>
+        <w:t xml:space="preserve">, </w:t>
+      </w:r>
+      <w:r>
+        <w:rPr>
+          <w:rFonts w:ascii="Times New Roman" w:cs="Times New Roman" w:eastAsia="Times New Roman" w:hAnsi="Times New Roman"/>
+          <w:b w:val="1"/>
+          <w:bCs w:val="1"/>
+          <w:sz w:val="20"/>
+          <w:szCs w:val="20"/>
+          <w:rtl w:val="0"/>
+        </w:rPr>
+        <w:t xml:space="preserve">PostgreSQL</w:t>
+      </w:r>
+      <w:r>
+        <w:rPr>
+          <w:rFonts w:ascii="Times New Roman" w:cs="Times New Roman" w:eastAsia="Times New Roman" w:hAnsi="Times New Roman"/>
+          <w:sz w:val="20"/>
+          <w:szCs w:val="20"/>
+          <w:rtl w:val="0"/>
+        </w:rPr>
+        <w:t xml:space="preserve">) that converts legacy HOA single-owner records into a multi-owner model using AI-assisted name resolution and a transactional push pipeline.</w:t>
       </w:r>
     </w:p>
     <w:p>
@@ -615,7 +754,7 @@
         <w:widowControl w:val="1"/>
         <w:numPr>
           <w:ilvl w:val="0"/>
-          <w:numId w:val="3"/>
+          <w:numId w:val="2"/>
         </w:numPr>
         <w:spacing w:after="0" w:before="0" w:line="227.99999999999997" w:lineRule="auto"/>
         <w:ind w:left="720" w:hanging="360"/>
@@ -634,27 +773,179 @@
           <w:szCs w:val="20"/>
           <w:rtl w:val="0"/>
         </w:rPr>
-        <w:t xml:space="preserve">Assistive Technology Development:</w:t>
-      </w:r>
-      <w:r>
-        <w:rPr>
-          <w:rFonts w:ascii="Times New Roman" w:cs="Times New Roman" w:eastAsia="Times New Roman" w:hAnsi="Times New Roman"/>
-          <w:sz w:val="20"/>
-          <w:szCs w:val="20"/>
-          <w:rtl w:val="0"/>
-        </w:rPr>
-        <w:t xml:space="preserve"> Leading the creation of a grid-based, switch-accessible Augmentative and Alternative Communication (AAC) application utilizing eye-tracking technology for children with severe motor impairments.</w:t>
+        <w:t xml:space="preserve">Platform Defect Resolution: </w:t>
+      </w:r>
+      <w:r>
+        <w:rPr>
+          <w:rFonts w:ascii="Times New Roman" w:cs="Times New Roman" w:eastAsia="Times New Roman" w:hAnsi="Times New Roman"/>
+          <w:sz w:val="20"/>
+          <w:szCs w:val="20"/>
+          <w:rtl w:val="0"/>
+        </w:rPr>
+        <w:t xml:space="preserve">Triaged and resolved production bugs in the VantacaCore legacy</w:t>
+      </w:r>
+      <w:r>
+        <w:rPr>
+          <w:rFonts w:ascii="Times New Roman" w:cs="Times New Roman" w:eastAsia="Times New Roman" w:hAnsi="Times New Roman"/>
+          <w:b w:val="1"/>
+          <w:bCs w:val="1"/>
+          <w:sz w:val="20"/>
+          <w:szCs w:val="20"/>
+          <w:rtl w:val="0"/>
+        </w:rPr>
+        <w:t xml:space="preserve"> .NET framework </w:t>
+      </w:r>
+      <w:r>
+        <w:rPr>
+          <w:rFonts w:ascii="Times New Roman" w:cs="Times New Roman" w:eastAsia="Times New Roman" w:hAnsi="Times New Roman"/>
+          <w:sz w:val="20"/>
+          <w:szCs w:val="20"/>
+          <w:rtl w:val="0"/>
+        </w:rPr>
+        <w:t xml:space="preserve">platform – addressing </w:t>
+      </w:r>
+      <w:r>
+        <w:rPr>
+          <w:rFonts w:ascii="Times New Roman" w:cs="Times New Roman" w:eastAsia="Times New Roman" w:hAnsi="Times New Roman"/>
+          <w:b w:val="1"/>
+          <w:bCs w:val="1"/>
+          <w:sz w:val="20"/>
+          <w:szCs w:val="20"/>
+          <w:rtl w:val="0"/>
+        </w:rPr>
+        <w:t xml:space="preserve">SonarQube </w:t>
+      </w:r>
+      <w:r>
+        <w:rPr>
+          <w:rFonts w:ascii="Times New Roman" w:cs="Times New Roman" w:eastAsia="Times New Roman" w:hAnsi="Times New Roman"/>
+          <w:sz w:val="20"/>
+          <w:szCs w:val="20"/>
+          <w:rtl w:val="0"/>
+        </w:rPr>
+        <w:t xml:space="preserve">code quality gates through full </w:t>
+      </w:r>
+      <w:r>
+        <w:rPr>
+          <w:rFonts w:ascii="Times New Roman" w:cs="Times New Roman" w:eastAsia="Times New Roman" w:hAnsi="Times New Roman"/>
+          <w:b w:val="1"/>
+          <w:bCs w:val="1"/>
+          <w:sz w:val="20"/>
+          <w:szCs w:val="20"/>
+          <w:rtl w:val="0"/>
+        </w:rPr>
+        <w:t xml:space="preserve">Azure DevOps </w:t>
+      </w:r>
+      <w:r>
+        <w:rPr>
+          <w:rFonts w:ascii="Times New Roman" w:cs="Times New Roman" w:eastAsia="Times New Roman" w:hAnsi="Times New Roman"/>
+          <w:sz w:val="20"/>
+          <w:szCs w:val="20"/>
+          <w:rtl w:val="0"/>
+        </w:rPr>
+        <w:t xml:space="preserve">PR review cycles.</w:t>
       </w:r>
     </w:p>
     <w:p>
       <w:pPr>
         <w:keepLines w:val="1"/>
-        <w:widowControl w:val="1"/>
+        <w:spacing w:line="227.99999999999997" w:lineRule="auto"/>
+        <w:rPr>
+          <w:rFonts w:ascii="Times New Roman" w:cs="Times New Roman" w:eastAsia="Times New Roman" w:hAnsi="Times New Roman"/>
+          <w:b w:val="1"/>
+          <w:bCs w:val="1"/>
+          <w:i w:val="1"/>
+          <w:iCs w:val="1"/>
+          <w:sz w:val="20"/>
+          <w:szCs w:val="20"/>
+        </w:rPr>
+      </w:pPr>
+      <w:r>
+        <w:rPr>
+          <w:rFonts w:ascii="Times New Roman" w:cs="Times New Roman" w:eastAsia="Times New Roman" w:hAnsi="Times New Roman"/>
+          <w:b w:val="1"/>
+          <w:bCs w:val="1"/>
+          <w:sz w:val="20"/>
+          <w:szCs w:val="20"/>
+          <w:rtl w:val="0"/>
+        </w:rPr>
+        <w:t xml:space="preserve">Neurotech at NCSU</w:t>
+      </w:r>
+      <w:r>
+        <w:rPr>
+          <w:rFonts w:ascii="Times New Roman" w:cs="Times New Roman" w:eastAsia="Times New Roman" w:hAnsi="Times New Roman"/>
+          <w:sz w:val="20"/>
+          <w:szCs w:val="20"/>
+          <w:rtl w:val="0"/>
+        </w:rPr>
+        <w:t xml:space="preserve"> </w:t>
+      </w:r>
+      <w:r>
+        <w:rPr>
+          <w:rFonts w:ascii="Times New Roman" w:cs="Times New Roman" w:eastAsia="Times New Roman" w:hAnsi="Times New Roman"/>
+          <w:b w:val="1"/>
+          <w:bCs w:val="1"/>
+          <w:sz w:val="20"/>
+          <w:szCs w:val="20"/>
+          <w:rtl w:val="0"/>
+        </w:rPr>
+        <w:t xml:space="preserve">|</w:t>
+      </w:r>
+      <w:r>
+        <w:rPr>
+          <w:rFonts w:ascii="Times New Roman" w:cs="Times New Roman" w:eastAsia="Times New Roman" w:hAnsi="Times New Roman"/>
+          <w:sz w:val="20"/>
+          <w:szCs w:val="20"/>
+          <w:rtl w:val="0"/>
+        </w:rPr>
+        <w:t xml:space="preserve"> </w:t>
+      </w:r>
+      <w:r>
+        <w:rPr>
+          <w:rFonts w:ascii="Times New Roman" w:cs="Times New Roman" w:eastAsia="Times New Roman" w:hAnsi="Times New Roman"/>
+          <w:b w:val="1"/>
+          <w:bCs w:val="1"/>
+          <w:sz w:val="20"/>
+          <w:szCs w:val="20"/>
+          <w:rtl w:val="0"/>
+        </w:rPr>
+        <w:t xml:space="preserve">Lead Software Engineer | Raleigh, NC</w:t>
+      </w:r>
+      <w:r>
+        <w:rPr>
+          <w:rFonts w:ascii="Times New Roman" w:cs="Times New Roman" w:eastAsia="Times New Roman" w:hAnsi="Times New Roman"/>
+          <w:sz w:val="20"/>
+          <w:szCs w:val="20"/>
+          <w:rtl w:val="0"/>
+        </w:rPr>
+        <w:t xml:space="preserve"> </w:t>
+        <w:tab/>
+        <w:tab/>
+        <w:tab/>
+        <w:tab/>
+        <w:t xml:space="preserve">           </w:t>
+      </w:r>
+      <w:r>
+        <w:rPr>
+          <w:rFonts w:ascii="Times New Roman" w:cs="Times New Roman" w:eastAsia="Times New Roman" w:hAnsi="Times New Roman"/>
+          <w:b w:val="1"/>
+          <w:bCs w:val="1"/>
+          <w:i w:val="1"/>
+          <w:iCs w:val="1"/>
+          <w:sz w:val="20"/>
+          <w:szCs w:val="20"/>
+          <w:rtl w:val="0"/>
+        </w:rPr>
+        <w:t xml:space="preserve">Sep 2025-Present</w:t>
+      </w:r>
+    </w:p>
+    <w:p>
+      <w:pPr>
+        <w:keepLines w:val="1"/>
         <w:numPr>
           <w:ilvl w:val="0"/>
-          <w:numId w:val="3"/>
+          <w:numId w:val="2"/>
         </w:numPr>
-        <w:spacing w:after="0" w:before="0" w:line="227.99999999999997" w:lineRule="auto"/>
+        <w:spacing w:line="227.99999999999997" w:lineRule="auto"/>
         <w:ind w:left="720" w:hanging="360"/>
         <w:rPr>
           <w:rFonts w:ascii="Times New Roman" w:cs="Times New Roman" w:eastAsia="Times New Roman" w:hAnsi="Times New Roman"/>
@@ -671,243 +962,129 @@
           <w:szCs w:val="20"/>
           <w:rtl w:val="0"/>
         </w:rPr>
-        <w:t xml:space="preserve">Hardware Integration:</w:t>
-      </w:r>
-      <w:r>
-        <w:rPr>
-          <w:rFonts w:ascii="Times New Roman" w:cs="Times New Roman" w:eastAsia="Times New Roman" w:hAnsi="Times New Roman"/>
-          <w:sz w:val="20"/>
-          <w:szCs w:val="20"/>
-          <w:rtl w:val="0"/>
-        </w:rPr>
-        <w:t xml:space="preserve"> Coordinating with neurotech industry partners to integrate high-fidelity EEG headsets for future-phase projects, including brain-controlled robotics (RC cars) and neuro-feedback gaming environments.</w:t>
-      </w:r>
-    </w:p>
-    <w:p>
-      <w:pPr>
-        <w:widowControl w:val="0"/>
-        <w:spacing w:after="0" w:before="0" w:line="227.99999999999997" w:lineRule="auto"/>
-        <w:ind w:left="0" w:firstLine="0"/>
-        <w:rPr>
-          <w:rFonts w:ascii="Times New Roman" w:cs="Times New Roman" w:eastAsia="Times New Roman" w:hAnsi="Times New Roman"/>
-          <w:b w:val="1"/>
-          <w:bCs w:val="1"/>
-          <w:i w:val="1"/>
-          <w:iCs w:val="1"/>
-          <w:sz w:val="20"/>
-          <w:szCs w:val="20"/>
-        </w:rPr>
-      </w:pPr>
-      <w:r>
-        <w:rPr>
-          <w:rFonts w:ascii="Times New Roman" w:cs="Times New Roman" w:eastAsia="Times New Roman" w:hAnsi="Times New Roman"/>
-          <w:b w:val="1"/>
-          <w:bCs w:val="1"/>
-          <w:sz w:val="20"/>
-          <w:szCs w:val="20"/>
-          <w:rtl w:val="0"/>
-        </w:rPr>
-        <w:t xml:space="preserve">Code Black |  (Event &amp; Company Outreach Coordinator)</w:t>
-      </w:r>
-      <w:r>
-        <w:rPr>
-          <w:rFonts w:ascii="Times New Roman" w:cs="Times New Roman" w:eastAsia="Times New Roman" w:hAnsi="Times New Roman"/>
-          <w:sz w:val="20"/>
-          <w:szCs w:val="20"/>
-          <w:rtl w:val="0"/>
-        </w:rPr>
-        <w:tab/>
-        <w:tab/>
-        <w:tab/>
-        <w:tab/>
-        <w:t xml:space="preserve">           </w:t>
-        <w:tab/>
-        <w:t xml:space="preserve">           </w:t>
-      </w:r>
-      <w:r>
-        <w:rPr>
-          <w:rFonts w:ascii="Times New Roman" w:cs="Times New Roman" w:eastAsia="Times New Roman" w:hAnsi="Times New Roman"/>
-          <w:b w:val="1"/>
-          <w:bCs w:val="1"/>
-          <w:i w:val="1"/>
-          <w:iCs w:val="1"/>
-          <w:sz w:val="20"/>
-          <w:szCs w:val="20"/>
-          <w:rtl w:val="0"/>
-        </w:rPr>
-        <w:t xml:space="preserve">Apr 2024-Dec 2024</w:t>
-      </w:r>
-    </w:p>
-    <w:p>
-      <w:pPr>
-        <w:widowControl w:val="0"/>
+        <w:t xml:space="preserve">Engineering Leadership:</w:t>
+      </w:r>
+      <w:r>
+        <w:rPr>
+          <w:rFonts w:ascii="Times New Roman" w:cs="Times New Roman" w:eastAsia="Times New Roman" w:hAnsi="Times New Roman"/>
+          <w:sz w:val="20"/>
+          <w:szCs w:val="20"/>
+          <w:rtl w:val="0"/>
+        </w:rPr>
+        <w:t xml:space="preserve"> Spearheading the software development roadmap for brain-computer interface (BCI) projects, managing a team of developers to integrate electroencephalogram (EEG) data with real-time applications.</w:t>
+      </w:r>
+    </w:p>
+    <w:p>
+      <w:pPr>
+        <w:keepLines w:val="1"/>
         <w:numPr>
           <w:ilvl w:val="0"/>
-          <w:numId w:val="1"/>
+          <w:numId w:val="2"/>
         </w:numPr>
-        <w:spacing w:after="0" w:before="0" w:line="227.99999999999997" w:lineRule="auto"/>
+        <w:spacing w:line="227.99999999999997" w:lineRule="auto"/>
         <w:ind w:left="720" w:hanging="360"/>
         <w:rPr>
           <w:rFonts w:ascii="Times New Roman" w:cs="Times New Roman" w:eastAsia="Times New Roman" w:hAnsi="Times New Roman"/>
-          <w:b w:val="1"/>
-          <w:bCs w:val="1"/>
-          <w:sz w:val="20"/>
-          <w:szCs w:val="20"/>
-        </w:rPr>
-      </w:pPr>
-      <w:r>
-        <w:rPr>
-          <w:rFonts w:ascii="Times New Roman" w:cs="Times New Roman" w:eastAsia="Times New Roman" w:hAnsi="Times New Roman"/>
-          <w:b w:val="1"/>
-          <w:bCs w:val="1"/>
-          <w:sz w:val="20"/>
-          <w:szCs w:val="20"/>
-          <w:rtl w:val="0"/>
-        </w:rPr>
-        <w:t xml:space="preserve">Corporate Partnerships</w:t>
-      </w:r>
-      <w:r>
-        <w:rPr>
-          <w:rFonts w:ascii="Times New Roman" w:cs="Times New Roman" w:eastAsia="Times New Roman" w:hAnsi="Times New Roman"/>
-          <w:sz w:val="20"/>
-          <w:szCs w:val="20"/>
-          <w:rtl w:val="0"/>
-        </w:rPr>
-        <w:t xml:space="preserve">: Directed outreach initiatives to industry representatives to secure financial sponsorships and recruitment presence for club events.</w:t>
-      </w:r>
-    </w:p>
-    <w:p>
-      <w:pPr>
-        <w:widowControl w:val="0"/>
+          <w:sz w:val="20"/>
+          <w:szCs w:val="20"/>
+        </w:rPr>
+      </w:pPr>
+      <w:r>
+        <w:rPr>
+          <w:rFonts w:ascii="Times New Roman" w:cs="Times New Roman" w:eastAsia="Times New Roman" w:hAnsi="Times New Roman"/>
+          <w:b w:val="1"/>
+          <w:bCs w:val="1"/>
+          <w:sz w:val="20"/>
+          <w:szCs w:val="20"/>
+          <w:rtl w:val="0"/>
+        </w:rPr>
+        <w:t xml:space="preserve">Machine Learning &amp; Signal Processing:</w:t>
+      </w:r>
+      <w:r>
+        <w:rPr>
+          <w:rFonts w:ascii="Times New Roman" w:cs="Times New Roman" w:eastAsia="Times New Roman" w:hAnsi="Times New Roman"/>
+          <w:sz w:val="20"/>
+          <w:szCs w:val="20"/>
+          <w:rtl w:val="0"/>
+        </w:rPr>
+        <w:t xml:space="preserve"> Designing and implementing machine learning algorithms to filter raw EEG signal noise and classify specific brain-wave patterns to trigger digital and physical actions.</w:t>
+      </w:r>
+    </w:p>
+    <w:p>
+      <w:pPr>
+        <w:keepLines w:val="1"/>
         <w:numPr>
           <w:ilvl w:val="0"/>
-          <w:numId w:val="1"/>
+          <w:numId w:val="2"/>
         </w:numPr>
-        <w:spacing w:after="0" w:before="0" w:line="227.99999999999997" w:lineRule="auto"/>
+        <w:spacing w:line="227.99999999999997" w:lineRule="auto"/>
         <w:ind w:left="720" w:hanging="360"/>
         <w:rPr>
           <w:rFonts w:ascii="Times New Roman" w:cs="Times New Roman" w:eastAsia="Times New Roman" w:hAnsi="Times New Roman"/>
-          <w:b w:val="1"/>
-          <w:bCs w:val="1"/>
-          <w:sz w:val="20"/>
-          <w:szCs w:val="20"/>
-        </w:rPr>
-      </w:pPr>
-      <w:r>
-        <w:rPr>
-          <w:rFonts w:ascii="Times New Roman" w:cs="Times New Roman" w:eastAsia="Times New Roman" w:hAnsi="Times New Roman"/>
-          <w:b w:val="1"/>
-          <w:bCs w:val="1"/>
-          <w:sz w:val="20"/>
-          <w:szCs w:val="20"/>
-          <w:rtl w:val="0"/>
-        </w:rPr>
-        <w:t xml:space="preserve">Event Orchestration</w:t>
-      </w:r>
-      <w:r>
-        <w:rPr>
-          <w:rFonts w:ascii="Times New Roman" w:cs="Times New Roman" w:eastAsia="Times New Roman" w:hAnsi="Times New Roman"/>
-          <w:sz w:val="20"/>
-          <w:szCs w:val="20"/>
-          <w:rtl w:val="0"/>
-        </w:rPr>
-        <w:t xml:space="preserve">: Led the planning and execution of the annual Code Black Hackathon and career fair, managing logistics, vendor relations, and participant experience.</w:t>
-      </w:r>
-    </w:p>
-    <w:p>
-      <w:pPr>
-        <w:widowControl w:val="0"/>
+          <w:sz w:val="20"/>
+          <w:szCs w:val="20"/>
+        </w:rPr>
+      </w:pPr>
+      <w:r>
+        <w:rPr>
+          <w:rFonts w:ascii="Times New Roman" w:cs="Times New Roman" w:eastAsia="Times New Roman" w:hAnsi="Times New Roman"/>
+          <w:b w:val="1"/>
+          <w:bCs w:val="1"/>
+          <w:sz w:val="20"/>
+          <w:szCs w:val="20"/>
+          <w:rtl w:val="0"/>
+        </w:rPr>
+        <w:t xml:space="preserve">Assistive Technology Development:</w:t>
+      </w:r>
+      <w:r>
+        <w:rPr>
+          <w:rFonts w:ascii="Times New Roman" w:cs="Times New Roman" w:eastAsia="Times New Roman" w:hAnsi="Times New Roman"/>
+          <w:sz w:val="20"/>
+          <w:szCs w:val="20"/>
+          <w:rtl w:val="0"/>
+        </w:rPr>
+        <w:t xml:space="preserve"> Leading the creation of a grid-based, switch-accessible Augmentative and Alternative Communication (AAC) application utilizing eye-tracking technology for children with severe motor impairments.</w:t>
+      </w:r>
+    </w:p>
+    <w:p>
+      <w:pPr>
+        <w:keepLines w:val="1"/>
         <w:numPr>
           <w:ilvl w:val="0"/>
-          <w:numId w:val="1"/>
+          <w:numId w:val="2"/>
         </w:numPr>
-        <w:spacing w:after="0" w:before="0" w:line="227.99999999999997" w:lineRule="auto"/>
+        <w:spacing w:line="227.99999999999997" w:lineRule="auto"/>
         <w:ind w:left="720" w:hanging="360"/>
         <w:rPr>
           <w:rFonts w:ascii="Times New Roman" w:cs="Times New Roman" w:eastAsia="Times New Roman" w:hAnsi="Times New Roman"/>
-          <w:b w:val="1"/>
-          <w:bCs w:val="1"/>
-          <w:sz w:val="20"/>
-          <w:szCs w:val="20"/>
-        </w:rPr>
-      </w:pPr>
-      <w:r>
-        <w:rPr>
-          <w:rFonts w:ascii="Times New Roman" w:cs="Times New Roman" w:eastAsia="Times New Roman" w:hAnsi="Times New Roman"/>
-          <w:b w:val="1"/>
-          <w:bCs w:val="1"/>
-          <w:sz w:val="20"/>
-          <w:szCs w:val="20"/>
-          <w:rtl w:val="0"/>
-        </w:rPr>
-        <w:t xml:space="preserve">Strategic Collaboration</w:t>
-      </w:r>
-      <w:r>
-        <w:rPr>
-          <w:rFonts w:ascii="Times New Roman" w:cs="Times New Roman" w:eastAsia="Times New Roman" w:hAnsi="Times New Roman"/>
-          <w:sz w:val="20"/>
-          <w:szCs w:val="20"/>
-          <w:rtl w:val="0"/>
-        </w:rPr>
-        <w:t xml:space="preserve">: Partnered with the Raleigh chapter of </w:t>
-      </w:r>
-      <w:r>
-        <w:rPr>
-          <w:rFonts w:ascii="Times New Roman" w:cs="Times New Roman" w:eastAsia="Times New Roman" w:hAnsi="Times New Roman"/>
-          <w:b w:val="1"/>
-          <w:bCs w:val="1"/>
-          <w:sz w:val="20"/>
-          <w:szCs w:val="20"/>
-          <w:rtl w:val="0"/>
-        </w:rPr>
-        <w:t xml:space="preserve">Blacks in Technology (BIT)</w:t>
-      </w:r>
-      <w:r>
-        <w:rPr>
-          <w:rFonts w:ascii="Times New Roman" w:cs="Times New Roman" w:eastAsia="Times New Roman" w:hAnsi="Times New Roman"/>
-          <w:sz w:val="20"/>
-          <w:szCs w:val="20"/>
-          <w:rtl w:val="0"/>
-        </w:rPr>
-        <w:t xml:space="preserve"> to co-coordinate a collaborative professional event in observance of Black History Month.</w:t>
-      </w:r>
-    </w:p>
-    <w:p>
-      <w:pPr>
-        <w:widowControl w:val="0"/>
-        <w:numPr>
-          <w:ilvl w:val="0"/>
-          <w:numId w:val="1"/>
-        </w:numPr>
-        <w:spacing w:after="0" w:before="0" w:line="227.99999999999997" w:lineRule="auto"/>
-        <w:ind w:left="720" w:hanging="360"/>
-        <w:rPr>
-          <w:rFonts w:ascii="Times New Roman" w:cs="Times New Roman" w:eastAsia="Times New Roman" w:hAnsi="Times New Roman"/>
-          <w:b w:val="1"/>
-          <w:bCs w:val="1"/>
-          <w:sz w:val="20"/>
-          <w:szCs w:val="20"/>
-        </w:rPr>
-      </w:pPr>
-      <w:r>
-        <w:rPr>
-          <w:rFonts w:ascii="Times New Roman" w:cs="Times New Roman" w:eastAsia="Times New Roman" w:hAnsi="Times New Roman"/>
-          <w:b w:val="1"/>
-          <w:bCs w:val="1"/>
-          <w:sz w:val="20"/>
-          <w:szCs w:val="20"/>
-          <w:rtl w:val="0"/>
-        </w:rPr>
-        <w:t xml:space="preserve">Career Development</w:t>
-      </w:r>
-      <w:r>
-        <w:rPr>
-          <w:rFonts w:ascii="Times New Roman" w:cs="Times New Roman" w:eastAsia="Times New Roman" w:hAnsi="Times New Roman"/>
-          <w:sz w:val="20"/>
-          <w:szCs w:val="20"/>
-          <w:rtl w:val="0"/>
-        </w:rPr>
-        <w:t xml:space="preserve">: Managed organization and tabling logistics for corporate partners during our career fairs to facilitate networking opportunities for members.</w:t>
+          <w:sz w:val="20"/>
+          <w:szCs w:val="20"/>
+        </w:rPr>
+      </w:pPr>
+      <w:r>
+        <w:rPr>
+          <w:rFonts w:ascii="Times New Roman" w:cs="Times New Roman" w:eastAsia="Times New Roman" w:hAnsi="Times New Roman"/>
+          <w:b w:val="1"/>
+          <w:bCs w:val="1"/>
+          <w:sz w:val="20"/>
+          <w:szCs w:val="20"/>
+          <w:rtl w:val="0"/>
+        </w:rPr>
+        <w:t xml:space="preserve">Hardware Integration:</w:t>
+      </w:r>
+      <w:r>
+        <w:rPr>
+          <w:rFonts w:ascii="Times New Roman" w:cs="Times New Roman" w:eastAsia="Times New Roman" w:hAnsi="Times New Roman"/>
+          <w:sz w:val="20"/>
+          <w:szCs w:val="20"/>
+          <w:rtl w:val="0"/>
+        </w:rPr>
+        <w:t xml:space="preserve"> Coordinating with neurotech industry partners to integrate high-fidelity EEG headsets for future-phase projects, including brain-controlled robotics (RC cars) and neuro-feedback gaming environments.</w:t>
+      </w:r>
+      <w:r>
+        <w:rPr>
+          <w:rtl w:val="0"/>
+        </w:rPr>
       </w:r>
     </w:p>
     <w:p>
@@ -1073,29 +1250,52 @@
           <w:szCs w:val="20"/>
           <w:rtl w:val="0"/>
         </w:rPr>
-        <w:t xml:space="preserve">Neural-Logic AAC</w:t>
-      </w:r>
-      <w:r>
-        <w:rPr>
-          <w:rFonts w:ascii="Times New Roman" w:cs="Times New Roman" w:eastAsia="Times New Roman" w:hAnsi="Times New Roman"/>
-          <w:b w:val="1"/>
-          <w:bCs w:val="1"/>
-          <w:sz w:val="20"/>
-          <w:szCs w:val="20"/>
-          <w:rtl w:val="0"/>
-        </w:rPr>
-        <w:t xml:space="preserve"> – </w:t>
-      </w:r>
-      <w:r>
-        <w:rPr>
-          <w:rFonts w:ascii="Times New Roman" w:cs="Times New Roman" w:eastAsia="Times New Roman" w:hAnsi="Times New Roman"/>
-          <w:sz w:val="20"/>
-          <w:szCs w:val="20"/>
-          <w:rtl w:val="0"/>
-        </w:rPr>
-        <w:t xml:space="preserve">Real-time EEG signal processing &amp; AI-powered assistive technology</w:t>
-        <w:tab/>
-        <w:t xml:space="preserve">           </w:t>
+        <w:t xml:space="preserve">CogniShift</w:t>
+      </w:r>
+      <w:r>
+        <w:rPr>
+          <w:rFonts w:ascii="Times New Roman" w:cs="Times New Roman" w:eastAsia="Times New Roman" w:hAnsi="Times New Roman"/>
+          <w:b w:val="1"/>
+          <w:bCs w:val="1"/>
+          <w:sz w:val="20"/>
+          <w:szCs w:val="20"/>
+          <w:rtl w:val="0"/>
+        </w:rPr>
+        <w:t xml:space="preserve">– </w:t>
+      </w:r>
+      <w:r>
+        <w:rPr>
+          <w:rFonts w:ascii="Times New Roman" w:cs="Times New Roman" w:eastAsia="Times New Roman" w:hAnsi="Times New Roman"/>
+          <w:b w:val="1"/>
+          <w:bCs w:val="1"/>
+          <w:sz w:val="20"/>
+          <w:szCs w:val="20"/>
+          <w:rtl w:val="0"/>
+        </w:rPr>
+        <w:t xml:space="preserve">br41n.io</w:t>
+      </w:r>
+      <w:r>
+        <w:rPr>
+          <w:rFonts w:ascii="Times New Roman" w:cs="Times New Roman" w:eastAsia="Times New Roman" w:hAnsi="Times New Roman"/>
+          <w:b w:val="1"/>
+          <w:bCs w:val="1"/>
+          <w:sz w:val="20"/>
+          <w:szCs w:val="20"/>
+          <w:rtl w:val="0"/>
+        </w:rPr>
+        <w:t xml:space="preserve"> BCI Hackathon (3rd Place) | Raleigh, NC</w:t>
+      </w:r>
+      <w:r>
+        <w:rPr>
+          <w:rFonts w:ascii="Times New Roman" w:cs="Times New Roman" w:eastAsia="Times New Roman" w:hAnsi="Times New Roman"/>
+          <w:sz w:val="20"/>
+          <w:szCs w:val="20"/>
+          <w:rtl w:val="0"/>
+        </w:rPr>
+        <w:tab/>
+        <w:t xml:space="preserve">          </w:t>
+        <w:tab/>
+        <w:t xml:space="preserve">                                       </w:t>
       </w:r>
       <w:r>
         <w:rPr>
@@ -1108,66 +1308,18 @@
           <w:szCs w:val="20"/>
           <w:rtl w:val="0"/>
         </w:rPr>
-        <w:t xml:space="preserve">2025-Present</w:t>
-      </w:r>
-    </w:p>
-    <w:p>
-      <w:pPr>
-        <w:widowControl w:val="0"/>
-        <w:numPr>
-          <w:ilvl w:val="0"/>
-          <w:numId w:val="5"/>
-        </w:numPr>
-        <w:spacing w:after="0" w:before="0" w:line="227.99999999999997" w:lineRule="auto"/>
-        <w:ind w:left="720" w:right="300" w:hanging="360"/>
-        <w:rPr>
-          <w:rFonts w:ascii="Times New Roman" w:cs="Times New Roman" w:eastAsia="Times New Roman" w:hAnsi="Times New Roman"/>
-          <w:sz w:val="20"/>
-          <w:szCs w:val="20"/>
-          <w:u w:val="none"/>
-        </w:rPr>
-      </w:pPr>
-      <w:r>
-        <w:rPr>
-          <w:rFonts w:ascii="Times New Roman" w:cs="Times New Roman" w:eastAsia="Times New Roman" w:hAnsi="Times New Roman"/>
-          <w:sz w:val="20"/>
-          <w:szCs w:val="20"/>
-          <w:rtl w:val="0"/>
-        </w:rPr>
-        <w:t xml:space="preserve">Architected an end-to-end signal processing pipeline to filter raw EEG data and map neural patterns to physical and digital actions, such as mind-controlled gaming and assistive communication.</w:t>
-      </w:r>
-    </w:p>
-    <w:p>
-      <w:pPr>
-        <w:widowControl w:val="0"/>
-        <w:numPr>
-          <w:ilvl w:val="0"/>
-          <w:numId w:val="5"/>
-        </w:numPr>
-        <w:spacing w:after="0" w:before="0" w:line="227.99999999999997" w:lineRule="auto"/>
-        <w:ind w:left="720" w:right="300" w:hanging="360"/>
-        <w:rPr>
-          <w:rFonts w:ascii="Times New Roman" w:cs="Times New Roman" w:eastAsia="Times New Roman" w:hAnsi="Times New Roman"/>
-          <w:sz w:val="20"/>
-          <w:szCs w:val="20"/>
-          <w:u w:val="none"/>
-        </w:rPr>
-      </w:pPr>
-      <w:r>
-        <w:rPr>
-          <w:rFonts w:ascii="Times New Roman" w:cs="Times New Roman" w:eastAsia="Times New Roman" w:hAnsi="Times New Roman"/>
-          <w:sz w:val="20"/>
-          <w:szCs w:val="20"/>
-          <w:rtl w:val="0"/>
-        </w:rPr>
-        <w:t xml:space="preserve">Engineering a communication interface designed for children with motor impairments, prioritizing low-latency signal-to-text translation.</w:t>
-      </w:r>
-    </w:p>
-    <w:p>
-      <w:pPr>
-        <w:widowControl w:val="0"/>
-        <w:spacing w:after="0" w:before="0" w:line="227.99999999999997" w:lineRule="auto"/>
-        <w:ind w:right="300"/>
+        <w:t xml:space="preserve">April</w:t>
+      </w:r>
+      <w:r>
+        <w:rPr>
+          <w:rFonts w:ascii="Times New Roman" w:cs="Times New Roman" w:eastAsia="Times New Roman" w:hAnsi="Times New Roman"/>
+          <w:sz w:val="20"/>
+          <w:szCs w:val="20"/>
+          <w:rtl w:val="0"/>
+        </w:rPr>
+        <w:t xml:space="preserve"> </w:t>
+      </w:r>
+      <w:r>
         <w:rPr>
           <w:rFonts w:ascii="Times New Roman" w:cs="Times New Roman" w:eastAsia="Times New Roman" w:hAnsi="Times New Roman"/>
           <w:b w:val="1"/>
@@ -1176,215 +1328,9 @@
           <w:iCs w:val="1"/>
           <w:sz w:val="20"/>
           <w:szCs w:val="20"/>
-        </w:rPr>
-      </w:pPr>
-      <w:r>
-        <w:rPr>
-          <w:rFonts w:ascii="Times New Roman" w:cs="Times New Roman" w:eastAsia="Times New Roman" w:hAnsi="Times New Roman"/>
-          <w:b w:val="1"/>
-          <w:bCs w:val="1"/>
-          <w:i w:val="1"/>
-          <w:iCs w:val="1"/>
-          <w:sz w:val="20"/>
-          <w:szCs w:val="20"/>
-          <w:rtl w:val="0"/>
-        </w:rPr>
-        <w:t xml:space="preserve">CageIntel </w:t>
-      </w:r>
-      <w:r>
-        <w:rPr>
-          <w:rFonts w:ascii="Times New Roman" w:cs="Times New Roman" w:eastAsia="Times New Roman" w:hAnsi="Times New Roman"/>
-          <w:b w:val="1"/>
-          <w:bCs w:val="1"/>
-          <w:sz w:val="20"/>
-          <w:szCs w:val="20"/>
-          <w:rtl w:val="0"/>
-        </w:rPr>
-        <w:t xml:space="preserve">–</w:t>
-      </w:r>
-      <w:r>
-        <w:rPr>
-          <w:rFonts w:ascii="Times New Roman" w:cs="Times New Roman" w:eastAsia="Times New Roman" w:hAnsi="Times New Roman"/>
-          <w:b w:val="1"/>
-          <w:bCs w:val="1"/>
-          <w:i w:val="1"/>
-          <w:iCs w:val="1"/>
-          <w:sz w:val="20"/>
-          <w:szCs w:val="20"/>
-          <w:rtl w:val="0"/>
-        </w:rPr>
-        <w:t xml:space="preserve"> </w:t>
-      </w:r>
-      <w:r>
-        <w:rPr>
-          <w:rFonts w:ascii="Times New Roman" w:cs="Times New Roman" w:eastAsia="Times New Roman" w:hAnsi="Times New Roman"/>
-          <w:sz w:val="20"/>
-          <w:szCs w:val="20"/>
-          <w:rtl w:val="0"/>
-        </w:rPr>
-        <w:t xml:space="preserve">AI-powered UFC analytics application</w:t>
-        <w:tab/>
-      </w:r>
-      <w:r>
-        <w:rPr>
-          <w:rFonts w:ascii="Times New Roman" w:cs="Times New Roman" w:eastAsia="Times New Roman" w:hAnsi="Times New Roman"/>
-          <w:i w:val="1"/>
-          <w:iCs w:val="1"/>
-          <w:sz w:val="20"/>
-          <w:szCs w:val="20"/>
-          <w:rtl w:val="0"/>
-        </w:rPr>
-        <w:tab/>
-        <w:tab/>
-        <w:tab/>
-        <w:tab/>
-        <w:tab/>
-        <w:t xml:space="preserve">           </w:t>
-      </w:r>
-      <w:r>
-        <w:rPr>
-          <w:rFonts w:ascii="Times New Roman" w:cs="Times New Roman" w:eastAsia="Times New Roman" w:hAnsi="Times New Roman"/>
-          <w:b w:val="1"/>
-          <w:bCs w:val="1"/>
-          <w:i w:val="1"/>
-          <w:iCs w:val="1"/>
-          <w:sz w:val="20"/>
-          <w:szCs w:val="20"/>
-          <w:rtl w:val="0"/>
-        </w:rPr>
-        <w:t xml:space="preserve">2025-Present</w:t>
-      </w:r>
-    </w:p>
-    <w:p>
-      <w:pPr>
-        <w:widowControl w:val="0"/>
-        <w:numPr>
-          <w:ilvl w:val="0"/>
-          <w:numId w:val="2"/>
-        </w:numPr>
-        <w:spacing w:after="0" w:before="0" w:line="227.99999999999997" w:lineRule="auto"/>
-        <w:ind w:left="720" w:right="137.95166015625" w:hanging="360"/>
-        <w:rPr>
-          <w:rFonts w:ascii="Times New Roman" w:cs="Times New Roman" w:eastAsia="Times New Roman" w:hAnsi="Times New Roman"/>
-          <w:sz w:val="20"/>
-          <w:szCs w:val="20"/>
-        </w:rPr>
-      </w:pPr>
-      <w:r>
-        <w:rPr>
-          <w:rFonts w:ascii="Times New Roman" w:cs="Times New Roman" w:eastAsia="Times New Roman" w:hAnsi="Times New Roman"/>
-          <w:sz w:val="20"/>
-          <w:szCs w:val="20"/>
-          <w:rtl w:val="0"/>
-        </w:rPr>
-        <w:t xml:space="preserve">Built a Python scraper using BeautifulSoup &amp; Requests to create a comprehensive dataset of UFC fight stats, including detailed round-by-round data from ufcstats.com.</w:t>
-      </w:r>
-    </w:p>
-    <w:p>
-      <w:pPr>
-        <w:widowControl w:val="0"/>
-        <w:numPr>
-          <w:ilvl w:val="0"/>
-          <w:numId w:val="2"/>
-        </w:numPr>
-        <w:spacing w:after="0" w:before="0" w:line="227.99999999999997" w:lineRule="auto"/>
-        <w:ind w:left="720" w:right="137.95166015625" w:hanging="360"/>
-        <w:rPr>
-          <w:rFonts w:ascii="Times New Roman" w:cs="Times New Roman" w:eastAsia="Times New Roman" w:hAnsi="Times New Roman"/>
-          <w:sz w:val="20"/>
-          <w:szCs w:val="20"/>
-        </w:rPr>
-      </w:pPr>
-      <w:r>
-        <w:rPr>
-          <w:rFonts w:ascii="Times New Roman" w:cs="Times New Roman" w:eastAsia="Times New Roman" w:hAnsi="Times New Roman"/>
-          <w:sz w:val="20"/>
-          <w:szCs w:val="20"/>
-          <w:rtl w:val="0"/>
-        </w:rPr>
-        <w:t xml:space="preserve">Trained a PyTorch model on the collected data to forecast winners.</w:t>
-      </w:r>
-    </w:p>
-    <w:p>
-      <w:pPr>
-        <w:widowControl w:val="0"/>
-        <w:numPr>
-          <w:ilvl w:val="0"/>
-          <w:numId w:val="2"/>
-        </w:numPr>
-        <w:spacing w:after="0" w:before="0" w:line="227.99999999999997" w:lineRule="auto"/>
-        <w:ind w:left="720" w:right="137.95166015625" w:hanging="360"/>
-        <w:rPr>
-          <w:rFonts w:ascii="Times New Roman" w:cs="Times New Roman" w:eastAsia="Times New Roman" w:hAnsi="Times New Roman"/>
-          <w:sz w:val="20"/>
-          <w:szCs w:val="20"/>
-          <w:u w:val="none"/>
-        </w:rPr>
-      </w:pPr>
-      <w:r>
-        <w:rPr>
-          <w:rFonts w:ascii="Times New Roman" w:cs="Times New Roman" w:eastAsia="Times New Roman" w:hAnsi="Times New Roman"/>
-          <w:sz w:val="20"/>
-          <w:szCs w:val="20"/>
-          <w:rtl w:val="0"/>
-        </w:rPr>
-        <w:t xml:space="preserve">Containerizing the full-stack application to ensure consistent, isolated environments and enable CI/CD.</w:t>
-      </w:r>
-    </w:p>
-    <w:p>
-      <w:pPr>
-        <w:widowControl w:val="0"/>
-        <w:spacing w:after="0" w:before="0" w:line="227.99999999999997" w:lineRule="auto"/>
-        <w:ind w:left="0" w:right="137.95166015625" w:firstLine="0"/>
-        <w:rPr>
-          <w:rFonts w:ascii="Times New Roman" w:cs="Times New Roman" w:eastAsia="Times New Roman" w:hAnsi="Times New Roman"/>
-          <w:b w:val="1"/>
-          <w:bCs w:val="1"/>
-          <w:i w:val="1"/>
-          <w:iCs w:val="1"/>
-          <w:sz w:val="20"/>
-          <w:szCs w:val="20"/>
-        </w:rPr>
-      </w:pPr>
-      <w:r>
-        <w:rPr>
-          <w:rFonts w:ascii="Times New Roman" w:cs="Times New Roman" w:eastAsia="Times New Roman" w:hAnsi="Times New Roman"/>
-          <w:b w:val="1"/>
-          <w:bCs w:val="1"/>
-          <w:i w:val="1"/>
-          <w:iCs w:val="1"/>
-          <w:sz w:val="20"/>
-          <w:szCs w:val="20"/>
-          <w:rtl w:val="0"/>
-        </w:rPr>
-        <w:t xml:space="preserve">Compressed File Archiver (Snark)</w:t>
-      </w:r>
-      <w:r>
-        <w:rPr>
-          <w:rFonts w:ascii="Times New Roman" w:cs="Times New Roman" w:eastAsia="Times New Roman" w:hAnsi="Times New Roman"/>
-          <w:sz w:val="20"/>
-          <w:szCs w:val="20"/>
-          <w:rtl w:val="0"/>
-        </w:rPr>
-        <w:t xml:space="preserve"> – C &amp; Software Tools Project</w:t>
-        <w:tab/>
-        <w:tab/>
-        <w:tab/>
-        <w:tab/>
-        <w:t xml:space="preserve">           </w:t>
-      </w:r>
-      <w:r>
-        <w:rPr>
-          <w:rFonts w:ascii="Times New Roman" w:cs="Times New Roman" w:eastAsia="Times New Roman" w:hAnsi="Times New Roman"/>
-          <w:b w:val="1"/>
-          <w:bCs w:val="1"/>
-          <w:i w:val="1"/>
-          <w:iCs w:val="1"/>
-          <w:sz w:val="20"/>
-          <w:szCs w:val="20"/>
-          <w:rtl w:val="0"/>
-        </w:rPr>
-        <w:t xml:space="preserve">2025-2025</w:t>
+          <w:rtl w:val="0"/>
+        </w:rPr>
+        <w:t xml:space="preserve">2026</w:t>
       </w:r>
     </w:p>
     <w:p>
@@ -1395,61 +1341,60 @@
           <w:numId w:val="4"/>
         </w:numPr>
         <w:spacing w:after="0" w:before="0" w:line="227.99999999999997" w:lineRule="auto"/>
-        <w:ind w:left="720" w:right="137.95166015625" w:hanging="360"/>
-        <w:rPr>
-          <w:rFonts w:ascii="Times New Roman" w:cs="Times New Roman" w:eastAsia="Times New Roman" w:hAnsi="Times New Roman"/>
-          <w:sz w:val="20"/>
-          <w:szCs w:val="20"/>
-        </w:rPr>
-      </w:pPr>
-      <w:r>
-        <w:rPr>
-          <w:rFonts w:ascii="Times New Roman" w:cs="Times New Roman" w:eastAsia="Times New Roman" w:hAnsi="Times New Roman"/>
-          <w:sz w:val="20"/>
-          <w:szCs w:val="20"/>
-          <w:rtl w:val="0"/>
-        </w:rPr>
-        <w:t xml:space="preserve">Developed a C-based command-line program to create and extract files from a custom-format compressed archive, similar to </w:t>
-      </w:r>
-      <w:r>
-        <w:rPr>
-          <w:rFonts w:ascii="Times New Roman" w:cs="Times New Roman" w:eastAsia="Times New Roman" w:hAnsi="Times New Roman"/>
-          <w:b w:val="1"/>
-          <w:bCs w:val="1"/>
-          <w:sz w:val="20"/>
-          <w:szCs w:val="20"/>
-          <w:rtl w:val="0"/>
-        </w:rPr>
-        <w:t xml:space="preserve">tar</w:t>
-      </w:r>
-      <w:r>
-        <w:rPr>
-          <w:rFonts w:ascii="Times New Roman" w:cs="Times New Roman" w:eastAsia="Times New Roman" w:hAnsi="Times New Roman"/>
-          <w:sz w:val="20"/>
-          <w:szCs w:val="20"/>
-          <w:rtl w:val="0"/>
-        </w:rPr>
-        <w:t xml:space="preserve"> or </w:t>
-      </w:r>
-      <w:r>
-        <w:rPr>
-          <w:rFonts w:ascii="Times New Roman" w:cs="Times New Roman" w:eastAsia="Times New Roman" w:hAnsi="Times New Roman"/>
-          <w:b w:val="1"/>
-          <w:bCs w:val="1"/>
-          <w:sz w:val="20"/>
-          <w:szCs w:val="20"/>
-          <w:rtl w:val="0"/>
-        </w:rPr>
-        <w:t xml:space="preserve">zip</w:t>
-      </w:r>
-      <w:r>
-        <w:rPr>
-          <w:rFonts w:ascii="Times New Roman" w:cs="Times New Roman" w:eastAsia="Times New Roman" w:hAnsi="Times New Roman"/>
-          <w:sz w:val="20"/>
-          <w:szCs w:val="20"/>
-          <w:rtl w:val="0"/>
-        </w:rPr>
-        <w:t xml:space="preserve">. </w:t>
+        <w:ind w:left="720" w:right="300" w:hanging="360"/>
+        <w:rPr>
+          <w:rFonts w:ascii="Times New Roman" w:cs="Times New Roman" w:eastAsia="Times New Roman" w:hAnsi="Times New Roman"/>
+          <w:sz w:val="20"/>
+          <w:szCs w:val="20"/>
+          <w:u w:val="none"/>
+        </w:rPr>
+      </w:pPr>
+      <w:r>
+        <w:rPr>
+          <w:rFonts w:ascii="Times New Roman" w:cs="Times New Roman" w:eastAsia="Times New Roman" w:hAnsi="Times New Roman"/>
+          <w:sz w:val="20"/>
+          <w:szCs w:val="20"/>
+          <w:rtl w:val="0"/>
+        </w:rPr>
+        <w:t xml:space="preserve">Secured 3rd place and the highest concept grade at the </w:t>
+      </w:r>
+      <w:r>
+        <w:rPr>
+          <w:rFonts w:ascii="Times New Roman" w:cs="Times New Roman" w:eastAsia="Times New Roman" w:hAnsi="Times New Roman"/>
+          <w:sz w:val="20"/>
+          <w:szCs w:val="20"/>
+          <w:rtl w:val="0"/>
+        </w:rPr>
+        <w:t xml:space="preserve">br41n.io</w:t>
+      </w:r>
+      <w:r>
+        <w:rPr>
+          <w:rFonts w:ascii="Times New Roman" w:cs="Times New Roman" w:eastAsia="Times New Roman" w:hAnsi="Times New Roman"/>
+          <w:sz w:val="20"/>
+          <w:szCs w:val="20"/>
+          <w:rtl w:val="0"/>
+        </w:rPr>
+        <w:t xml:space="preserve"> BCI hackathon by architecting a system that maps real-time EEG wave data to musical stimuli utilizing Neuropawn headsets and their </w:t>
+      </w:r>
+      <w:r>
+        <w:rPr>
+          <w:rFonts w:ascii="Times New Roman" w:cs="Times New Roman" w:eastAsia="Times New Roman" w:hAnsi="Times New Roman"/>
+          <w:b w:val="1"/>
+          <w:bCs w:val="1"/>
+          <w:sz w:val="20"/>
+          <w:szCs w:val="20"/>
+          <w:rtl w:val="0"/>
+        </w:rPr>
+        <w:t xml:space="preserve">BrainFlow repository</w:t>
+      </w:r>
+      <w:r>
+        <w:rPr>
+          <w:rFonts w:ascii="Times New Roman" w:cs="Times New Roman" w:eastAsia="Times New Roman" w:hAnsi="Times New Roman"/>
+          <w:sz w:val="20"/>
+          <w:szCs w:val="20"/>
+          <w:rtl w:val="0"/>
+        </w:rPr>
+        <w:t xml:space="preserve"> for neural signal interfacing.</w:t>
       </w:r>
     </w:p>
     <w:p>
@@ -1460,6 +1405,127 @@
           <w:numId w:val="4"/>
         </w:numPr>
         <w:spacing w:after="0" w:before="0" w:line="227.99999999999997" w:lineRule="auto"/>
+        <w:ind w:left="720" w:right="300" w:hanging="360"/>
+        <w:rPr>
+          <w:rFonts w:ascii="Times New Roman" w:cs="Times New Roman" w:eastAsia="Times New Roman" w:hAnsi="Times New Roman"/>
+          <w:sz w:val="20"/>
+          <w:szCs w:val="20"/>
+          <w:u w:val="none"/>
+        </w:rPr>
+      </w:pPr>
+      <w:r>
+        <w:rPr>
+          <w:rFonts w:ascii="Times New Roman" w:cs="Times New Roman" w:eastAsia="Times New Roman" w:hAnsi="Times New Roman"/>
+          <w:sz w:val="20"/>
+          <w:szCs w:val="20"/>
+          <w:rtl w:val="0"/>
+        </w:rPr>
+        <w:t xml:space="preserve">Collaborated on an end-to-end signal processing pipeline to isolate specific neural frequencies and translate them into interactive audio environments.</w:t>
+      </w:r>
+    </w:p>
+    <w:p>
+      <w:pPr>
+        <w:widowControl w:val="0"/>
+        <w:spacing w:line="227.99999999999997" w:lineRule="auto"/>
+        <w:ind w:right="137.95166015625"/>
+        <w:rPr>
+          <w:rFonts w:ascii="Times New Roman" w:cs="Times New Roman" w:eastAsia="Times New Roman" w:hAnsi="Times New Roman"/>
+          <w:b w:val="1"/>
+          <w:bCs w:val="1"/>
+          <w:i w:val="1"/>
+          <w:iCs w:val="1"/>
+          <w:sz w:val="20"/>
+          <w:szCs w:val="20"/>
+        </w:rPr>
+      </w:pPr>
+      <w:r>
+        <w:rPr>
+          <w:rFonts w:ascii="Times New Roman" w:cs="Times New Roman" w:eastAsia="Times New Roman" w:hAnsi="Times New Roman"/>
+          <w:b w:val="1"/>
+          <w:bCs w:val="1"/>
+          <w:i w:val="1"/>
+          <w:iCs w:val="1"/>
+          <w:sz w:val="20"/>
+          <w:szCs w:val="20"/>
+          <w:rtl w:val="0"/>
+        </w:rPr>
+        <w:t xml:space="preserve">Down Under</w:t>
+      </w:r>
+      <w:r>
+        <w:rPr>
+          <w:rFonts w:ascii="Times New Roman" w:cs="Times New Roman" w:eastAsia="Times New Roman" w:hAnsi="Times New Roman"/>
+          <w:sz w:val="20"/>
+          <w:szCs w:val="20"/>
+          <w:rtl w:val="0"/>
+        </w:rPr>
+        <w:t xml:space="preserve"> </w:t>
+      </w:r>
+      <w:r>
+        <w:rPr>
+          <w:rFonts w:ascii="Times New Roman" w:cs="Times New Roman" w:eastAsia="Times New Roman" w:hAnsi="Times New Roman"/>
+          <w:b w:val="1"/>
+          <w:bCs w:val="1"/>
+          <w:sz w:val="20"/>
+          <w:szCs w:val="20"/>
+          <w:rtl w:val="0"/>
+        </w:rPr>
+        <w:t xml:space="preserve">– cofoundr Hackathon (Most Sustainable Product) | Raleigh, NC</w:t>
+      </w:r>
+      <w:r>
+        <w:rPr>
+          <w:rFonts w:ascii="Times New Roman" w:cs="Times New Roman" w:eastAsia="Times New Roman" w:hAnsi="Times New Roman"/>
+          <w:sz w:val="20"/>
+          <w:szCs w:val="20"/>
+          <w:rtl w:val="0"/>
+        </w:rPr>
+        <w:tab/>
+        <w:tab/>
+        <w:t xml:space="preserve">          </w:t>
+      </w:r>
+      <w:r>
+        <w:rPr>
+          <w:rFonts w:ascii="Times New Roman" w:cs="Times New Roman" w:eastAsia="Times New Roman" w:hAnsi="Times New Roman"/>
+          <w:b w:val="1"/>
+          <w:bCs w:val="1"/>
+          <w:i w:val="1"/>
+          <w:iCs w:val="1"/>
+          <w:sz w:val="20"/>
+          <w:szCs w:val="20"/>
+          <w:rtl w:val="0"/>
+        </w:rPr>
+        <w:t xml:space="preserve">March</w:t>
+      </w:r>
+      <w:r>
+        <w:rPr>
+          <w:rFonts w:ascii="Times New Roman" w:cs="Times New Roman" w:eastAsia="Times New Roman" w:hAnsi="Times New Roman"/>
+          <w:sz w:val="20"/>
+          <w:szCs w:val="20"/>
+          <w:rtl w:val="0"/>
+        </w:rPr>
+        <w:t xml:space="preserve"> </w:t>
+      </w:r>
+      <w:r>
+        <w:rPr>
+          <w:rFonts w:ascii="Times New Roman" w:cs="Times New Roman" w:eastAsia="Times New Roman" w:hAnsi="Times New Roman"/>
+          <w:b w:val="1"/>
+          <w:bCs w:val="1"/>
+          <w:i w:val="1"/>
+          <w:iCs w:val="1"/>
+          <w:sz w:val="20"/>
+          <w:szCs w:val="20"/>
+          <w:rtl w:val="0"/>
+        </w:rPr>
+        <w:t xml:space="preserve">2026</w:t>
+      </w:r>
+    </w:p>
+    <w:p>
+      <w:pPr>
+        <w:widowControl w:val="0"/>
+        <w:numPr>
+          <w:ilvl w:val="0"/>
+          <w:numId w:val="3"/>
+        </w:numPr>
+        <w:spacing w:line="227.99999999999997" w:lineRule="auto"/>
         <w:ind w:left="720" w:right="137.95166015625" w:hanging="360"/>
         <w:rPr>
           <w:rFonts w:ascii="Times New Roman" w:cs="Times New Roman" w:eastAsia="Times New Roman" w:hAnsi="Times New Roman"/>
@@ -1474,12 +1540,112 @@
           <w:szCs w:val="20"/>
           <w:rtl w:val="0"/>
         </w:rPr>
-        <w:t xml:space="preserve">Implemented file compression logic to reduce archive size and managed all file I/O operations.</w:t>
-      </w:r>
-      <w:r>
-        <w:rPr>
-          <w:rtl w:val="0"/>
-        </w:rPr>
+        <w:t xml:space="preserve">Architected a health-tech mobile platform (</w:t>
+      </w:r>
+      <w:r>
+        <w:rPr>
+          <w:rFonts w:ascii="Times New Roman" w:cs="Times New Roman" w:eastAsia="Times New Roman" w:hAnsi="Times New Roman"/>
+          <w:b w:val="1"/>
+          <w:bCs w:val="1"/>
+          <w:sz w:val="20"/>
+          <w:szCs w:val="20"/>
+          <w:rtl w:val="0"/>
+        </w:rPr>
+        <w:t xml:space="preserve">MVP</w:t>
+      </w:r>
+      <w:r>
+        <w:rPr>
+          <w:rFonts w:ascii="Times New Roman" w:cs="Times New Roman" w:eastAsia="Times New Roman" w:hAnsi="Times New Roman"/>
+          <w:sz w:val="20"/>
+          <w:szCs w:val="20"/>
+          <w:rtl w:val="0"/>
+        </w:rPr>
+        <w:t xml:space="preserve">) designed to alert college-aged women to dangerous drug contraindications between hormonal birth control and common medications. </w:t>
+      </w:r>
+    </w:p>
+    <w:p>
+      <w:pPr>
+        <w:widowControl w:val="0"/>
+        <w:numPr>
+          <w:ilvl w:val="0"/>
+          <w:numId w:val="3"/>
+        </w:numPr>
+        <w:spacing w:line="227.99999999999997" w:lineRule="auto"/>
+        <w:ind w:left="720" w:right="137.95166015625" w:hanging="360"/>
+        <w:rPr>
+          <w:rFonts w:ascii="Times New Roman" w:cs="Times New Roman" w:eastAsia="Times New Roman" w:hAnsi="Times New Roman"/>
+          <w:sz w:val="20"/>
+          <w:szCs w:val="20"/>
+        </w:rPr>
+      </w:pPr>
+      <w:r>
+        <w:rPr>
+          <w:rFonts w:ascii="Times New Roman" w:cs="Times New Roman" w:eastAsia="Times New Roman" w:hAnsi="Times New Roman"/>
+          <w:sz w:val="20"/>
+          <w:szCs w:val="20"/>
+          <w:rtl w:val="0"/>
+        </w:rPr>
+        <w:t xml:space="preserve">Integrated </w:t>
+      </w:r>
+      <w:r>
+        <w:rPr>
+          <w:rFonts w:ascii="Times New Roman" w:cs="Times New Roman" w:eastAsia="Times New Roman" w:hAnsi="Times New Roman"/>
+          <w:i w:val="1"/>
+          <w:iCs w:val="1"/>
+          <w:sz w:val="20"/>
+          <w:szCs w:val="20"/>
+          <w:rtl w:val="0"/>
+        </w:rPr>
+        <w:t xml:space="preserve">NLM RxNav</w:t>
+      </w:r>
+      <w:r>
+        <w:rPr>
+          <w:rFonts w:ascii="Times New Roman" w:cs="Times New Roman" w:eastAsia="Times New Roman" w:hAnsi="Times New Roman"/>
+          <w:sz w:val="20"/>
+          <w:szCs w:val="20"/>
+          <w:rtl w:val="0"/>
+        </w:rPr>
+        <w:t xml:space="preserve"> and </w:t>
+      </w:r>
+      <w:r>
+        <w:rPr>
+          <w:rFonts w:ascii="Times New Roman" w:cs="Times New Roman" w:eastAsia="Times New Roman" w:hAnsi="Times New Roman"/>
+          <w:i w:val="1"/>
+          <w:iCs w:val="1"/>
+          <w:sz w:val="20"/>
+          <w:szCs w:val="20"/>
+          <w:rtl w:val="0"/>
+        </w:rPr>
+        <w:t xml:space="preserve">openFDA </w:t>
+      </w:r>
+      <w:r>
+        <w:rPr>
+          <w:rFonts w:ascii="Times New Roman" w:cs="Times New Roman" w:eastAsia="Times New Roman" w:hAnsi="Times New Roman"/>
+          <w:sz w:val="20"/>
+          <w:szCs w:val="20"/>
+          <w:rtl w:val="0"/>
+        </w:rPr>
+        <w:t xml:space="preserve">drug-label </w:t>
+      </w:r>
+      <w:r>
+        <w:rPr>
+          <w:rFonts w:ascii="Times New Roman" w:cs="Times New Roman" w:eastAsia="Times New Roman" w:hAnsi="Times New Roman"/>
+          <w:b w:val="1"/>
+          <w:bCs w:val="1"/>
+          <w:sz w:val="20"/>
+          <w:szCs w:val="20"/>
+          <w:rtl w:val="0"/>
+        </w:rPr>
+        <w:t xml:space="preserve">APIs</w:t>
+      </w:r>
+      <w:r>
+        <w:rPr>
+          <w:rFonts w:ascii="Times New Roman" w:cs="Times New Roman" w:eastAsia="Times New Roman" w:hAnsi="Times New Roman"/>
+          <w:sz w:val="20"/>
+          <w:szCs w:val="20"/>
+          <w:rtl w:val="0"/>
+        </w:rPr>
+        <w:t xml:space="preserve"> to power medication search, RxCUI-based interaction checks, and supplemental label-derived interaction text in a Node/Express service.</w:t>
       </w:r>
     </w:p>
     <w:p>
@@ -1508,44 +1674,70 @@
           <w:szCs w:val="20"/>
           <w:rtl w:val="0"/>
         </w:rPr>
-        <w:t xml:space="preserve">Password Manager – </w:t>
-      </w:r>
-      <w:r>
-        <w:rPr>
-          <w:rFonts w:ascii="Times New Roman" w:cs="Times New Roman" w:eastAsia="Times New Roman" w:hAnsi="Times New Roman"/>
-          <w:sz w:val="20"/>
-          <w:szCs w:val="20"/>
-          <w:rtl w:val="0"/>
-        </w:rPr>
-        <w:t xml:space="preserve">Python-based password storage application</w:t>
-      </w:r>
-      <w:r>
-        <w:rPr>
-          <w:rFonts w:ascii="Times New Roman" w:cs="Times New Roman" w:eastAsia="Times New Roman" w:hAnsi="Times New Roman"/>
+        <w:t xml:space="preserve">CageIntel </w:t>
+      </w:r>
+      <w:r>
+        <w:rPr>
+          <w:rFonts w:ascii="Times New Roman" w:cs="Times New Roman" w:eastAsia="Times New Roman" w:hAnsi="Times New Roman"/>
+          <w:b w:val="1"/>
+          <w:bCs w:val="1"/>
+          <w:sz w:val="20"/>
+          <w:szCs w:val="20"/>
+          <w:rtl w:val="0"/>
+        </w:rPr>
+        <w:t xml:space="preserve">–</w:t>
+      </w:r>
+      <w:r>
+        <w:rPr>
+          <w:rFonts w:ascii="Times New Roman" w:cs="Times New Roman" w:eastAsia="Times New Roman" w:hAnsi="Times New Roman"/>
+          <w:b w:val="1"/>
+          <w:bCs w:val="1"/>
           <w:i w:val="1"/>
           <w:iCs w:val="1"/>
           <w:sz w:val="20"/>
           <w:szCs w:val="20"/>
           <w:rtl w:val="0"/>
         </w:rPr>
-        <w:tab/>
-        <w:tab/>
-        <w:tab/>
-        <w:tab/>
-        <w:t xml:space="preserve">           </w:t>
-      </w:r>
-      <w:r>
-        <w:rPr>
-          <w:rFonts w:ascii="Times New Roman" w:cs="Times New Roman" w:eastAsia="Times New Roman" w:hAnsi="Times New Roman"/>
-          <w:b w:val="1"/>
-          <w:bCs w:val="1"/>
+        <w:t xml:space="preserve"> </w:t>
+      </w:r>
+      <w:r>
+        <w:rPr>
+          <w:rFonts w:ascii="Times New Roman" w:cs="Times New Roman" w:eastAsia="Times New Roman" w:hAnsi="Times New Roman"/>
+          <w:sz w:val="20"/>
+          <w:szCs w:val="20"/>
+          <w:rtl w:val="0"/>
+        </w:rPr>
+        <w:t xml:space="preserve">AI-powered UFC analytics application</w:t>
+        <w:tab/>
+      </w:r>
+      <w:r>
+        <w:rPr>
+          <w:rFonts w:ascii="Times New Roman" w:cs="Times New Roman" w:eastAsia="Times New Roman" w:hAnsi="Times New Roman"/>
           <w:i w:val="1"/>
           <w:iCs w:val="1"/>
           <w:sz w:val="20"/>
           <w:szCs w:val="20"/>
           <w:rtl w:val="0"/>
         </w:rPr>
-        <w:t xml:space="preserve">2022-2023</w:t>
+        <w:tab/>
+        <w:tab/>
+        <w:tab/>
+        <w:tab/>
+        <w:tab/>
+        <w:t xml:space="preserve">          </w:t>
+      </w:r>
+      <w:r>
+        <w:rPr>
+          <w:rFonts w:ascii="Times New Roman" w:cs="Times New Roman" w:eastAsia="Times New Roman" w:hAnsi="Times New Roman"/>
+          <w:b w:val="1"/>
+          <w:bCs w:val="1"/>
+          <w:i w:val="1"/>
+          <w:iCs w:val="1"/>
+          <w:sz w:val="20"/>
+          <w:szCs w:val="20"/>
+          <w:rtl w:val="0"/>
+        </w:rPr>
+        <w:t xml:space="preserve">2025-Present</w:t>
       </w:r>
     </w:p>
     <w:p>
@@ -1553,7 +1745,7 @@
         <w:widowControl w:val="0"/>
         <w:numPr>
           <w:ilvl w:val="0"/>
-          <w:numId w:val="2"/>
+          <w:numId w:val="1"/>
         </w:numPr>
         <w:spacing w:after="0" w:before="0" w:line="227.99999999999997" w:lineRule="auto"/>
         <w:ind w:left="720" w:right="137.95166015625" w:hanging="360"/>
@@ -1570,7 +1762,67 @@
           <w:szCs w:val="20"/>
           <w:rtl w:val="0"/>
         </w:rPr>
-        <w:t xml:space="preserve">Created a Python-based password database application using MySQL and Python for the full tech stack.</w:t>
+        <w:t xml:space="preserve">Built a </w:t>
+      </w:r>
+      <w:r>
+        <w:rPr>
+          <w:rFonts w:ascii="Times New Roman" w:cs="Times New Roman" w:eastAsia="Times New Roman" w:hAnsi="Times New Roman"/>
+          <w:b w:val="1"/>
+          <w:bCs w:val="1"/>
+          <w:sz w:val="20"/>
+          <w:szCs w:val="20"/>
+          <w:rtl w:val="0"/>
+        </w:rPr>
+        <w:t xml:space="preserve">Python scrape</w:t>
+      </w:r>
+      <w:r>
+        <w:rPr>
+          <w:rFonts w:ascii="Times New Roman" w:cs="Times New Roman" w:eastAsia="Times New Roman" w:hAnsi="Times New Roman"/>
+          <w:sz w:val="20"/>
+          <w:szCs w:val="20"/>
+          <w:rtl w:val="0"/>
+        </w:rPr>
+        <w:t xml:space="preserve">r using </w:t>
+      </w:r>
+      <w:r>
+        <w:rPr>
+          <w:rFonts w:ascii="Times New Roman" w:cs="Times New Roman" w:eastAsia="Times New Roman" w:hAnsi="Times New Roman"/>
+          <w:b w:val="1"/>
+          <w:bCs w:val="1"/>
+          <w:sz w:val="20"/>
+          <w:szCs w:val="20"/>
+          <w:rtl w:val="0"/>
+        </w:rPr>
+        <w:t xml:space="preserve">BeautifulSoup</w:t>
+      </w:r>
+      <w:r>
+        <w:rPr>
+          <w:rFonts w:ascii="Times New Roman" w:cs="Times New Roman" w:eastAsia="Times New Roman" w:hAnsi="Times New Roman"/>
+          <w:sz w:val="20"/>
+          <w:szCs w:val="20"/>
+          <w:rtl w:val="0"/>
+        </w:rPr>
+        <w:t xml:space="preserve"> &amp; </w:t>
+      </w:r>
+      <w:r>
+        <w:rPr>
+          <w:rFonts w:ascii="Times New Roman" w:cs="Times New Roman" w:eastAsia="Times New Roman" w:hAnsi="Times New Roman"/>
+          <w:b w:val="1"/>
+          <w:bCs w:val="1"/>
+          <w:sz w:val="20"/>
+          <w:szCs w:val="20"/>
+          <w:rtl w:val="0"/>
+        </w:rPr>
+        <w:t xml:space="preserve">Requests</w:t>
+      </w:r>
+      <w:r>
+        <w:rPr>
+          <w:rFonts w:ascii="Times New Roman" w:cs="Times New Roman" w:eastAsia="Times New Roman" w:hAnsi="Times New Roman"/>
+          <w:sz w:val="20"/>
+          <w:szCs w:val="20"/>
+          <w:rtl w:val="0"/>
+        </w:rPr>
+        <w:t xml:space="preserve"> to create a comprehensive dataset of UFC fight stats, including detailed round-by-round data from ufcstats.com.</w:t>
       </w:r>
     </w:p>
     <w:p>
@@ -1578,7 +1830,7 @@
         <w:widowControl w:val="0"/>
         <w:numPr>
           <w:ilvl w:val="0"/>
-          <w:numId w:val="2"/>
+          <w:numId w:val="1"/>
         </w:numPr>
         <w:spacing w:after="0" w:before="0" w:line="227.99999999999997" w:lineRule="auto"/>
         <w:ind w:left="720" w:right="137.95166015625" w:hanging="360"/>
@@ -1595,7 +1847,27 @@
           <w:szCs w:val="20"/>
           <w:rtl w:val="0"/>
         </w:rPr>
-        <w:t xml:space="preserve">Engineered the application to store passwords locally via a hidden folder, encrypted using the SHA-256 algorithm, and accessed via a master password.</w:t>
+        <w:t xml:space="preserve">Trained a </w:t>
+      </w:r>
+      <w:r>
+        <w:rPr>
+          <w:rFonts w:ascii="Times New Roman" w:cs="Times New Roman" w:eastAsia="Times New Roman" w:hAnsi="Times New Roman"/>
+          <w:b w:val="1"/>
+          <w:bCs w:val="1"/>
+          <w:sz w:val="20"/>
+          <w:szCs w:val="20"/>
+          <w:rtl w:val="0"/>
+        </w:rPr>
+        <w:t xml:space="preserve">PyTorch</w:t>
+      </w:r>
+      <w:r>
+        <w:rPr>
+          <w:rFonts w:ascii="Times New Roman" w:cs="Times New Roman" w:eastAsia="Times New Roman" w:hAnsi="Times New Roman"/>
+          <w:sz w:val="20"/>
+          <w:szCs w:val="20"/>
+          <w:rtl w:val="0"/>
+        </w:rPr>
+        <w:t xml:space="preserve"> model on the collected data to forecast winners.</w:t>
       </w:r>
     </w:p>
     <w:p>
@@ -1603,7 +1875,189 @@
         <w:widowControl w:val="0"/>
         <w:numPr>
           <w:ilvl w:val="0"/>
-          <w:numId w:val="2"/>
+          <w:numId w:val="1"/>
+        </w:numPr>
+        <w:spacing w:after="0" w:before="0" w:line="227.99999999999997" w:lineRule="auto"/>
+        <w:ind w:left="720" w:right="137.95166015625" w:hanging="360"/>
+        <w:rPr>
+          <w:rFonts w:ascii="Times New Roman" w:cs="Times New Roman" w:eastAsia="Times New Roman" w:hAnsi="Times New Roman"/>
+          <w:sz w:val="20"/>
+          <w:szCs w:val="20"/>
+          <w:u w:val="none"/>
+        </w:rPr>
+      </w:pPr>
+      <w:r>
+        <w:rPr>
+          <w:rFonts w:ascii="Times New Roman" w:cs="Times New Roman" w:eastAsia="Times New Roman" w:hAnsi="Times New Roman"/>
+          <w:sz w:val="20"/>
+          <w:szCs w:val="20"/>
+          <w:rtl w:val="0"/>
+        </w:rPr>
+        <w:t xml:space="preserve">Containerizing the full-stack application to ensure consistent, isolated environments and enable CI/CD.</w:t>
+      </w:r>
+    </w:p>
+    <w:p>
+      <w:pPr>
+        <w:widowControl w:val="0"/>
+        <w:spacing w:after="0" w:before="0" w:line="227.99999999999997" w:lineRule="auto"/>
+        <w:ind w:right="300"/>
+        <w:rPr>
+          <w:rFonts w:ascii="Times New Roman" w:cs="Times New Roman" w:eastAsia="Times New Roman" w:hAnsi="Times New Roman"/>
+          <w:b w:val="1"/>
+          <w:bCs w:val="1"/>
+          <w:i w:val="1"/>
+          <w:iCs w:val="1"/>
+          <w:sz w:val="20"/>
+          <w:szCs w:val="20"/>
+        </w:rPr>
+      </w:pPr>
+      <w:r>
+        <w:rPr>
+          <w:rFonts w:ascii="Times New Roman" w:cs="Times New Roman" w:eastAsia="Times New Roman" w:hAnsi="Times New Roman"/>
+          <w:b w:val="1"/>
+          <w:bCs w:val="1"/>
+          <w:i w:val="1"/>
+          <w:iCs w:val="1"/>
+          <w:sz w:val="20"/>
+          <w:szCs w:val="20"/>
+          <w:rtl w:val="0"/>
+        </w:rPr>
+        <w:t xml:space="preserve">Password Manager – </w:t>
+      </w:r>
+      <w:r>
+        <w:rPr>
+          <w:rFonts w:ascii="Times New Roman" w:cs="Times New Roman" w:eastAsia="Times New Roman" w:hAnsi="Times New Roman"/>
+          <w:sz w:val="20"/>
+          <w:szCs w:val="20"/>
+          <w:rtl w:val="0"/>
+        </w:rPr>
+        <w:t xml:space="preserve">Python-based password storage application</w:t>
+      </w:r>
+      <w:r>
+        <w:rPr>
+          <w:rFonts w:ascii="Times New Roman" w:cs="Times New Roman" w:eastAsia="Times New Roman" w:hAnsi="Times New Roman"/>
+          <w:i w:val="1"/>
+          <w:iCs w:val="1"/>
+          <w:sz w:val="20"/>
+          <w:szCs w:val="20"/>
+          <w:rtl w:val="0"/>
+        </w:rPr>
+        <w:tab/>
+        <w:tab/>
+        <w:tab/>
+        <w:tab/>
+        <w:t xml:space="preserve">          </w:t>
+      </w:r>
+      <w:r>
+        <w:rPr>
+          <w:rFonts w:ascii="Times New Roman" w:cs="Times New Roman" w:eastAsia="Times New Roman" w:hAnsi="Times New Roman"/>
+          <w:b w:val="1"/>
+          <w:bCs w:val="1"/>
+          <w:i w:val="1"/>
+          <w:iCs w:val="1"/>
+          <w:sz w:val="20"/>
+          <w:szCs w:val="20"/>
+          <w:rtl w:val="0"/>
+        </w:rPr>
+        <w:t xml:space="preserve">2022-2023</w:t>
+      </w:r>
+    </w:p>
+    <w:p>
+      <w:pPr>
+        <w:widowControl w:val="0"/>
+        <w:numPr>
+          <w:ilvl w:val="0"/>
+          <w:numId w:val="1"/>
+        </w:numPr>
+        <w:spacing w:after="0" w:before="0" w:line="227.99999999999997" w:lineRule="auto"/>
+        <w:ind w:left="720" w:right="137.95166015625" w:hanging="360"/>
+        <w:rPr>
+          <w:rFonts w:ascii="Times New Roman" w:cs="Times New Roman" w:eastAsia="Times New Roman" w:hAnsi="Times New Roman"/>
+          <w:sz w:val="20"/>
+          <w:szCs w:val="20"/>
+        </w:rPr>
+      </w:pPr>
+      <w:r>
+        <w:rPr>
+          <w:rFonts w:ascii="Times New Roman" w:cs="Times New Roman" w:eastAsia="Times New Roman" w:hAnsi="Times New Roman"/>
+          <w:sz w:val="20"/>
+          <w:szCs w:val="20"/>
+          <w:rtl w:val="0"/>
+        </w:rPr>
+        <w:t xml:space="preserve">Created a Python-based password database application using </w:t>
+      </w:r>
+      <w:r>
+        <w:rPr>
+          <w:rFonts w:ascii="Times New Roman" w:cs="Times New Roman" w:eastAsia="Times New Roman" w:hAnsi="Times New Roman"/>
+          <w:b w:val="1"/>
+          <w:bCs w:val="1"/>
+          <w:sz w:val="20"/>
+          <w:szCs w:val="20"/>
+          <w:rtl w:val="0"/>
+        </w:rPr>
+        <w:t xml:space="preserve">MySQL</w:t>
+      </w:r>
+      <w:r>
+        <w:rPr>
+          <w:rFonts w:ascii="Times New Roman" w:cs="Times New Roman" w:eastAsia="Times New Roman" w:hAnsi="Times New Roman"/>
+          <w:sz w:val="20"/>
+          <w:szCs w:val="20"/>
+          <w:rtl w:val="0"/>
+        </w:rPr>
+        <w:t xml:space="preserve"> and </w:t>
+      </w:r>
+      <w:r>
+        <w:rPr>
+          <w:rFonts w:ascii="Times New Roman" w:cs="Times New Roman" w:eastAsia="Times New Roman" w:hAnsi="Times New Roman"/>
+          <w:b w:val="1"/>
+          <w:bCs w:val="1"/>
+          <w:sz w:val="20"/>
+          <w:szCs w:val="20"/>
+          <w:rtl w:val="0"/>
+        </w:rPr>
+        <w:t xml:space="preserve">Python</w:t>
+      </w:r>
+      <w:r>
+        <w:rPr>
+          <w:rFonts w:ascii="Times New Roman" w:cs="Times New Roman" w:eastAsia="Times New Roman" w:hAnsi="Times New Roman"/>
+          <w:sz w:val="20"/>
+          <w:szCs w:val="20"/>
+          <w:rtl w:val="0"/>
+        </w:rPr>
+        <w:t xml:space="preserve"> for the full tech stack.</w:t>
+      </w:r>
+    </w:p>
+    <w:p>
+      <w:pPr>
+        <w:widowControl w:val="0"/>
+        <w:numPr>
+          <w:ilvl w:val="0"/>
+          <w:numId w:val="1"/>
+        </w:numPr>
+        <w:spacing w:after="0" w:before="0" w:line="227.99999999999997" w:lineRule="auto"/>
+        <w:ind w:left="720" w:right="137.95166015625" w:hanging="360"/>
+        <w:rPr>
+          <w:rFonts w:ascii="Times New Roman" w:cs="Times New Roman" w:eastAsia="Times New Roman" w:hAnsi="Times New Roman"/>
+          <w:sz w:val="20"/>
+          <w:szCs w:val="20"/>
+        </w:rPr>
+      </w:pPr>
+      <w:r>
+        <w:rPr>
+          <w:rFonts w:ascii="Times New Roman" w:cs="Times New Roman" w:eastAsia="Times New Roman" w:hAnsi="Times New Roman"/>
+          <w:sz w:val="20"/>
+          <w:szCs w:val="20"/>
+          <w:rtl w:val="0"/>
+        </w:rPr>
+        <w:t xml:space="preserve">Engineered the application to store passwords locally via a hidden folder, encrypted using the SHA-256 algorithm, and accessed via a master password.</w:t>
+      </w:r>
+    </w:p>
+    <w:p>
+      <w:pPr>
+        <w:widowControl w:val="0"/>
+        <w:numPr>
+          <w:ilvl w:val="0"/>
+          <w:numId w:val="1"/>
         </w:numPr>
         <w:spacing w:after="0" w:before="0" w:line="227.99999999999997" w:lineRule="auto"/>
         <w:ind w:left="720" w:right="137.95166015625" w:hanging="360"/>
@@ -1684,7 +2138,7 @@
           <w:szCs w:val="20"/>
           <w:rtl w:val="0"/>
         </w:rPr>
-        <w:t xml:space="preserve">: Git/GitHub, Docker, Ollama, Azure, Oracle DB, Kubernetes, MATLAB, MySQL, TensorFlow, PyTorch, OpenCV, Tkinter, pygame, Flask, Tailwind CSS, Selenium, BeautifulSoup, Linux (Debian, Arch, Fedora/Red Hat)</w:t>
+        <w:t xml:space="preserve">: Git/GitHub, Docker, Ollama, Azure, Oracle DB, Kubernetes, MATLAB, MySQL, TensorFlow, PyTorch, OpenCV, Tkinter, pygame, Flask, Tailwind CSS, Selenium, BeautifulSoup, Linux (Debian, Arch, Fedora/Red Hat), Vite, PostgreSQL</w:t>
       </w:r>
       <w:r>
         <mc:AlternateContent>
@@ -1836,7 +2290,7 @@
           <w:szCs w:val="20"/>
           <w:rtl w:val="0"/>
         </w:rPr>
-        <w:t xml:space="preserve">: React Native, Node.js ,Yarn, Django, FastAPI, RestAPI, .NET, Angular</w:t>
+        <w:t xml:space="preserve">: React Native, Node.js,Yarn, Django, FastAPI, RestAPI, .NET, Angular</w:t>
       </w:r>
     </w:p>
     <w:p>
@@ -1868,7 +2322,7 @@
           <w:szCs w:val="20"/>
           <w:rtl w:val="0"/>
         </w:rPr>
-        <w:t xml:space="preserve">: Software Development Lifecycle, OOP, Machine Learning Algorithms, Data Modeling/Visualization, Software Architecture, Testing &amp; QA, Database Design, DevOps, Problem-Solving, Communication,, CI/CD, Server Operations, Linux System Administration, Command Line Operations</w:t>
+        <w:t xml:space="preserve">: Software Development Lifecycle, OOP, Machine Learning Algorithms, Data Modeling/Visualization, Software Architecture, Testing &amp; QA, Database Design, DevOps, Problem-Solving, Communication,, CI/CD, Server Operations, Linux System Administration, Command Line Operations, Agile development, Plan-driven development</w:t>
       </w:r>
       <w:r>
         <w:rPr>
@@ -2420,116 +2874,6 @@
       </w:rPr>
     </w:lvl>
   </w:abstractNum>
-  <w:abstractNum w:abstractNumId="5">
-    <w:lvl w:ilvl="0">
-      <w:start w:val="1"/>
-      <w:numFmt w:val="bullet"/>
-      <w:lvlText w:val="●"/>
-      <w:lvlJc w:val="left"/>
-      <w:pPr>
-        <w:ind w:left="720" w:hanging="360"/>
-      </w:pPr>
-      <w:rPr>
-        <w:u w:val="none"/>
-      </w:rPr>
-    </w:lvl>
-    <w:lvl w:ilvl="1">
-      <w:start w:val="1"/>
-      <w:numFmt w:val="bullet"/>
-      <w:lvlText w:val="○"/>
-      <w:lvlJc w:val="left"/>
-      <w:pPr>
-        <w:ind w:left="1440" w:hanging="360"/>
-      </w:pPr>
-      <w:rPr>
-        <w:u w:val="none"/>
-      </w:rPr>
-    </w:lvl>
-    <w:lvl w:ilvl="2">
-      <w:start w:val="1"/>
-      <w:numFmt w:val="bullet"/>
-      <w:lvlText w:val="■"/>
-      <w:lvlJc w:val="left"/>
-      <w:pPr>
-        <w:ind w:left="2160" w:hanging="360"/>
-      </w:pPr>
-      <w:rPr>
-        <w:u w:val="none"/>
-      </w:rPr>
-    </w:lvl>
-    <w:lvl w:ilvl="3">
-      <w:start w:val="1"/>
-      <w:numFmt w:val="bullet"/>
-      <w:lvlText w:val="●"/>
-      <w:lvlJc w:val="left"/>
-      <w:pPr>
-        <w:ind w:left="2880" w:hanging="360"/>
-      </w:pPr>
-      <w:rPr>
-        <w:u w:val="none"/>
-      </w:rPr>
-    </w:lvl>
-    <w:lvl w:ilvl="4">
-      <w:start w:val="1"/>
-      <w:numFmt w:val="bullet"/>
-      <w:lvlText w:val="○"/>
-      <w:lvlJc w:val="left"/>
-      <w:pPr>
-        <w:ind w:left="3600" w:hanging="360"/>
-      </w:pPr>
-      <w:rPr>
-        <w:u w:val="none"/>
-      </w:rPr>
-    </w:lvl>
-    <w:lvl w:ilvl="5">
-      <w:start w:val="1"/>
-      <w:numFmt w:val="bullet"/>
-      <w:lvlText w:val="■"/>
-      <w:lvlJc w:val="left"/>
-      <w:pPr>
-        <w:ind w:left="4320" w:hanging="360"/>
-      </w:pPr>
-      <w:rPr>
-        <w:u w:val="none"/>
-      </w:rPr>
-    </w:lvl>
-    <w:lvl w:ilvl="6">
-      <w:start w:val="1"/>
-      <w:numFmt w:val="bullet"/>
-      <w:lvlText w:val="●"/>
-      <w:lvlJc w:val="left"/>
-      <w:pPr>
-        <w:ind w:left="5040" w:hanging="360"/>
-      </w:pPr>
-      <w:rPr>
-        <w:u w:val="none"/>
-      </w:rPr>
-    </w:lvl>
-    <w:lvl w:ilvl="7">
-      <w:start w:val="1"/>
-      <w:numFmt w:val="bullet"/>
-      <w:lvlText w:val="○"/>
-      <w:lvlJc w:val="left"/>
-      <w:pPr>
-        <w:ind w:left="5760" w:hanging="360"/>
-      </w:pPr>
-      <w:rPr>
-        <w:u w:val="none"/>
-      </w:rPr>
-    </w:lvl>
-    <w:lvl w:ilvl="8">
-      <w:start w:val="1"/>
-      <w:numFmt w:val="bullet"/>
-      <w:lvlText w:val="■"/>
-      <w:lvlJc w:val="left"/>
-      <w:pPr>
-        <w:ind w:left="6480" w:hanging="360"/>
-      </w:pPr>
-      <w:rPr>
-        <w:u w:val="none"/>
-      </w:rPr>
-    </w:lvl>
-  </w:abstractNum>
   <w:num w:numId="1">
     <w:abstractNumId w:val="1"/>
   </w:num>
@@ -2541,9 +2885,6 @@
   </w:num>
   <w:num w:numId="4">
     <w:abstractNumId w:val="4"/>
-  </w:num>
-  <w:num w:numId="5">
-    <w:abstractNumId w:val="5"/>
   </w:num>
 </w:numbering>
 </file>

</xml_diff>